<commit_message>
Jobsheet 5: 1. Global CSS, 2. CSS Module (Local Scope)
</commit_message>
<xml_diff>
--- a/Laporan/03_Ahmad Dzul Fadhli Jobsheet 4,5&6.docx
+++ b/Laporan/03_Ahmad Dzul Fadhli Jobsheet 4,5&6.docx
@@ -82,29 +82,3811 @@
         <w:rPr>
           <w:b/>
           <w:bCs/>
-        </w:rPr>
-      </w:pPr>
-      <w:r>
-        <w:rPr>
-          <w:b/>
-          <w:bCs/>
-        </w:rPr>
-        <w:t>D. Langkah Kerja Praktikum</w:t>
-      </w:r>
-    </w:p>
-    <w:p>
-      <w:pPr>
-        <w:rPr>
-          <w:b/>
-          <w:bCs/>
-        </w:rPr>
-      </w:pPr>
-      <w:r>
-        <w:rPr>
-          <w:b/>
-          <w:bCs/>
-        </w:rPr>
-        <w:t xml:space="preserve">Langkah 1 – Menjalankan Project </w:t>
+          <w:lang w:val="fi-FI"/>
+        </w:rPr>
+      </w:pPr>
+      <w:r>
+        <w:rPr>
+          <w:b/>
+          <w:bCs/>
+          <w:lang w:val="fi-FI"/>
+        </w:rPr>
+        <w:t xml:space="preserve">D. </w:t>
+      </w:r>
+      <w:proofErr w:type="spellStart"/>
+      <w:r>
+        <w:rPr>
+          <w:b/>
+          <w:bCs/>
+          <w:lang w:val="fi-FI"/>
+        </w:rPr>
+        <w:t>Langkah</w:t>
+      </w:r>
+      <w:proofErr w:type="spellEnd"/>
+      <w:r>
+        <w:rPr>
+          <w:b/>
+          <w:bCs/>
+          <w:lang w:val="fi-FI"/>
+        </w:rPr>
+        <w:t xml:space="preserve"> </w:t>
+      </w:r>
+      <w:proofErr w:type="spellStart"/>
+      <w:r>
+        <w:rPr>
+          <w:b/>
+          <w:bCs/>
+          <w:lang w:val="fi-FI"/>
+        </w:rPr>
+        <w:t>Kerja</w:t>
+      </w:r>
+      <w:proofErr w:type="spellEnd"/>
+      <w:r>
+        <w:rPr>
+          <w:b/>
+          <w:bCs/>
+          <w:lang w:val="fi-FI"/>
+        </w:rPr>
+        <w:t xml:space="preserve"> </w:t>
+      </w:r>
+      <w:proofErr w:type="spellStart"/>
+      <w:r>
+        <w:rPr>
+          <w:b/>
+          <w:bCs/>
+          <w:lang w:val="fi-FI"/>
+        </w:rPr>
+        <w:t>Praktikum</w:t>
+      </w:r>
+      <w:proofErr w:type="spellEnd"/>
+    </w:p>
+    <w:p>
+      <w:pPr>
+        <w:rPr>
+          <w:b/>
+          <w:bCs/>
+          <w:lang w:val="fi-FI"/>
+        </w:rPr>
+      </w:pPr>
+      <w:proofErr w:type="spellStart"/>
+      <w:r>
+        <w:rPr>
+          <w:b/>
+          <w:bCs/>
+          <w:lang w:val="fi-FI"/>
+        </w:rPr>
+        <w:t>Langkah</w:t>
+      </w:r>
+      <w:proofErr w:type="spellEnd"/>
+      <w:r>
+        <w:rPr>
+          <w:b/>
+          <w:bCs/>
+          <w:lang w:val="fi-FI"/>
+        </w:rPr>
+        <w:t xml:space="preserve"> 1 – </w:t>
+      </w:r>
+      <w:proofErr w:type="spellStart"/>
+      <w:r>
+        <w:rPr>
+          <w:b/>
+          <w:bCs/>
+          <w:lang w:val="fi-FI"/>
+        </w:rPr>
+        <w:t>Menjalankan</w:t>
+      </w:r>
+      <w:proofErr w:type="spellEnd"/>
+      <w:r>
+        <w:rPr>
+          <w:b/>
+          <w:bCs/>
+          <w:lang w:val="fi-FI"/>
+        </w:rPr>
+        <w:t xml:space="preserve"> Project </w:t>
+      </w:r>
+    </w:p>
+    <w:p>
+      <w:pPr>
+        <w:rPr>
+          <w:b/>
+          <w:bCs/>
+          <w:lang w:val="fi-FI"/>
+        </w:rPr>
+      </w:pPr>
+      <w:r>
+        <w:rPr>
+          <w:b/>
+          <w:bCs/>
+          <w:lang w:val="fi-FI"/>
+        </w:rPr>
+        <w:drawing>
+          <wp:inline distT="0" distB="0" distL="0" distR="0" wp14:anchorId="4B509AAE" wp14:editId="67E15288">
+            <wp:extent cx="4320000" cy="1962000"/>
+            <wp:effectExtent l="19050" t="19050" r="23495" b="19685"/>
+            <wp:docPr id="976044121" name="Picture 1"/>
+            <wp:cNvGraphicFramePr>
+              <a:graphicFrameLocks xmlns:a="http://schemas.openxmlformats.org/drawingml/2006/main" noChangeAspect="1"/>
+            </wp:cNvGraphicFramePr>
+            <a:graphic xmlns:a="http://schemas.openxmlformats.org/drawingml/2006/main">
+              <a:graphicData uri="http://schemas.openxmlformats.org/drawingml/2006/picture">
+                <pic:pic xmlns:pic="http://schemas.openxmlformats.org/drawingml/2006/picture">
+                  <pic:nvPicPr>
+                    <pic:cNvPr id="976044121" name=""/>
+                    <pic:cNvPicPr/>
+                  </pic:nvPicPr>
+                  <pic:blipFill>
+                    <a:blip r:embed="rId7"/>
+                    <a:stretch>
+                      <a:fillRect/>
+                    </a:stretch>
+                  </pic:blipFill>
+                  <pic:spPr>
+                    <a:xfrm>
+                      <a:off x="0" y="0"/>
+                      <a:ext cx="4320000" cy="1962000"/>
+                    </a:xfrm>
+                    <a:prstGeom prst="rect">
+                      <a:avLst/>
+                    </a:prstGeom>
+                    <a:ln w="12700">
+                      <a:solidFill>
+                        <a:schemeClr val="accent1"/>
+                      </a:solidFill>
+                    </a:ln>
+                  </pic:spPr>
+                </pic:pic>
+              </a:graphicData>
+            </a:graphic>
+          </wp:inline>
+        </w:drawing>
+      </w:r>
+    </w:p>
+    <w:p>
+      <w:pPr>
+        <w:rPr>
+          <w:b/>
+          <w:bCs/>
+        </w:rPr>
+      </w:pPr>
+      <w:r>
+        <w:rPr>
+          <w:b/>
+          <w:bCs/>
+        </w:rPr>
+        <w:t xml:space="preserve">Langkah 2 – </w:t>
+      </w:r>
+      <w:proofErr w:type="spellStart"/>
+      <w:r>
+        <w:rPr>
+          <w:b/>
+          <w:bCs/>
+        </w:rPr>
+        <w:t>Membuat</w:t>
+      </w:r>
+      <w:proofErr w:type="spellEnd"/>
+      <w:r>
+        <w:rPr>
+          <w:b/>
+          <w:bCs/>
+        </w:rPr>
+        <w:t xml:space="preserve"> Catch-All Route</w:t>
+      </w:r>
+    </w:p>
+    <w:p>
+      <w:pPr>
+        <w:rPr>
+          <w:b/>
+          <w:bCs/>
+        </w:rPr>
+      </w:pPr>
+      <w:r>
+        <w:rPr>
+          <w:b/>
+          <w:bCs/>
+        </w:rPr>
+        <w:drawing>
+          <wp:inline distT="0" distB="0" distL="0" distR="0" wp14:anchorId="2CA83AF9" wp14:editId="46DE262A">
+            <wp:extent cx="4320000" cy="1318615"/>
+            <wp:effectExtent l="19050" t="19050" r="23495" b="15240"/>
+            <wp:docPr id="1328701481" name="Picture 1"/>
+            <wp:cNvGraphicFramePr>
+              <a:graphicFrameLocks xmlns:a="http://schemas.openxmlformats.org/drawingml/2006/main" noChangeAspect="1"/>
+            </wp:cNvGraphicFramePr>
+            <a:graphic xmlns:a="http://schemas.openxmlformats.org/drawingml/2006/main">
+              <a:graphicData uri="http://schemas.openxmlformats.org/drawingml/2006/picture">
+                <pic:pic xmlns:pic="http://schemas.openxmlformats.org/drawingml/2006/picture">
+                  <pic:nvPicPr>
+                    <pic:cNvPr id="1328701481" name=""/>
+                    <pic:cNvPicPr/>
+                  </pic:nvPicPr>
+                  <pic:blipFill>
+                    <a:blip r:embed="rId8"/>
+                    <a:stretch>
+                      <a:fillRect/>
+                    </a:stretch>
+                  </pic:blipFill>
+                  <pic:spPr>
+                    <a:xfrm>
+                      <a:off x="0" y="0"/>
+                      <a:ext cx="4320000" cy="1318615"/>
+                    </a:xfrm>
+                    <a:prstGeom prst="rect">
+                      <a:avLst/>
+                    </a:prstGeom>
+                    <a:ln>
+                      <a:solidFill>
+                        <a:schemeClr val="accent1"/>
+                      </a:solidFill>
+                    </a:ln>
+                  </pic:spPr>
+                </pic:pic>
+              </a:graphicData>
+            </a:graphic>
+          </wp:inline>
+        </w:drawing>
+      </w:r>
+    </w:p>
+    <w:p>
+      <w:r>
+        <w:t>Console ninja</w:t>
+      </w:r>
+    </w:p>
+    <w:p>
+      <w:r>
+        <w:drawing>
+          <wp:inline distT="0" distB="0" distL="0" distR="0" wp14:anchorId="2873A1FD" wp14:editId="55708B7E">
+            <wp:extent cx="4320000" cy="1472770"/>
+            <wp:effectExtent l="19050" t="19050" r="23495" b="13335"/>
+            <wp:docPr id="1740929991" name="Picture 1"/>
+            <wp:cNvGraphicFramePr>
+              <a:graphicFrameLocks xmlns:a="http://schemas.openxmlformats.org/drawingml/2006/main" noChangeAspect="1"/>
+            </wp:cNvGraphicFramePr>
+            <a:graphic xmlns:a="http://schemas.openxmlformats.org/drawingml/2006/main">
+              <a:graphicData uri="http://schemas.openxmlformats.org/drawingml/2006/picture">
+                <pic:pic xmlns:pic="http://schemas.openxmlformats.org/drawingml/2006/picture">
+                  <pic:nvPicPr>
+                    <pic:cNvPr id="1740929991" name=""/>
+                    <pic:cNvPicPr/>
+                  </pic:nvPicPr>
+                  <pic:blipFill>
+                    <a:blip r:embed="rId9"/>
+                    <a:stretch>
+                      <a:fillRect/>
+                    </a:stretch>
+                  </pic:blipFill>
+                  <pic:spPr>
+                    <a:xfrm>
+                      <a:off x="0" y="0"/>
+                      <a:ext cx="4320000" cy="1472770"/>
+                    </a:xfrm>
+                    <a:prstGeom prst="rect">
+                      <a:avLst/>
+                    </a:prstGeom>
+                    <a:ln>
+                      <a:solidFill>
+                        <a:schemeClr val="accent1"/>
+                      </a:solidFill>
+                    </a:ln>
+                  </pic:spPr>
+                </pic:pic>
+              </a:graphicData>
+            </a:graphic>
+          </wp:inline>
+        </w:drawing>
+      </w:r>
+    </w:p>
+    <w:p>
+      <w:r>
+        <w:t xml:space="preserve">Menampilkan </w:t>
+      </w:r>
+      <w:proofErr w:type="spellStart"/>
+      <w:r>
+        <w:t>nilai</w:t>
+      </w:r>
+      <w:proofErr w:type="spellEnd"/>
+      <w:r>
+        <w:t xml:space="preserve"> query</w:t>
+      </w:r>
+    </w:p>
+    <w:p>
+      <w:r>
+        <w:lastRenderedPageBreak/>
+        <w:drawing>
+          <wp:inline distT="0" distB="0" distL="0" distR="0" wp14:anchorId="382012C2" wp14:editId="66549ED3">
+            <wp:extent cx="4320000" cy="1915385"/>
+            <wp:effectExtent l="19050" t="19050" r="23495" b="27940"/>
+            <wp:docPr id="432845555" name="Picture 1"/>
+            <wp:cNvGraphicFramePr>
+              <a:graphicFrameLocks xmlns:a="http://schemas.openxmlformats.org/drawingml/2006/main" noChangeAspect="1"/>
+            </wp:cNvGraphicFramePr>
+            <a:graphic xmlns:a="http://schemas.openxmlformats.org/drawingml/2006/main">
+              <a:graphicData uri="http://schemas.openxmlformats.org/drawingml/2006/picture">
+                <pic:pic xmlns:pic="http://schemas.openxmlformats.org/drawingml/2006/picture">
+                  <pic:nvPicPr>
+                    <pic:cNvPr id="432845555" name=""/>
+                    <pic:cNvPicPr/>
+                  </pic:nvPicPr>
+                  <pic:blipFill>
+                    <a:blip r:embed="rId10"/>
+                    <a:stretch>
+                      <a:fillRect/>
+                    </a:stretch>
+                  </pic:blipFill>
+                  <pic:spPr>
+                    <a:xfrm>
+                      <a:off x="0" y="0"/>
+                      <a:ext cx="4320000" cy="1915385"/>
+                    </a:xfrm>
+                    <a:prstGeom prst="rect">
+                      <a:avLst/>
+                    </a:prstGeom>
+                    <a:ln>
+                      <a:solidFill>
+                        <a:schemeClr val="accent1"/>
+                      </a:solidFill>
+                    </a:ln>
+                  </pic:spPr>
+                </pic:pic>
+              </a:graphicData>
+            </a:graphic>
+          </wp:inline>
+        </w:drawing>
+      </w:r>
+    </w:p>
+    <w:p>
+      <w:pPr>
+        <w:rPr>
+          <w:b/>
+          <w:bCs/>
+        </w:rPr>
+      </w:pPr>
+      <w:r>
+        <w:rPr>
+          <w:b/>
+          <w:bCs/>
+        </w:rPr>
+        <w:t xml:space="preserve">Langkah 3 – </w:t>
+      </w:r>
+      <w:proofErr w:type="spellStart"/>
+      <w:r>
+        <w:rPr>
+          <w:b/>
+          <w:bCs/>
+        </w:rPr>
+        <w:t>Pengujian</w:t>
+      </w:r>
+      <w:proofErr w:type="spellEnd"/>
+      <w:r>
+        <w:rPr>
+          <w:b/>
+          <w:bCs/>
+        </w:rPr>
+        <w:t xml:space="preserve"> Catch-All Route</w:t>
+      </w:r>
+    </w:p>
+    <w:p>
+      <w:pPr>
+        <w:rPr>
+          <w:b/>
+          <w:bCs/>
+        </w:rPr>
+      </w:pPr>
+      <w:r>
+        <w:rPr>
+          <w:b/>
+          <w:bCs/>
+        </w:rPr>
+        <w:drawing>
+          <wp:inline distT="0" distB="0" distL="0" distR="0" wp14:anchorId="3BA27947" wp14:editId="01D8B93E">
+            <wp:extent cx="4320000" cy="1849847"/>
+            <wp:effectExtent l="19050" t="19050" r="23495" b="17145"/>
+            <wp:docPr id="119653274" name="Picture 1"/>
+            <wp:cNvGraphicFramePr>
+              <a:graphicFrameLocks xmlns:a="http://schemas.openxmlformats.org/drawingml/2006/main" noChangeAspect="1"/>
+            </wp:cNvGraphicFramePr>
+            <a:graphic xmlns:a="http://schemas.openxmlformats.org/drawingml/2006/main">
+              <a:graphicData uri="http://schemas.openxmlformats.org/drawingml/2006/picture">
+                <pic:pic xmlns:pic="http://schemas.openxmlformats.org/drawingml/2006/picture">
+                  <pic:nvPicPr>
+                    <pic:cNvPr id="119653274" name=""/>
+                    <pic:cNvPicPr/>
+                  </pic:nvPicPr>
+                  <pic:blipFill>
+                    <a:blip r:embed="rId11"/>
+                    <a:stretch>
+                      <a:fillRect/>
+                    </a:stretch>
+                  </pic:blipFill>
+                  <pic:spPr>
+                    <a:xfrm>
+                      <a:off x="0" y="0"/>
+                      <a:ext cx="4320000" cy="1849847"/>
+                    </a:xfrm>
+                    <a:prstGeom prst="rect">
+                      <a:avLst/>
+                    </a:prstGeom>
+                    <a:ln>
+                      <a:solidFill>
+                        <a:schemeClr val="accent1"/>
+                      </a:solidFill>
+                    </a:ln>
+                  </pic:spPr>
+                </pic:pic>
+              </a:graphicData>
+            </a:graphic>
+          </wp:inline>
+        </w:drawing>
+      </w:r>
+    </w:p>
+    <w:p>
+      <w:pPr>
+        <w:rPr>
+          <w:b/>
+          <w:bCs/>
+        </w:rPr>
+      </w:pPr>
+      <w:r>
+        <w:rPr>
+          <w:b/>
+          <w:bCs/>
+        </w:rPr>
+        <w:drawing>
+          <wp:inline distT="0" distB="0" distL="0" distR="0" wp14:anchorId="4919B035" wp14:editId="527E8505">
+            <wp:extent cx="4320000" cy="1709078"/>
+            <wp:effectExtent l="19050" t="19050" r="23495" b="24765"/>
+            <wp:docPr id="173006158" name="Picture 1"/>
+            <wp:cNvGraphicFramePr>
+              <a:graphicFrameLocks xmlns:a="http://schemas.openxmlformats.org/drawingml/2006/main" noChangeAspect="1"/>
+            </wp:cNvGraphicFramePr>
+            <a:graphic xmlns:a="http://schemas.openxmlformats.org/drawingml/2006/main">
+              <a:graphicData uri="http://schemas.openxmlformats.org/drawingml/2006/picture">
+                <pic:pic xmlns:pic="http://schemas.openxmlformats.org/drawingml/2006/picture">
+                  <pic:nvPicPr>
+                    <pic:cNvPr id="173006158" name=""/>
+                    <pic:cNvPicPr/>
+                  </pic:nvPicPr>
+                  <pic:blipFill>
+                    <a:blip r:embed="rId12"/>
+                    <a:stretch>
+                      <a:fillRect/>
+                    </a:stretch>
+                  </pic:blipFill>
+                  <pic:spPr>
+                    <a:xfrm>
+                      <a:off x="0" y="0"/>
+                      <a:ext cx="4320000" cy="1709078"/>
+                    </a:xfrm>
+                    <a:prstGeom prst="rect">
+                      <a:avLst/>
+                    </a:prstGeom>
+                    <a:ln>
+                      <a:solidFill>
+                        <a:schemeClr val="accent1"/>
+                      </a:solidFill>
+                    </a:ln>
+                  </pic:spPr>
+                </pic:pic>
+              </a:graphicData>
+            </a:graphic>
+          </wp:inline>
+        </w:drawing>
+      </w:r>
+    </w:p>
+    <w:p>
+      <w:pPr>
+        <w:rPr>
+          <w:b/>
+          <w:bCs/>
+        </w:rPr>
+      </w:pPr>
+      <w:r>
+        <w:rPr>
+          <w:b/>
+          <w:bCs/>
+        </w:rPr>
+        <w:drawing>
+          <wp:inline distT="0" distB="0" distL="0" distR="0" wp14:anchorId="770F3478" wp14:editId="760D871C">
+            <wp:extent cx="4320000" cy="1461693"/>
+            <wp:effectExtent l="19050" t="19050" r="23495" b="24765"/>
+            <wp:docPr id="1972666682" name="Picture 1"/>
+            <wp:cNvGraphicFramePr>
+              <a:graphicFrameLocks xmlns:a="http://schemas.openxmlformats.org/drawingml/2006/main" noChangeAspect="1"/>
+            </wp:cNvGraphicFramePr>
+            <a:graphic xmlns:a="http://schemas.openxmlformats.org/drawingml/2006/main">
+              <a:graphicData uri="http://schemas.openxmlformats.org/drawingml/2006/picture">
+                <pic:pic xmlns:pic="http://schemas.openxmlformats.org/drawingml/2006/picture">
+                  <pic:nvPicPr>
+                    <pic:cNvPr id="1972666682" name=""/>
+                    <pic:cNvPicPr/>
+                  </pic:nvPicPr>
+                  <pic:blipFill>
+                    <a:blip r:embed="rId13"/>
+                    <a:stretch>
+                      <a:fillRect/>
+                    </a:stretch>
+                  </pic:blipFill>
+                  <pic:spPr>
+                    <a:xfrm>
+                      <a:off x="0" y="0"/>
+                      <a:ext cx="4320000" cy="1461693"/>
+                    </a:xfrm>
+                    <a:prstGeom prst="rect">
+                      <a:avLst/>
+                    </a:prstGeom>
+                    <a:ln>
+                      <a:solidFill>
+                        <a:schemeClr val="accent1"/>
+                      </a:solidFill>
+                    </a:ln>
+                  </pic:spPr>
+                </pic:pic>
+              </a:graphicData>
+            </a:graphic>
+          </wp:inline>
+        </w:drawing>
+      </w:r>
+    </w:p>
+    <w:p>
+      <w:proofErr w:type="spellStart"/>
+      <w:r>
+        <w:t>Modifikasi</w:t>
+      </w:r>
+      <w:proofErr w:type="spellEnd"/>
+      <w:r>
+        <w:t xml:space="preserve"> </w:t>
+      </w:r>
+      <w:r>
+        <w:t>[…slug</w:t>
+      </w:r>
+      <w:proofErr w:type="gramStart"/>
+      <w:r>
+        <w:t>].</w:t>
+      </w:r>
+      <w:proofErr w:type="spellStart"/>
+      <w:r>
+        <w:t>tsx</w:t>
+      </w:r>
+      <w:proofErr w:type="spellEnd"/>
+      <w:proofErr w:type="gramEnd"/>
+    </w:p>
+    <w:p>
+      <w:pPr>
+        <w:rPr>
+          <w:b/>
+          <w:bCs/>
+        </w:rPr>
+      </w:pPr>
+      <w:r>
+        <w:rPr>
+          <w:b/>
+          <w:bCs/>
+        </w:rPr>
+        <w:lastRenderedPageBreak/>
+        <w:drawing>
+          <wp:inline distT="0" distB="0" distL="0" distR="0" wp14:anchorId="7DAE6F1B" wp14:editId="6EFFD369">
+            <wp:extent cx="2880000" cy="1129538"/>
+            <wp:effectExtent l="19050" t="19050" r="15875" b="13970"/>
+            <wp:docPr id="1214085182" name="Picture 1"/>
+            <wp:cNvGraphicFramePr>
+              <a:graphicFrameLocks xmlns:a="http://schemas.openxmlformats.org/drawingml/2006/main" noChangeAspect="1"/>
+            </wp:cNvGraphicFramePr>
+            <a:graphic xmlns:a="http://schemas.openxmlformats.org/drawingml/2006/main">
+              <a:graphicData uri="http://schemas.openxmlformats.org/drawingml/2006/picture">
+                <pic:pic xmlns:pic="http://schemas.openxmlformats.org/drawingml/2006/picture">
+                  <pic:nvPicPr>
+                    <pic:cNvPr id="1214085182" name=""/>
+                    <pic:cNvPicPr/>
+                  </pic:nvPicPr>
+                  <pic:blipFill>
+                    <a:blip r:embed="rId14"/>
+                    <a:stretch>
+                      <a:fillRect/>
+                    </a:stretch>
+                  </pic:blipFill>
+                  <pic:spPr>
+                    <a:xfrm>
+                      <a:off x="0" y="0"/>
+                      <a:ext cx="2880000" cy="1129538"/>
+                    </a:xfrm>
+                    <a:prstGeom prst="rect">
+                      <a:avLst/>
+                    </a:prstGeom>
+                    <a:ln>
+                      <a:solidFill>
+                        <a:schemeClr val="accent1"/>
+                      </a:solidFill>
+                    </a:ln>
+                  </pic:spPr>
+                </pic:pic>
+              </a:graphicData>
+            </a:graphic>
+          </wp:inline>
+        </w:drawing>
+      </w:r>
+    </w:p>
+    <w:p>
+      <w:r>
+        <w:t>Hasil</w:t>
+      </w:r>
+    </w:p>
+    <w:p>
+      <w:pPr>
+        <w:rPr>
+          <w:b/>
+          <w:bCs/>
+        </w:rPr>
+      </w:pPr>
+      <w:r>
+        <w:rPr>
+          <w:b/>
+          <w:bCs/>
+        </w:rPr>
+        <w:drawing>
+          <wp:inline distT="0" distB="0" distL="0" distR="0" wp14:anchorId="5EBFF126" wp14:editId="4D141377">
+            <wp:extent cx="4320000" cy="1346307"/>
+            <wp:effectExtent l="19050" t="19050" r="23495" b="25400"/>
+            <wp:docPr id="634321878" name="Picture 1"/>
+            <wp:cNvGraphicFramePr>
+              <a:graphicFrameLocks xmlns:a="http://schemas.openxmlformats.org/drawingml/2006/main" noChangeAspect="1"/>
+            </wp:cNvGraphicFramePr>
+            <a:graphic xmlns:a="http://schemas.openxmlformats.org/drawingml/2006/main">
+              <a:graphicData uri="http://schemas.openxmlformats.org/drawingml/2006/picture">
+                <pic:pic xmlns:pic="http://schemas.openxmlformats.org/drawingml/2006/picture">
+                  <pic:nvPicPr>
+                    <pic:cNvPr id="634321878" name=""/>
+                    <pic:cNvPicPr/>
+                  </pic:nvPicPr>
+                  <pic:blipFill>
+                    <a:blip r:embed="rId15"/>
+                    <a:stretch>
+                      <a:fillRect/>
+                    </a:stretch>
+                  </pic:blipFill>
+                  <pic:spPr>
+                    <a:xfrm>
+                      <a:off x="0" y="0"/>
+                      <a:ext cx="4320000" cy="1346307"/>
+                    </a:xfrm>
+                    <a:prstGeom prst="rect">
+                      <a:avLst/>
+                    </a:prstGeom>
+                    <a:ln>
+                      <a:solidFill>
+                        <a:schemeClr val="accent1"/>
+                      </a:solidFill>
+                    </a:ln>
+                  </pic:spPr>
+                </pic:pic>
+              </a:graphicData>
+            </a:graphic>
+          </wp:inline>
+        </w:drawing>
+      </w:r>
+    </w:p>
+    <w:p>
+      <w:pPr>
+        <w:rPr>
+          <w:b/>
+          <w:bCs/>
+        </w:rPr>
+      </w:pPr>
+      <w:r>
+        <w:rPr>
+          <w:b/>
+          <w:bCs/>
+        </w:rPr>
+        <w:drawing>
+          <wp:inline distT="0" distB="0" distL="0" distR="0" wp14:anchorId="2828832A" wp14:editId="645BB3B8">
+            <wp:extent cx="4320000" cy="1349078"/>
+            <wp:effectExtent l="19050" t="19050" r="23495" b="22860"/>
+            <wp:docPr id="975689247" name="Picture 1"/>
+            <wp:cNvGraphicFramePr>
+              <a:graphicFrameLocks xmlns:a="http://schemas.openxmlformats.org/drawingml/2006/main" noChangeAspect="1"/>
+            </wp:cNvGraphicFramePr>
+            <a:graphic xmlns:a="http://schemas.openxmlformats.org/drawingml/2006/main">
+              <a:graphicData uri="http://schemas.openxmlformats.org/drawingml/2006/picture">
+                <pic:pic xmlns:pic="http://schemas.openxmlformats.org/drawingml/2006/picture">
+                  <pic:nvPicPr>
+                    <pic:cNvPr id="975689247" name=""/>
+                    <pic:cNvPicPr/>
+                  </pic:nvPicPr>
+                  <pic:blipFill>
+                    <a:blip r:embed="rId16"/>
+                    <a:stretch>
+                      <a:fillRect/>
+                    </a:stretch>
+                  </pic:blipFill>
+                  <pic:spPr>
+                    <a:xfrm>
+                      <a:off x="0" y="0"/>
+                      <a:ext cx="4320000" cy="1349078"/>
+                    </a:xfrm>
+                    <a:prstGeom prst="rect">
+                      <a:avLst/>
+                    </a:prstGeom>
+                    <a:ln>
+                      <a:solidFill>
+                        <a:schemeClr val="accent1"/>
+                      </a:solidFill>
+                    </a:ln>
+                  </pic:spPr>
+                </pic:pic>
+              </a:graphicData>
+            </a:graphic>
+          </wp:inline>
+        </w:drawing>
+      </w:r>
+    </w:p>
+    <w:p>
+      <w:proofErr w:type="spellStart"/>
+      <w:r>
+        <w:t>Kembalikan</w:t>
+      </w:r>
+      <w:proofErr w:type="spellEnd"/>
+      <w:r>
+        <w:t xml:space="preserve"> </w:t>
+      </w:r>
+      <w:proofErr w:type="spellStart"/>
+      <w:r>
+        <w:t>kode</w:t>
+      </w:r>
+      <w:proofErr w:type="spellEnd"/>
+      <w:r>
+        <w:t xml:space="preserve"> </w:t>
+      </w:r>
+    </w:p>
+    <w:p>
+      <w:r>
+        <w:drawing>
+          <wp:inline distT="0" distB="0" distL="0" distR="0" wp14:anchorId="2E1D51DA" wp14:editId="49E03021">
+            <wp:extent cx="4320000" cy="1915385"/>
+            <wp:effectExtent l="19050" t="19050" r="23495" b="27940"/>
+            <wp:docPr id="670398117" name="Picture 1"/>
+            <wp:cNvGraphicFramePr>
+              <a:graphicFrameLocks xmlns:a="http://schemas.openxmlformats.org/drawingml/2006/main" noChangeAspect="1"/>
+            </wp:cNvGraphicFramePr>
+            <a:graphic xmlns:a="http://schemas.openxmlformats.org/drawingml/2006/main">
+              <a:graphicData uri="http://schemas.openxmlformats.org/drawingml/2006/picture">
+                <pic:pic xmlns:pic="http://schemas.openxmlformats.org/drawingml/2006/picture">
+                  <pic:nvPicPr>
+                    <pic:cNvPr id="432845555" name=""/>
+                    <pic:cNvPicPr/>
+                  </pic:nvPicPr>
+                  <pic:blipFill>
+                    <a:blip r:embed="rId10"/>
+                    <a:stretch>
+                      <a:fillRect/>
+                    </a:stretch>
+                  </pic:blipFill>
+                  <pic:spPr>
+                    <a:xfrm>
+                      <a:off x="0" y="0"/>
+                      <a:ext cx="4320000" cy="1915385"/>
+                    </a:xfrm>
+                    <a:prstGeom prst="rect">
+                      <a:avLst/>
+                    </a:prstGeom>
+                    <a:ln>
+                      <a:solidFill>
+                        <a:schemeClr val="accent1"/>
+                      </a:solidFill>
+                    </a:ln>
+                  </pic:spPr>
+                </pic:pic>
+              </a:graphicData>
+            </a:graphic>
+          </wp:inline>
+        </w:drawing>
+      </w:r>
+    </w:p>
+    <w:p>
+      <w:pPr>
+        <w:rPr>
+          <w:b/>
+          <w:bCs/>
+        </w:rPr>
+      </w:pPr>
+      <w:r>
+        <w:rPr>
+          <w:b/>
+          <w:bCs/>
+        </w:rPr>
+        <w:t>Langkah 4 – Optional Catch-All Route</w:t>
+      </w:r>
+    </w:p>
+    <w:p>
+      <w:pPr>
+        <w:rPr>
+          <w:b/>
+          <w:bCs/>
+        </w:rPr>
+      </w:pPr>
+      <w:r>
+        <w:rPr>
+          <w:b/>
+          <w:bCs/>
+        </w:rPr>
+        <w:lastRenderedPageBreak/>
+        <w:drawing>
+          <wp:inline distT="0" distB="0" distL="0" distR="0" wp14:anchorId="05945AC9" wp14:editId="72606882">
+            <wp:extent cx="4320000" cy="2750307"/>
+            <wp:effectExtent l="19050" t="19050" r="23495" b="12065"/>
+            <wp:docPr id="1341619539" name="Picture 1"/>
+            <wp:cNvGraphicFramePr>
+              <a:graphicFrameLocks xmlns:a="http://schemas.openxmlformats.org/drawingml/2006/main" noChangeAspect="1"/>
+            </wp:cNvGraphicFramePr>
+            <a:graphic xmlns:a="http://schemas.openxmlformats.org/drawingml/2006/main">
+              <a:graphicData uri="http://schemas.openxmlformats.org/drawingml/2006/picture">
+                <pic:pic xmlns:pic="http://schemas.openxmlformats.org/drawingml/2006/picture">
+                  <pic:nvPicPr>
+                    <pic:cNvPr id="1341619539" name=""/>
+                    <pic:cNvPicPr/>
+                  </pic:nvPicPr>
+                  <pic:blipFill>
+                    <a:blip r:embed="rId17"/>
+                    <a:stretch>
+                      <a:fillRect/>
+                    </a:stretch>
+                  </pic:blipFill>
+                  <pic:spPr>
+                    <a:xfrm>
+                      <a:off x="0" y="0"/>
+                      <a:ext cx="4320000" cy="2750307"/>
+                    </a:xfrm>
+                    <a:prstGeom prst="rect">
+                      <a:avLst/>
+                    </a:prstGeom>
+                    <a:ln>
+                      <a:solidFill>
+                        <a:schemeClr val="accent1"/>
+                      </a:solidFill>
+                    </a:ln>
+                  </pic:spPr>
+                </pic:pic>
+              </a:graphicData>
+            </a:graphic>
+          </wp:inline>
+        </w:drawing>
+      </w:r>
+    </w:p>
+    <w:p>
+      <w:r>
+        <w:t xml:space="preserve">Ubah nama file </w:t>
+      </w:r>
+      <w:proofErr w:type="spellStart"/>
+      <w:r>
+        <w:t>menjadi</w:t>
+      </w:r>
+      <w:proofErr w:type="spellEnd"/>
+      <w:r>
+        <w:t xml:space="preserve"> </w:t>
+      </w:r>
+      <w:r>
+        <w:t>[...slug</w:t>
+      </w:r>
+      <w:proofErr w:type="gramStart"/>
+      <w:r>
+        <w:t>].</w:t>
+      </w:r>
+      <w:proofErr w:type="spellStart"/>
+      <w:r>
+        <w:t>tsx</w:t>
+      </w:r>
+      <w:proofErr w:type="spellEnd"/>
+      <w:proofErr w:type="gramEnd"/>
+      <w:r>
+        <w:t xml:space="preserve"> → [[...slug]</w:t>
+      </w:r>
+      <w:proofErr w:type="gramStart"/>
+      <w:r>
+        <w:t>].</w:t>
+      </w:r>
+      <w:proofErr w:type="spellStart"/>
+      <w:r>
+        <w:t>tsx</w:t>
+      </w:r>
+      <w:proofErr w:type="spellEnd"/>
+      <w:proofErr w:type="gramEnd"/>
+      <w:r>
+        <w:t xml:space="preserve"> dan </w:t>
+      </w:r>
+      <w:proofErr w:type="spellStart"/>
+      <w:r>
+        <w:t>hasilnya</w:t>
+      </w:r>
+      <w:proofErr w:type="spellEnd"/>
+    </w:p>
+    <w:p>
+      <w:r>
+        <w:drawing>
+          <wp:inline distT="0" distB="0" distL="0" distR="0" wp14:anchorId="740EDE52" wp14:editId="49F5150E">
+            <wp:extent cx="4320000" cy="2160000"/>
+            <wp:effectExtent l="19050" t="19050" r="23495" b="12065"/>
+            <wp:docPr id="748722493" name="Picture 1"/>
+            <wp:cNvGraphicFramePr>
+              <a:graphicFrameLocks xmlns:a="http://schemas.openxmlformats.org/drawingml/2006/main" noChangeAspect="1"/>
+            </wp:cNvGraphicFramePr>
+            <a:graphic xmlns:a="http://schemas.openxmlformats.org/drawingml/2006/main">
+              <a:graphicData uri="http://schemas.openxmlformats.org/drawingml/2006/picture">
+                <pic:pic xmlns:pic="http://schemas.openxmlformats.org/drawingml/2006/picture">
+                  <pic:nvPicPr>
+                    <pic:cNvPr id="748722493" name=""/>
+                    <pic:cNvPicPr/>
+                  </pic:nvPicPr>
+                  <pic:blipFill>
+                    <a:blip r:embed="rId18"/>
+                    <a:stretch>
+                      <a:fillRect/>
+                    </a:stretch>
+                  </pic:blipFill>
+                  <pic:spPr>
+                    <a:xfrm>
+                      <a:off x="0" y="0"/>
+                      <a:ext cx="4320000" cy="2160000"/>
+                    </a:xfrm>
+                    <a:prstGeom prst="rect">
+                      <a:avLst/>
+                    </a:prstGeom>
+                    <a:ln>
+                      <a:solidFill>
+                        <a:schemeClr val="accent1"/>
+                      </a:solidFill>
+                    </a:ln>
+                  </pic:spPr>
+                </pic:pic>
+              </a:graphicData>
+            </a:graphic>
+          </wp:inline>
+        </w:drawing>
+      </w:r>
+    </w:p>
+    <w:p>
+      <w:pPr>
+        <w:rPr>
+          <w:b/>
+          <w:bCs/>
+        </w:rPr>
+      </w:pPr>
+      <w:r>
+        <w:rPr>
+          <w:b/>
+          <w:bCs/>
+        </w:rPr>
+        <w:t xml:space="preserve">Langkah 5 – </w:t>
+      </w:r>
+      <w:proofErr w:type="spellStart"/>
+      <w:r>
+        <w:rPr>
+          <w:b/>
+          <w:bCs/>
+        </w:rPr>
+        <w:t>Validasi</w:t>
+      </w:r>
+      <w:proofErr w:type="spellEnd"/>
+      <w:r>
+        <w:rPr>
+          <w:b/>
+          <w:bCs/>
+        </w:rPr>
+        <w:t xml:space="preserve"> Parameter</w:t>
+      </w:r>
+    </w:p>
+    <w:p>
+      <w:proofErr w:type="spellStart"/>
+      <w:r>
+        <w:t>Tambahkan</w:t>
+      </w:r>
+      <w:proofErr w:type="spellEnd"/>
+      <w:r>
+        <w:t xml:space="preserve"> </w:t>
+      </w:r>
+      <w:proofErr w:type="spellStart"/>
+      <w:r>
+        <w:t>validasi</w:t>
+      </w:r>
+      <w:proofErr w:type="spellEnd"/>
+      <w:r>
+        <w:t xml:space="preserve"> agar </w:t>
+      </w:r>
+      <w:proofErr w:type="spellStart"/>
+      <w:r>
+        <w:t>tidak</w:t>
+      </w:r>
+      <w:proofErr w:type="spellEnd"/>
+      <w:r>
+        <w:t xml:space="preserve"> error </w:t>
+      </w:r>
+      <w:proofErr w:type="spellStart"/>
+      <w:r>
+        <w:t>saat</w:t>
+      </w:r>
+      <w:proofErr w:type="spellEnd"/>
+      <w:r>
+        <w:t xml:space="preserve"> slug </w:t>
+      </w:r>
+      <w:proofErr w:type="spellStart"/>
+      <w:r>
+        <w:t>kosong</w:t>
+      </w:r>
+      <w:proofErr w:type="spellEnd"/>
+      <w:r>
+        <w:t>:</w:t>
+      </w:r>
+    </w:p>
+    <w:p>
+      <w:pPr>
+        <w:rPr>
+          <w:b/>
+          <w:bCs/>
+        </w:rPr>
+      </w:pPr>
+      <w:r>
+        <w:rPr>
+          <w:b/>
+          <w:bCs/>
+        </w:rPr>
+        <w:drawing>
+          <wp:inline distT="0" distB="0" distL="0" distR="0" wp14:anchorId="4D37CF62" wp14:editId="3095F872">
+            <wp:extent cx="4320000" cy="1005231"/>
+            <wp:effectExtent l="19050" t="19050" r="23495" b="23495"/>
+            <wp:docPr id="261992964" name="Picture 1"/>
+            <wp:cNvGraphicFramePr>
+              <a:graphicFrameLocks xmlns:a="http://schemas.openxmlformats.org/drawingml/2006/main" noChangeAspect="1"/>
+            </wp:cNvGraphicFramePr>
+            <a:graphic xmlns:a="http://schemas.openxmlformats.org/drawingml/2006/main">
+              <a:graphicData uri="http://schemas.openxmlformats.org/drawingml/2006/picture">
+                <pic:pic xmlns:pic="http://schemas.openxmlformats.org/drawingml/2006/picture">
+                  <pic:nvPicPr>
+                    <pic:cNvPr id="261992964" name=""/>
+                    <pic:cNvPicPr/>
+                  </pic:nvPicPr>
+                  <pic:blipFill>
+                    <a:blip r:embed="rId19"/>
+                    <a:stretch>
+                      <a:fillRect/>
+                    </a:stretch>
+                  </pic:blipFill>
+                  <pic:spPr>
+                    <a:xfrm>
+                      <a:off x="0" y="0"/>
+                      <a:ext cx="4320000" cy="1005231"/>
+                    </a:xfrm>
+                    <a:prstGeom prst="rect">
+                      <a:avLst/>
+                    </a:prstGeom>
+                    <a:ln>
+                      <a:solidFill>
+                        <a:schemeClr val="accent1"/>
+                      </a:solidFill>
+                    </a:ln>
+                  </pic:spPr>
+                </pic:pic>
+              </a:graphicData>
+            </a:graphic>
+          </wp:inline>
+        </w:drawing>
+      </w:r>
+    </w:p>
+    <w:p>
+      <w:pPr>
+        <w:rPr>
+          <w:b/>
+          <w:bCs/>
+        </w:rPr>
+      </w:pPr>
+      <w:r>
+        <w:rPr>
+          <w:b/>
+          <w:bCs/>
+        </w:rPr>
+        <w:lastRenderedPageBreak/>
+        <w:drawing>
+          <wp:inline distT="0" distB="0" distL="0" distR="0" wp14:anchorId="5DC94554" wp14:editId="2B31B3FE">
+            <wp:extent cx="4320000" cy="2029385"/>
+            <wp:effectExtent l="19050" t="19050" r="23495" b="28575"/>
+            <wp:docPr id="763923850" name="Picture 1"/>
+            <wp:cNvGraphicFramePr>
+              <a:graphicFrameLocks xmlns:a="http://schemas.openxmlformats.org/drawingml/2006/main" noChangeAspect="1"/>
+            </wp:cNvGraphicFramePr>
+            <a:graphic xmlns:a="http://schemas.openxmlformats.org/drawingml/2006/main">
+              <a:graphicData uri="http://schemas.openxmlformats.org/drawingml/2006/picture">
+                <pic:pic xmlns:pic="http://schemas.openxmlformats.org/drawingml/2006/picture">
+                  <pic:nvPicPr>
+                    <pic:cNvPr id="763923850" name=""/>
+                    <pic:cNvPicPr/>
+                  </pic:nvPicPr>
+                  <pic:blipFill>
+                    <a:blip r:embed="rId20"/>
+                    <a:stretch>
+                      <a:fillRect/>
+                    </a:stretch>
+                  </pic:blipFill>
+                  <pic:spPr>
+                    <a:xfrm>
+                      <a:off x="0" y="0"/>
+                      <a:ext cx="4320000" cy="2029385"/>
+                    </a:xfrm>
+                    <a:prstGeom prst="rect">
+                      <a:avLst/>
+                    </a:prstGeom>
+                    <a:ln>
+                      <a:solidFill>
+                        <a:schemeClr val="accent1"/>
+                      </a:solidFill>
+                    </a:ln>
+                  </pic:spPr>
+                </pic:pic>
+              </a:graphicData>
+            </a:graphic>
+          </wp:inline>
+        </w:drawing>
+      </w:r>
+    </w:p>
+    <w:p>
+      <w:pPr>
+        <w:rPr>
+          <w:b/>
+          <w:bCs/>
+        </w:rPr>
+      </w:pPr>
+      <w:r>
+        <w:rPr>
+          <w:b/>
+          <w:bCs/>
+        </w:rPr>
+        <w:t xml:space="preserve">Langkah 6 – </w:t>
+      </w:r>
+      <w:proofErr w:type="spellStart"/>
+      <w:r>
+        <w:rPr>
+          <w:b/>
+          <w:bCs/>
+        </w:rPr>
+        <w:t>Membuat</w:t>
+      </w:r>
+      <w:proofErr w:type="spellEnd"/>
+      <w:r>
+        <w:rPr>
+          <w:b/>
+          <w:bCs/>
+        </w:rPr>
+        <w:t xml:space="preserve"> Halaman Login &amp; Register</w:t>
+      </w:r>
+    </w:p>
+    <w:p>
+      <w:r>
+        <w:drawing>
+          <wp:inline distT="0" distB="0" distL="0" distR="0" wp14:anchorId="41D7DB45" wp14:editId="4C78C812">
+            <wp:extent cx="1440000" cy="672898"/>
+            <wp:effectExtent l="19050" t="19050" r="27305" b="13335"/>
+            <wp:docPr id="1833459741" name="Picture 1"/>
+            <wp:cNvGraphicFramePr>
+              <a:graphicFrameLocks xmlns:a="http://schemas.openxmlformats.org/drawingml/2006/main" noChangeAspect="1"/>
+            </wp:cNvGraphicFramePr>
+            <a:graphic xmlns:a="http://schemas.openxmlformats.org/drawingml/2006/main">
+              <a:graphicData uri="http://schemas.openxmlformats.org/drawingml/2006/picture">
+                <pic:pic xmlns:pic="http://schemas.openxmlformats.org/drawingml/2006/picture">
+                  <pic:nvPicPr>
+                    <pic:cNvPr id="1833459741" name=""/>
+                    <pic:cNvPicPr/>
+                  </pic:nvPicPr>
+                  <pic:blipFill>
+                    <a:blip r:embed="rId21"/>
+                    <a:stretch>
+                      <a:fillRect/>
+                    </a:stretch>
+                  </pic:blipFill>
+                  <pic:spPr>
+                    <a:xfrm>
+                      <a:off x="0" y="0"/>
+                      <a:ext cx="1440000" cy="672898"/>
+                    </a:xfrm>
+                    <a:prstGeom prst="rect">
+                      <a:avLst/>
+                    </a:prstGeom>
+                    <a:ln>
+                      <a:solidFill>
+                        <a:schemeClr val="accent1"/>
+                      </a:solidFill>
+                    </a:ln>
+                  </pic:spPr>
+                </pic:pic>
+              </a:graphicData>
+            </a:graphic>
+          </wp:inline>
+        </w:drawing>
+      </w:r>
+    </w:p>
+    <w:p>
+      <w:r>
+        <w:drawing>
+          <wp:inline distT="0" distB="0" distL="0" distR="0" wp14:anchorId="46B6A5B1" wp14:editId="1829A6F1">
+            <wp:extent cx="4320000" cy="1966154"/>
+            <wp:effectExtent l="19050" t="19050" r="23495" b="15240"/>
+            <wp:docPr id="1430294590" name="Picture 1"/>
+            <wp:cNvGraphicFramePr>
+              <a:graphicFrameLocks xmlns:a="http://schemas.openxmlformats.org/drawingml/2006/main" noChangeAspect="1"/>
+            </wp:cNvGraphicFramePr>
+            <a:graphic xmlns:a="http://schemas.openxmlformats.org/drawingml/2006/main">
+              <a:graphicData uri="http://schemas.openxmlformats.org/drawingml/2006/picture">
+                <pic:pic xmlns:pic="http://schemas.openxmlformats.org/drawingml/2006/picture">
+                  <pic:nvPicPr>
+                    <pic:cNvPr id="1430294590" name=""/>
+                    <pic:cNvPicPr/>
+                  </pic:nvPicPr>
+                  <pic:blipFill>
+                    <a:blip r:embed="rId22"/>
+                    <a:stretch>
+                      <a:fillRect/>
+                    </a:stretch>
+                  </pic:blipFill>
+                  <pic:spPr>
+                    <a:xfrm>
+                      <a:off x="0" y="0"/>
+                      <a:ext cx="4320000" cy="1966154"/>
+                    </a:xfrm>
+                    <a:prstGeom prst="rect">
+                      <a:avLst/>
+                    </a:prstGeom>
+                    <a:ln>
+                      <a:solidFill>
+                        <a:schemeClr val="accent1"/>
+                      </a:solidFill>
+                    </a:ln>
+                  </pic:spPr>
+                </pic:pic>
+              </a:graphicData>
+            </a:graphic>
+          </wp:inline>
+        </w:drawing>
+      </w:r>
+    </w:p>
+    <w:p>
+      <w:pPr>
+        <w:tabs>
+          <w:tab w:val="left" w:pos="3119"/>
+        </w:tabs>
+      </w:pPr>
+      <w:r>
+        <w:drawing>
+          <wp:inline distT="0" distB="0" distL="0" distR="0" wp14:anchorId="550B6467" wp14:editId="78607DBC">
+            <wp:extent cx="4320000" cy="1470462"/>
+            <wp:effectExtent l="19050" t="19050" r="23495" b="15875"/>
+            <wp:docPr id="173383981" name="Picture 1"/>
+            <wp:cNvGraphicFramePr>
+              <a:graphicFrameLocks xmlns:a="http://schemas.openxmlformats.org/drawingml/2006/main" noChangeAspect="1"/>
+            </wp:cNvGraphicFramePr>
+            <a:graphic xmlns:a="http://schemas.openxmlformats.org/drawingml/2006/main">
+              <a:graphicData uri="http://schemas.openxmlformats.org/drawingml/2006/picture">
+                <pic:pic xmlns:pic="http://schemas.openxmlformats.org/drawingml/2006/picture">
+                  <pic:nvPicPr>
+                    <pic:cNvPr id="173383981" name=""/>
+                    <pic:cNvPicPr/>
+                  </pic:nvPicPr>
+                  <pic:blipFill>
+                    <a:blip r:embed="rId23"/>
+                    <a:stretch>
+                      <a:fillRect/>
+                    </a:stretch>
+                  </pic:blipFill>
+                  <pic:spPr>
+                    <a:xfrm>
+                      <a:off x="0" y="0"/>
+                      <a:ext cx="4320000" cy="1470462"/>
+                    </a:xfrm>
+                    <a:prstGeom prst="rect">
+                      <a:avLst/>
+                    </a:prstGeom>
+                    <a:ln>
+                      <a:solidFill>
+                        <a:schemeClr val="accent1"/>
+                      </a:solidFill>
+                    </a:ln>
+                  </pic:spPr>
+                </pic:pic>
+              </a:graphicData>
+            </a:graphic>
+          </wp:inline>
+        </w:drawing>
+      </w:r>
+    </w:p>
+    <w:p>
+      <w:r>
+        <w:lastRenderedPageBreak/>
+        <w:drawing>
+          <wp:inline distT="0" distB="0" distL="0" distR="0" wp14:anchorId="0E4CCE5C" wp14:editId="2ACCEAB9">
+            <wp:extent cx="4320000" cy="2178462"/>
+            <wp:effectExtent l="19050" t="19050" r="23495" b="12700"/>
+            <wp:docPr id="1922418008" name="Picture 1"/>
+            <wp:cNvGraphicFramePr>
+              <a:graphicFrameLocks xmlns:a="http://schemas.openxmlformats.org/drawingml/2006/main" noChangeAspect="1"/>
+            </wp:cNvGraphicFramePr>
+            <a:graphic xmlns:a="http://schemas.openxmlformats.org/drawingml/2006/main">
+              <a:graphicData uri="http://schemas.openxmlformats.org/drawingml/2006/picture">
+                <pic:pic xmlns:pic="http://schemas.openxmlformats.org/drawingml/2006/picture">
+                  <pic:nvPicPr>
+                    <pic:cNvPr id="1922418008" name=""/>
+                    <pic:cNvPicPr/>
+                  </pic:nvPicPr>
+                  <pic:blipFill>
+                    <a:blip r:embed="rId24"/>
+                    <a:stretch>
+                      <a:fillRect/>
+                    </a:stretch>
+                  </pic:blipFill>
+                  <pic:spPr>
+                    <a:xfrm>
+                      <a:off x="0" y="0"/>
+                      <a:ext cx="4320000" cy="2178462"/>
+                    </a:xfrm>
+                    <a:prstGeom prst="rect">
+                      <a:avLst/>
+                    </a:prstGeom>
+                    <a:ln>
+                      <a:solidFill>
+                        <a:schemeClr val="accent1"/>
+                      </a:solidFill>
+                    </a:ln>
+                  </pic:spPr>
+                </pic:pic>
+              </a:graphicData>
+            </a:graphic>
+          </wp:inline>
+        </w:drawing>
+      </w:r>
+    </w:p>
+    <w:p>
+      <w:r>
+        <w:drawing>
+          <wp:inline distT="0" distB="0" distL="0" distR="0" wp14:anchorId="5FFE2FA1" wp14:editId="0F1C94C7">
+            <wp:extent cx="4320000" cy="1349538"/>
+            <wp:effectExtent l="19050" t="19050" r="23495" b="22225"/>
+            <wp:docPr id="420164719" name="Picture 1"/>
+            <wp:cNvGraphicFramePr>
+              <a:graphicFrameLocks xmlns:a="http://schemas.openxmlformats.org/drawingml/2006/main" noChangeAspect="1"/>
+            </wp:cNvGraphicFramePr>
+            <a:graphic xmlns:a="http://schemas.openxmlformats.org/drawingml/2006/main">
+              <a:graphicData uri="http://schemas.openxmlformats.org/drawingml/2006/picture">
+                <pic:pic xmlns:pic="http://schemas.openxmlformats.org/drawingml/2006/picture">
+                  <pic:nvPicPr>
+                    <pic:cNvPr id="420164719" name=""/>
+                    <pic:cNvPicPr/>
+                  </pic:nvPicPr>
+                  <pic:blipFill>
+                    <a:blip r:embed="rId25"/>
+                    <a:stretch>
+                      <a:fillRect/>
+                    </a:stretch>
+                  </pic:blipFill>
+                  <pic:spPr>
+                    <a:xfrm>
+                      <a:off x="0" y="0"/>
+                      <a:ext cx="4320000" cy="1349538"/>
+                    </a:xfrm>
+                    <a:prstGeom prst="rect">
+                      <a:avLst/>
+                    </a:prstGeom>
+                    <a:ln>
+                      <a:solidFill>
+                        <a:schemeClr val="accent1"/>
+                      </a:solidFill>
+                    </a:ln>
+                  </pic:spPr>
+                </pic:pic>
+              </a:graphicData>
+            </a:graphic>
+          </wp:inline>
+        </w:drawing>
+      </w:r>
+    </w:p>
+    <w:p>
+      <w:pPr>
+        <w:rPr>
+          <w:b/>
+          <w:bCs/>
+        </w:rPr>
+      </w:pPr>
+      <w:r>
+        <w:rPr>
+          <w:b/>
+          <w:bCs/>
+        </w:rPr>
+        <w:t xml:space="preserve">Langkah 7 – </w:t>
+      </w:r>
+      <w:proofErr w:type="spellStart"/>
+      <w:r>
+        <w:rPr>
+          <w:b/>
+          <w:bCs/>
+        </w:rPr>
+        <w:t>Navigasi</w:t>
+      </w:r>
+      <w:proofErr w:type="spellEnd"/>
+      <w:r>
+        <w:rPr>
+          <w:b/>
+          <w:bCs/>
+        </w:rPr>
+        <w:t xml:space="preserve"> </w:t>
+      </w:r>
+      <w:proofErr w:type="spellStart"/>
+      <w:r>
+        <w:rPr>
+          <w:b/>
+          <w:bCs/>
+        </w:rPr>
+        <w:t>Imperatif</w:t>
+      </w:r>
+      <w:proofErr w:type="spellEnd"/>
+      <w:r>
+        <w:rPr>
+          <w:b/>
+          <w:bCs/>
+        </w:rPr>
+        <w:t xml:space="preserve"> (</w:t>
+      </w:r>
+      <w:proofErr w:type="spellStart"/>
+      <w:proofErr w:type="gramStart"/>
+      <w:r>
+        <w:rPr>
+          <w:b/>
+          <w:bCs/>
+        </w:rPr>
+        <w:t>router.push</w:t>
+      </w:r>
+      <w:proofErr w:type="spellEnd"/>
+      <w:proofErr w:type="gramEnd"/>
+      <w:r>
+        <w:rPr>
+          <w:b/>
+          <w:bCs/>
+        </w:rPr>
+        <w:t>)</w:t>
+      </w:r>
+    </w:p>
+    <w:p>
+      <w:proofErr w:type="spellStart"/>
+      <w:r>
+        <w:t>Tambahkan</w:t>
+      </w:r>
+      <w:proofErr w:type="spellEnd"/>
+      <w:r>
+        <w:t xml:space="preserve"> button login</w:t>
+      </w:r>
+    </w:p>
+    <w:p>
+      <w:r>
+        <w:drawing>
+          <wp:inline distT="0" distB="0" distL="0" distR="0" wp14:anchorId="6B108C2D" wp14:editId="2A688692">
+            <wp:extent cx="4320000" cy="2673231"/>
+            <wp:effectExtent l="19050" t="19050" r="23495" b="13335"/>
+            <wp:docPr id="989450758" name="Picture 1"/>
+            <wp:cNvGraphicFramePr>
+              <a:graphicFrameLocks xmlns:a="http://schemas.openxmlformats.org/drawingml/2006/main" noChangeAspect="1"/>
+            </wp:cNvGraphicFramePr>
+            <a:graphic xmlns:a="http://schemas.openxmlformats.org/drawingml/2006/main">
+              <a:graphicData uri="http://schemas.openxmlformats.org/drawingml/2006/picture">
+                <pic:pic xmlns:pic="http://schemas.openxmlformats.org/drawingml/2006/picture">
+                  <pic:nvPicPr>
+                    <pic:cNvPr id="989450758" name=""/>
+                    <pic:cNvPicPr/>
+                  </pic:nvPicPr>
+                  <pic:blipFill>
+                    <a:blip r:embed="rId26"/>
+                    <a:stretch>
+                      <a:fillRect/>
+                    </a:stretch>
+                  </pic:blipFill>
+                  <pic:spPr>
+                    <a:xfrm>
+                      <a:off x="0" y="0"/>
+                      <a:ext cx="4320000" cy="2673231"/>
+                    </a:xfrm>
+                    <a:prstGeom prst="rect">
+                      <a:avLst/>
+                    </a:prstGeom>
+                    <a:ln>
+                      <a:solidFill>
+                        <a:schemeClr val="accent1"/>
+                      </a:solidFill>
+                    </a:ln>
+                  </pic:spPr>
+                </pic:pic>
+              </a:graphicData>
+            </a:graphic>
+          </wp:inline>
+        </w:drawing>
+      </w:r>
+    </w:p>
+    <w:p>
+      <w:r>
+        <w:lastRenderedPageBreak/>
+        <w:drawing>
+          <wp:inline distT="0" distB="0" distL="0" distR="0" wp14:anchorId="7137B0E7" wp14:editId="685F65B6">
+            <wp:extent cx="4320000" cy="2429077"/>
+            <wp:effectExtent l="19050" t="19050" r="23495" b="28575"/>
+            <wp:docPr id="195509618" name="Picture 1"/>
+            <wp:cNvGraphicFramePr>
+              <a:graphicFrameLocks xmlns:a="http://schemas.openxmlformats.org/drawingml/2006/main" noChangeAspect="1"/>
+            </wp:cNvGraphicFramePr>
+            <a:graphic xmlns:a="http://schemas.openxmlformats.org/drawingml/2006/main">
+              <a:graphicData uri="http://schemas.openxmlformats.org/drawingml/2006/picture">
+                <pic:pic xmlns:pic="http://schemas.openxmlformats.org/drawingml/2006/picture">
+                  <pic:nvPicPr>
+                    <pic:cNvPr id="195509618" name=""/>
+                    <pic:cNvPicPr/>
+                  </pic:nvPicPr>
+                  <pic:blipFill>
+                    <a:blip r:embed="rId27"/>
+                    <a:stretch>
+                      <a:fillRect/>
+                    </a:stretch>
+                  </pic:blipFill>
+                  <pic:spPr>
+                    <a:xfrm>
+                      <a:off x="0" y="0"/>
+                      <a:ext cx="4320000" cy="2429077"/>
+                    </a:xfrm>
+                    <a:prstGeom prst="rect">
+                      <a:avLst/>
+                    </a:prstGeom>
+                    <a:ln>
+                      <a:solidFill>
+                        <a:schemeClr val="accent1"/>
+                      </a:solidFill>
+                    </a:ln>
+                  </pic:spPr>
+                </pic:pic>
+              </a:graphicData>
+            </a:graphic>
+          </wp:inline>
+        </w:drawing>
+      </w:r>
+    </w:p>
+    <w:p>
+      <w:pPr>
+        <w:rPr>
+          <w:lang w:val="fi-FI"/>
+        </w:rPr>
+      </w:pPr>
+      <w:proofErr w:type="spellStart"/>
+      <w:r>
+        <w:rPr>
+          <w:lang w:val="fi-FI"/>
+        </w:rPr>
+        <w:t>Jika</w:t>
+      </w:r>
+      <w:proofErr w:type="spellEnd"/>
+      <w:r>
+        <w:rPr>
+          <w:lang w:val="fi-FI"/>
+        </w:rPr>
+        <w:t xml:space="preserve"> </w:t>
+      </w:r>
+      <w:proofErr w:type="spellStart"/>
+      <w:r>
+        <w:rPr>
+          <w:lang w:val="fi-FI"/>
+        </w:rPr>
+        <w:t>diklik</w:t>
+      </w:r>
+      <w:proofErr w:type="spellEnd"/>
+      <w:r>
+        <w:rPr>
+          <w:lang w:val="fi-FI"/>
+        </w:rPr>
+        <w:t xml:space="preserve"> akan ke /</w:t>
+      </w:r>
+      <w:proofErr w:type="spellStart"/>
+      <w:r>
+        <w:rPr>
+          <w:lang w:val="fi-FI"/>
+        </w:rPr>
+        <w:t>p</w:t>
+      </w:r>
+      <w:r>
+        <w:rPr>
+          <w:lang w:val="fi-FI"/>
+        </w:rPr>
+        <w:t>roduk</w:t>
+      </w:r>
+      <w:proofErr w:type="spellEnd"/>
+    </w:p>
+    <w:p>
+      <w:pPr>
+        <w:rPr>
+          <w:lang w:val="fi-FI"/>
+        </w:rPr>
+      </w:pPr>
+      <w:r>
+        <w:rPr>
+          <w:lang w:val="fi-FI"/>
+        </w:rPr>
+        <w:drawing>
+          <wp:inline distT="0" distB="0" distL="0" distR="0" wp14:anchorId="73BDA043" wp14:editId="3DF9C866">
+            <wp:extent cx="4320000" cy="1660615"/>
+            <wp:effectExtent l="19050" t="19050" r="23495" b="15875"/>
+            <wp:docPr id="497471609" name="Picture 1"/>
+            <wp:cNvGraphicFramePr>
+              <a:graphicFrameLocks xmlns:a="http://schemas.openxmlformats.org/drawingml/2006/main" noChangeAspect="1"/>
+            </wp:cNvGraphicFramePr>
+            <a:graphic xmlns:a="http://schemas.openxmlformats.org/drawingml/2006/main">
+              <a:graphicData uri="http://schemas.openxmlformats.org/drawingml/2006/picture">
+                <pic:pic xmlns:pic="http://schemas.openxmlformats.org/drawingml/2006/picture">
+                  <pic:nvPicPr>
+                    <pic:cNvPr id="497471609" name=""/>
+                    <pic:cNvPicPr/>
+                  </pic:nvPicPr>
+                  <pic:blipFill>
+                    <a:blip r:embed="rId28"/>
+                    <a:stretch>
+                      <a:fillRect/>
+                    </a:stretch>
+                  </pic:blipFill>
+                  <pic:spPr>
+                    <a:xfrm>
+                      <a:off x="0" y="0"/>
+                      <a:ext cx="4320000" cy="1660615"/>
+                    </a:xfrm>
+                    <a:prstGeom prst="rect">
+                      <a:avLst/>
+                    </a:prstGeom>
+                    <a:ln>
+                      <a:solidFill>
+                        <a:schemeClr val="accent1"/>
+                      </a:solidFill>
+                    </a:ln>
+                  </pic:spPr>
+                </pic:pic>
+              </a:graphicData>
+            </a:graphic>
+          </wp:inline>
+        </w:drawing>
+      </w:r>
+    </w:p>
+    <w:p>
+      <w:pPr>
+        <w:rPr>
+          <w:lang w:val="fi-FI"/>
+        </w:rPr>
+      </w:pPr>
+      <w:proofErr w:type="spellStart"/>
+      <w:r>
+        <w:rPr>
+          <w:lang w:val="fi-FI"/>
+        </w:rPr>
+        <w:t>Pastikan</w:t>
+      </w:r>
+      <w:proofErr w:type="spellEnd"/>
+      <w:r>
+        <w:rPr>
+          <w:lang w:val="fi-FI"/>
+        </w:rPr>
+        <w:t xml:space="preserve"> </w:t>
+      </w:r>
+      <w:proofErr w:type="spellStart"/>
+      <w:r>
+        <w:rPr>
+          <w:lang w:val="fi-FI"/>
+        </w:rPr>
+        <w:t>code</w:t>
+      </w:r>
+      <w:proofErr w:type="spellEnd"/>
+      <w:r>
+        <w:rPr>
+          <w:lang w:val="fi-FI"/>
+        </w:rPr>
+        <w:t xml:space="preserve"> </w:t>
+      </w:r>
+      <w:proofErr w:type="spellStart"/>
+      <w:r>
+        <w:rPr>
+          <w:lang w:val="fi-FI"/>
+        </w:rPr>
+        <w:t>untuk</w:t>
+      </w:r>
+      <w:proofErr w:type="spellEnd"/>
+      <w:r>
+        <w:rPr>
+          <w:lang w:val="fi-FI"/>
+        </w:rPr>
+        <w:t xml:space="preserve"> </w:t>
+      </w:r>
+      <w:proofErr w:type="spellStart"/>
+      <w:r>
+        <w:rPr>
+          <w:lang w:val="fi-FI"/>
+        </w:rPr>
+        <w:t>redirect</w:t>
+      </w:r>
+      <w:proofErr w:type="spellEnd"/>
+      <w:r>
+        <w:rPr>
+          <w:lang w:val="fi-FI"/>
+        </w:rPr>
+        <w:t xml:space="preserve"> </w:t>
+      </w:r>
+      <w:proofErr w:type="spellStart"/>
+      <w:r>
+        <w:rPr>
+          <w:lang w:val="fi-FI"/>
+        </w:rPr>
+        <w:t>tidak</w:t>
+      </w:r>
+      <w:proofErr w:type="spellEnd"/>
+      <w:r>
+        <w:rPr>
+          <w:lang w:val="fi-FI"/>
+        </w:rPr>
+        <w:t xml:space="preserve"> </w:t>
+      </w:r>
+      <w:proofErr w:type="spellStart"/>
+      <w:r>
+        <w:rPr>
+          <w:lang w:val="fi-FI"/>
+        </w:rPr>
+        <w:t>aktif</w:t>
+      </w:r>
+      <w:proofErr w:type="spellEnd"/>
+      <w:r>
+        <w:rPr>
+          <w:lang w:val="fi-FI"/>
+        </w:rPr>
+        <w:t xml:space="preserve"> , </w:t>
+      </w:r>
+      <w:proofErr w:type="spellStart"/>
+      <w:r>
+        <w:rPr>
+          <w:lang w:val="fi-FI"/>
+        </w:rPr>
+        <w:t>jika</w:t>
+      </w:r>
+      <w:proofErr w:type="spellEnd"/>
+      <w:r>
+        <w:rPr>
+          <w:lang w:val="fi-FI"/>
+        </w:rPr>
+        <w:t xml:space="preserve"> </w:t>
+      </w:r>
+      <w:proofErr w:type="spellStart"/>
+      <w:r>
+        <w:rPr>
+          <w:lang w:val="fi-FI"/>
+        </w:rPr>
+        <w:t>aktif</w:t>
+      </w:r>
+      <w:proofErr w:type="spellEnd"/>
+      <w:r>
+        <w:rPr>
+          <w:lang w:val="fi-FI"/>
+        </w:rPr>
+        <w:t xml:space="preserve"> </w:t>
+      </w:r>
+      <w:proofErr w:type="spellStart"/>
+      <w:r>
+        <w:rPr>
+          <w:lang w:val="fi-FI"/>
+        </w:rPr>
+        <w:t>maka</w:t>
+      </w:r>
+      <w:proofErr w:type="spellEnd"/>
+      <w:r>
+        <w:rPr>
+          <w:lang w:val="fi-FI"/>
+        </w:rPr>
+        <w:t xml:space="preserve"> </w:t>
+      </w:r>
+      <w:proofErr w:type="spellStart"/>
+      <w:r>
+        <w:rPr>
+          <w:lang w:val="fi-FI"/>
+        </w:rPr>
+        <w:t>ketika</w:t>
+      </w:r>
+      <w:proofErr w:type="spellEnd"/>
+      <w:r>
+        <w:rPr>
+          <w:lang w:val="fi-FI"/>
+        </w:rPr>
+        <w:t xml:space="preserve"> </w:t>
+      </w:r>
+      <w:proofErr w:type="spellStart"/>
+      <w:r>
+        <w:rPr>
+          <w:lang w:val="fi-FI"/>
+        </w:rPr>
+        <w:t>masuk</w:t>
+      </w:r>
+      <w:proofErr w:type="spellEnd"/>
+      <w:r>
+        <w:rPr>
+          <w:lang w:val="fi-FI"/>
+        </w:rPr>
+        <w:t xml:space="preserve"> ke </w:t>
+      </w:r>
+      <w:proofErr w:type="spellStart"/>
+      <w:r>
+        <w:rPr>
+          <w:lang w:val="fi-FI"/>
+        </w:rPr>
+        <w:t>produk</w:t>
+      </w:r>
+      <w:proofErr w:type="spellEnd"/>
+      <w:r>
+        <w:rPr>
+          <w:lang w:val="fi-FI"/>
+        </w:rPr>
+        <w:t xml:space="preserve"> akan </w:t>
+      </w:r>
+      <w:proofErr w:type="spellStart"/>
+      <w:r>
+        <w:rPr>
+          <w:lang w:val="fi-FI"/>
+        </w:rPr>
+        <w:t>lansung</w:t>
+      </w:r>
+      <w:proofErr w:type="spellEnd"/>
+      <w:r>
+        <w:rPr>
+          <w:lang w:val="fi-FI"/>
+        </w:rPr>
+        <w:t xml:space="preserve"> </w:t>
+      </w:r>
+      <w:proofErr w:type="spellStart"/>
+      <w:r>
+        <w:rPr>
+          <w:lang w:val="fi-FI"/>
+        </w:rPr>
+        <w:t>redirect</w:t>
+      </w:r>
+      <w:proofErr w:type="spellEnd"/>
+      <w:r>
+        <w:rPr>
+          <w:lang w:val="fi-FI"/>
+        </w:rPr>
+        <w:t xml:space="preserve"> ke </w:t>
+      </w:r>
+      <w:proofErr w:type="spellStart"/>
+      <w:r>
+        <w:rPr>
+          <w:lang w:val="fi-FI"/>
+        </w:rPr>
+        <w:t>login</w:t>
+      </w:r>
+      <w:proofErr w:type="spellEnd"/>
+    </w:p>
+    <w:p>
+      <w:pPr>
+        <w:rPr>
+          <w:lang w:val="fi-FI"/>
+        </w:rPr>
+      </w:pPr>
+      <w:r>
+        <w:rPr>
+          <w:lang w:val="fi-FI"/>
+        </w:rPr>
+        <w:lastRenderedPageBreak/>
+        <w:drawing>
+          <wp:inline distT="0" distB="0" distL="0" distR="0" wp14:anchorId="0D0664CC" wp14:editId="3B316826">
+            <wp:extent cx="4320000" cy="3040615"/>
+            <wp:effectExtent l="19050" t="19050" r="23495" b="26670"/>
+            <wp:docPr id="1843410014" name="Picture 1"/>
+            <wp:cNvGraphicFramePr>
+              <a:graphicFrameLocks xmlns:a="http://schemas.openxmlformats.org/drawingml/2006/main" noChangeAspect="1"/>
+            </wp:cNvGraphicFramePr>
+            <a:graphic xmlns:a="http://schemas.openxmlformats.org/drawingml/2006/main">
+              <a:graphicData uri="http://schemas.openxmlformats.org/drawingml/2006/picture">
+                <pic:pic xmlns:pic="http://schemas.openxmlformats.org/drawingml/2006/picture">
+                  <pic:nvPicPr>
+                    <pic:cNvPr id="1843410014" name=""/>
+                    <pic:cNvPicPr/>
+                  </pic:nvPicPr>
+                  <pic:blipFill>
+                    <a:blip r:embed="rId29"/>
+                    <a:stretch>
+                      <a:fillRect/>
+                    </a:stretch>
+                  </pic:blipFill>
+                  <pic:spPr>
+                    <a:xfrm>
+                      <a:off x="0" y="0"/>
+                      <a:ext cx="4320000" cy="3040615"/>
+                    </a:xfrm>
+                    <a:prstGeom prst="rect">
+                      <a:avLst/>
+                    </a:prstGeom>
+                    <a:ln>
+                      <a:solidFill>
+                        <a:schemeClr val="accent1"/>
+                      </a:solidFill>
+                    </a:ln>
+                  </pic:spPr>
+                </pic:pic>
+              </a:graphicData>
+            </a:graphic>
+          </wp:inline>
+        </w:drawing>
+      </w:r>
+    </w:p>
+    <w:p>
+      <w:pPr>
+        <w:rPr>
+          <w:b/>
+          <w:bCs/>
+        </w:rPr>
+      </w:pPr>
+      <w:r>
+        <w:rPr>
+          <w:b/>
+          <w:bCs/>
+        </w:rPr>
+        <w:t xml:space="preserve">Langkah 8 – </w:t>
+      </w:r>
+      <w:proofErr w:type="spellStart"/>
+      <w:r>
+        <w:rPr>
+          <w:b/>
+          <w:bCs/>
+        </w:rPr>
+        <w:t>Simulasi</w:t>
+      </w:r>
+      <w:proofErr w:type="spellEnd"/>
+      <w:r>
+        <w:rPr>
+          <w:b/>
+          <w:bCs/>
+        </w:rPr>
+        <w:t xml:space="preserve"> Redirect (Belum Login)</w:t>
+      </w:r>
+    </w:p>
+    <w:p>
+      <w:proofErr w:type="spellStart"/>
+      <w:r>
+        <w:t>Modifikasi</w:t>
+      </w:r>
+      <w:proofErr w:type="spellEnd"/>
+    </w:p>
+    <w:p>
+      <w:r>
+        <w:drawing>
+          <wp:inline distT="0" distB="0" distL="0" distR="0" wp14:anchorId="7EAD4BB6" wp14:editId="1B2FB236">
+            <wp:extent cx="4320000" cy="3192923"/>
+            <wp:effectExtent l="0" t="0" r="4445" b="7620"/>
+            <wp:docPr id="1708567977" name="Picture 1"/>
+            <wp:cNvGraphicFramePr>
+              <a:graphicFrameLocks xmlns:a="http://schemas.openxmlformats.org/drawingml/2006/main" noChangeAspect="1"/>
+            </wp:cNvGraphicFramePr>
+            <a:graphic xmlns:a="http://schemas.openxmlformats.org/drawingml/2006/main">
+              <a:graphicData uri="http://schemas.openxmlformats.org/drawingml/2006/picture">
+                <pic:pic xmlns:pic="http://schemas.openxmlformats.org/drawingml/2006/picture">
+                  <pic:nvPicPr>
+                    <pic:cNvPr id="1708567977" name=""/>
+                    <pic:cNvPicPr/>
+                  </pic:nvPicPr>
+                  <pic:blipFill>
+                    <a:blip r:embed="rId30"/>
+                    <a:stretch>
+                      <a:fillRect/>
+                    </a:stretch>
+                  </pic:blipFill>
+                  <pic:spPr>
+                    <a:xfrm>
+                      <a:off x="0" y="0"/>
+                      <a:ext cx="4320000" cy="3192923"/>
+                    </a:xfrm>
+                    <a:prstGeom prst="rect">
+                      <a:avLst/>
+                    </a:prstGeom>
+                  </pic:spPr>
+                </pic:pic>
+              </a:graphicData>
+            </a:graphic>
+          </wp:inline>
+        </w:drawing>
+      </w:r>
+    </w:p>
+    <w:p>
+      <w:pPr>
+        <w:rPr>
+          <w:lang w:val="fi-FI"/>
+        </w:rPr>
+      </w:pPr>
+      <w:proofErr w:type="spellStart"/>
+      <w:r>
+        <w:rPr>
+          <w:lang w:val="fi-FI"/>
+        </w:rPr>
+        <w:t>Maka</w:t>
+      </w:r>
+      <w:proofErr w:type="spellEnd"/>
+      <w:r>
+        <w:rPr>
+          <w:lang w:val="fi-FI"/>
+        </w:rPr>
+        <w:t xml:space="preserve"> </w:t>
+      </w:r>
+      <w:proofErr w:type="spellStart"/>
+      <w:r>
+        <w:rPr>
+          <w:lang w:val="fi-FI"/>
+        </w:rPr>
+        <w:t>j</w:t>
+      </w:r>
+      <w:r>
+        <w:rPr>
+          <w:lang w:val="fi-FI"/>
+        </w:rPr>
+        <w:t>ika</w:t>
+      </w:r>
+      <w:proofErr w:type="spellEnd"/>
+      <w:r>
+        <w:rPr>
+          <w:lang w:val="fi-FI"/>
+        </w:rPr>
+        <w:t xml:space="preserve"> </w:t>
+      </w:r>
+      <w:proofErr w:type="spellStart"/>
+      <w:r>
+        <w:rPr>
+          <w:lang w:val="fi-FI"/>
+        </w:rPr>
+        <w:t>a</w:t>
+      </w:r>
+      <w:r>
+        <w:rPr>
+          <w:lang w:val="fi-FI"/>
+        </w:rPr>
+        <w:t>kses</w:t>
+      </w:r>
+      <w:proofErr w:type="spellEnd"/>
+      <w:r>
+        <w:rPr>
+          <w:lang w:val="fi-FI"/>
+        </w:rPr>
+        <w:t xml:space="preserve"> /</w:t>
+      </w:r>
+      <w:proofErr w:type="spellStart"/>
+      <w:r>
+        <w:rPr>
+          <w:lang w:val="fi-FI"/>
+        </w:rPr>
+        <w:t>product</w:t>
+      </w:r>
+      <w:proofErr w:type="spellEnd"/>
+      <w:r>
+        <w:rPr>
+          <w:lang w:val="fi-FI"/>
+        </w:rPr>
+        <w:t xml:space="preserve"> → </w:t>
+      </w:r>
+      <w:proofErr w:type="spellStart"/>
+      <w:r>
+        <w:rPr>
+          <w:lang w:val="fi-FI"/>
+        </w:rPr>
+        <w:t>otomatis</w:t>
+      </w:r>
+      <w:proofErr w:type="spellEnd"/>
+      <w:r>
+        <w:rPr>
+          <w:lang w:val="fi-FI"/>
+        </w:rPr>
+        <w:t xml:space="preserve"> diarahkan ke </w:t>
+      </w:r>
+      <w:proofErr w:type="spellStart"/>
+      <w:r>
+        <w:rPr>
+          <w:lang w:val="fi-FI"/>
+        </w:rPr>
+        <w:t>login</w:t>
+      </w:r>
+      <w:proofErr w:type="spellEnd"/>
+    </w:p>
+    <w:p>
+      <w:pPr>
+        <w:rPr>
+          <w:b/>
+          <w:bCs/>
+          <w:lang w:val="fi-FI"/>
+        </w:rPr>
+      </w:pPr>
+      <w:r>
+        <w:rPr>
+          <w:b/>
+          <w:bCs/>
+          <w:lang w:val="fi-FI"/>
+        </w:rPr>
+        <w:lastRenderedPageBreak/>
+        <w:drawing>
+          <wp:inline distT="0" distB="0" distL="0" distR="0" wp14:anchorId="2B876515" wp14:editId="397CA00A">
+            <wp:extent cx="4320000" cy="2192769"/>
+            <wp:effectExtent l="19050" t="19050" r="23495" b="17145"/>
+            <wp:docPr id="881855404" name="Picture 1"/>
+            <wp:cNvGraphicFramePr>
+              <a:graphicFrameLocks xmlns:a="http://schemas.openxmlformats.org/drawingml/2006/main" noChangeAspect="1"/>
+            </wp:cNvGraphicFramePr>
+            <a:graphic xmlns:a="http://schemas.openxmlformats.org/drawingml/2006/main">
+              <a:graphicData uri="http://schemas.openxmlformats.org/drawingml/2006/picture">
+                <pic:pic xmlns:pic="http://schemas.openxmlformats.org/drawingml/2006/picture">
+                  <pic:nvPicPr>
+                    <pic:cNvPr id="881855404" name=""/>
+                    <pic:cNvPicPr/>
+                  </pic:nvPicPr>
+                  <pic:blipFill>
+                    <a:blip r:embed="rId31"/>
+                    <a:stretch>
+                      <a:fillRect/>
+                    </a:stretch>
+                  </pic:blipFill>
+                  <pic:spPr>
+                    <a:xfrm>
+                      <a:off x="0" y="0"/>
+                      <a:ext cx="4320000" cy="2192769"/>
+                    </a:xfrm>
+                    <a:prstGeom prst="rect">
+                      <a:avLst/>
+                    </a:prstGeom>
+                    <a:ln>
+                      <a:solidFill>
+                        <a:schemeClr val="accent1"/>
+                      </a:solidFill>
+                    </a:ln>
+                  </pic:spPr>
+                </pic:pic>
+              </a:graphicData>
+            </a:graphic>
+          </wp:inline>
+        </w:drawing>
+      </w:r>
+    </w:p>
+    <w:p>
+      <w:pPr>
+        <w:rPr>
+          <w:b/>
+          <w:bCs/>
+        </w:rPr>
+      </w:pPr>
+      <w:r>
+        <w:rPr>
+          <w:b/>
+          <w:bCs/>
+        </w:rPr>
+        <w:t xml:space="preserve">E. </w:t>
+      </w:r>
+      <w:proofErr w:type="spellStart"/>
+      <w:r>
+        <w:rPr>
+          <w:b/>
+          <w:bCs/>
+        </w:rPr>
+        <w:t>Tugas</w:t>
+      </w:r>
+      <w:proofErr w:type="spellEnd"/>
+      <w:r>
+        <w:rPr>
+          <w:b/>
+          <w:bCs/>
+        </w:rPr>
+        <w:t xml:space="preserve"> </w:t>
+      </w:r>
+      <w:proofErr w:type="spellStart"/>
+      <w:r>
+        <w:rPr>
+          <w:b/>
+          <w:bCs/>
+        </w:rPr>
+        <w:t>Praktikum</w:t>
+      </w:r>
+      <w:proofErr w:type="spellEnd"/>
+    </w:p>
+    <w:p>
+      <w:proofErr w:type="spellStart"/>
+      <w:r>
+        <w:t>Tugas</w:t>
+      </w:r>
+      <w:proofErr w:type="spellEnd"/>
+      <w:r>
+        <w:t xml:space="preserve"> 1 (Wajib)</w:t>
+      </w:r>
+    </w:p>
+    <w:p>
+      <w:r>
+        <w:t xml:space="preserve">• </w:t>
+      </w:r>
+      <w:proofErr w:type="spellStart"/>
+      <w:r>
+        <w:t>Buat</w:t>
+      </w:r>
+      <w:proofErr w:type="spellEnd"/>
+      <w:r>
+        <w:t xml:space="preserve"> catch-all route:</w:t>
+      </w:r>
+    </w:p>
+    <w:p>
+      <w:r>
+        <w:t>• /category</w:t>
+      </w:r>
+      <w:proofErr w:type="gramStart"/>
+      <w:r>
+        <w:t>/[</w:t>
+      </w:r>
+      <w:proofErr w:type="gramEnd"/>
+      <w:r>
+        <w:t>...slug].js</w:t>
+      </w:r>
+    </w:p>
+    <w:p>
+      <w:r>
+        <w:t xml:space="preserve">• </w:t>
+      </w:r>
+      <w:proofErr w:type="spellStart"/>
+      <w:r>
+        <w:t>Tampilkan</w:t>
+      </w:r>
+      <w:proofErr w:type="spellEnd"/>
+      <w:r>
+        <w:t xml:space="preserve"> </w:t>
+      </w:r>
+      <w:proofErr w:type="spellStart"/>
+      <w:r>
+        <w:t>seluruh</w:t>
+      </w:r>
+      <w:proofErr w:type="spellEnd"/>
+      <w:r>
+        <w:t xml:space="preserve"> parameter URL </w:t>
+      </w:r>
+      <w:proofErr w:type="spellStart"/>
+      <w:r>
+        <w:t>dalam</w:t>
+      </w:r>
+      <w:proofErr w:type="spellEnd"/>
+      <w:r>
+        <w:t xml:space="preserve"> </w:t>
+      </w:r>
+      <w:proofErr w:type="spellStart"/>
+      <w:r>
+        <w:t>bentuk</w:t>
+      </w:r>
+      <w:proofErr w:type="spellEnd"/>
+      <w:r>
+        <w:t xml:space="preserve"> list.</w:t>
+      </w:r>
+    </w:p>
+    <w:p>
+      <w:r>
+        <w:drawing>
+          <wp:inline distT="0" distB="0" distL="0" distR="0" wp14:anchorId="51688554" wp14:editId="7443E839">
+            <wp:extent cx="4320000" cy="1580769"/>
+            <wp:effectExtent l="0" t="0" r="4445" b="635"/>
+            <wp:docPr id="1313849144" name="Picture 1"/>
+            <wp:cNvGraphicFramePr>
+              <a:graphicFrameLocks xmlns:a="http://schemas.openxmlformats.org/drawingml/2006/main" noChangeAspect="1"/>
+            </wp:cNvGraphicFramePr>
+            <a:graphic xmlns:a="http://schemas.openxmlformats.org/drawingml/2006/main">
+              <a:graphicData uri="http://schemas.openxmlformats.org/drawingml/2006/picture">
+                <pic:pic xmlns:pic="http://schemas.openxmlformats.org/drawingml/2006/picture">
+                  <pic:nvPicPr>
+                    <pic:cNvPr id="1313849144" name=""/>
+                    <pic:cNvPicPr/>
+                  </pic:nvPicPr>
+                  <pic:blipFill>
+                    <a:blip r:embed="rId32"/>
+                    <a:stretch>
+                      <a:fillRect/>
+                    </a:stretch>
+                  </pic:blipFill>
+                  <pic:spPr>
+                    <a:xfrm>
+                      <a:off x="0" y="0"/>
+                      <a:ext cx="4320000" cy="1580769"/>
+                    </a:xfrm>
+                    <a:prstGeom prst="rect">
+                      <a:avLst/>
+                    </a:prstGeom>
+                  </pic:spPr>
+                </pic:pic>
+              </a:graphicData>
+            </a:graphic>
+          </wp:inline>
+        </w:drawing>
+      </w:r>
+    </w:p>
+    <w:p>
+      <w:r>
+        <w:drawing>
+          <wp:inline distT="0" distB="0" distL="0" distR="0" wp14:anchorId="3D615BFB" wp14:editId="7D237A28">
+            <wp:extent cx="4320000" cy="1564615"/>
+            <wp:effectExtent l="19050" t="19050" r="23495" b="17145"/>
+            <wp:docPr id="622711474" name="Picture 1"/>
+            <wp:cNvGraphicFramePr>
+              <a:graphicFrameLocks xmlns:a="http://schemas.openxmlformats.org/drawingml/2006/main" noChangeAspect="1"/>
+            </wp:cNvGraphicFramePr>
+            <a:graphic xmlns:a="http://schemas.openxmlformats.org/drawingml/2006/main">
+              <a:graphicData uri="http://schemas.openxmlformats.org/drawingml/2006/picture">
+                <pic:pic xmlns:pic="http://schemas.openxmlformats.org/drawingml/2006/picture">
+                  <pic:nvPicPr>
+                    <pic:cNvPr id="622711474" name=""/>
+                    <pic:cNvPicPr/>
+                  </pic:nvPicPr>
+                  <pic:blipFill>
+                    <a:blip r:embed="rId33"/>
+                    <a:stretch>
+                      <a:fillRect/>
+                    </a:stretch>
+                  </pic:blipFill>
+                  <pic:spPr>
+                    <a:xfrm>
+                      <a:off x="0" y="0"/>
+                      <a:ext cx="4320000" cy="1564615"/>
+                    </a:xfrm>
+                    <a:prstGeom prst="rect">
+                      <a:avLst/>
+                    </a:prstGeom>
+                    <a:ln>
+                      <a:solidFill>
+                        <a:schemeClr val="accent1"/>
+                      </a:solidFill>
+                    </a:ln>
+                  </pic:spPr>
+                </pic:pic>
+              </a:graphicData>
+            </a:graphic>
+          </wp:inline>
+        </w:drawing>
+      </w:r>
+    </w:p>
+    <w:p>
+      <w:proofErr w:type="spellStart"/>
+      <w:r>
+        <w:t>Tugas</w:t>
+      </w:r>
+      <w:proofErr w:type="spellEnd"/>
+      <w:r>
+        <w:t xml:space="preserve"> 2 (Wajib)</w:t>
+      </w:r>
+    </w:p>
+    <w:p>
+      <w:r>
+        <w:t xml:space="preserve">• </w:t>
+      </w:r>
+      <w:proofErr w:type="spellStart"/>
+      <w:r>
+        <w:t>Buat</w:t>
+      </w:r>
+      <w:proofErr w:type="spellEnd"/>
+      <w:r>
+        <w:t xml:space="preserve"> </w:t>
+      </w:r>
+      <w:proofErr w:type="spellStart"/>
+      <w:r>
+        <w:t>navigasi</w:t>
+      </w:r>
+      <w:proofErr w:type="spellEnd"/>
+      <w:r>
+        <w:t>:</w:t>
+      </w:r>
+    </w:p>
+    <w:p>
+      <w:r>
+        <w:t>o Login → Product (</w:t>
+      </w:r>
+      <w:proofErr w:type="spellStart"/>
+      <w:r>
+        <w:t>imperatif</w:t>
+      </w:r>
+      <w:proofErr w:type="spellEnd"/>
+      <w:r>
+        <w:t>)</w:t>
+      </w:r>
+    </w:p>
+    <w:p>
+      <w:r>
+        <w:lastRenderedPageBreak/>
+        <w:t>o Login ↔ Register (Link)</w:t>
+      </w:r>
+    </w:p>
+    <w:p>
+      <w:r>
+        <w:drawing>
+          <wp:inline distT="0" distB="0" distL="0" distR="0" wp14:anchorId="1CB4E680" wp14:editId="66004EF8">
+            <wp:extent cx="4320000" cy="1686923"/>
+            <wp:effectExtent l="0" t="0" r="4445" b="8890"/>
+            <wp:docPr id="1483370340" name="Picture 1"/>
+            <wp:cNvGraphicFramePr>
+              <a:graphicFrameLocks xmlns:a="http://schemas.openxmlformats.org/drawingml/2006/main" noChangeAspect="1"/>
+            </wp:cNvGraphicFramePr>
+            <a:graphic xmlns:a="http://schemas.openxmlformats.org/drawingml/2006/main">
+              <a:graphicData uri="http://schemas.openxmlformats.org/drawingml/2006/picture">
+                <pic:pic xmlns:pic="http://schemas.openxmlformats.org/drawingml/2006/picture">
+                  <pic:nvPicPr>
+                    <pic:cNvPr id="1483370340" name=""/>
+                    <pic:cNvPicPr/>
+                  </pic:nvPicPr>
+                  <pic:blipFill>
+                    <a:blip r:embed="rId34"/>
+                    <a:stretch>
+                      <a:fillRect/>
+                    </a:stretch>
+                  </pic:blipFill>
+                  <pic:spPr>
+                    <a:xfrm>
+                      <a:off x="0" y="0"/>
+                      <a:ext cx="4320000" cy="1686923"/>
+                    </a:xfrm>
+                    <a:prstGeom prst="rect">
+                      <a:avLst/>
+                    </a:prstGeom>
+                  </pic:spPr>
+                </pic:pic>
+              </a:graphicData>
+            </a:graphic>
+          </wp:inline>
+        </w:drawing>
+      </w:r>
+    </w:p>
+    <w:p>
+      <w:proofErr w:type="spellStart"/>
+      <w:r>
+        <w:t>Tugas</w:t>
+      </w:r>
+      <w:proofErr w:type="spellEnd"/>
+      <w:r>
+        <w:t xml:space="preserve"> 3 (</w:t>
+      </w:r>
+      <w:proofErr w:type="spellStart"/>
+      <w:r>
+        <w:t>Pengayaan</w:t>
+      </w:r>
+      <w:proofErr w:type="spellEnd"/>
+      <w:r>
+        <w:t>)</w:t>
+      </w:r>
+    </w:p>
+    <w:p>
+      <w:r>
+        <w:t xml:space="preserve">• </w:t>
+      </w:r>
+      <w:proofErr w:type="spellStart"/>
+      <w:r>
+        <w:t>Terapkan</w:t>
+      </w:r>
+      <w:proofErr w:type="spellEnd"/>
+      <w:r>
+        <w:t xml:space="preserve"> redirect </w:t>
+      </w:r>
+      <w:proofErr w:type="spellStart"/>
+      <w:r>
+        <w:t>otomatis</w:t>
+      </w:r>
+      <w:proofErr w:type="spellEnd"/>
+      <w:r>
+        <w:t xml:space="preserve"> </w:t>
+      </w:r>
+      <w:proofErr w:type="spellStart"/>
+      <w:r>
+        <w:t>ke</w:t>
+      </w:r>
+      <w:proofErr w:type="spellEnd"/>
+      <w:r>
+        <w:t xml:space="preserve"> login </w:t>
+      </w:r>
+      <w:proofErr w:type="spellStart"/>
+      <w:r>
+        <w:t>jika</w:t>
+      </w:r>
+      <w:proofErr w:type="spellEnd"/>
+      <w:r>
+        <w:t xml:space="preserve"> user </w:t>
+      </w:r>
+      <w:proofErr w:type="spellStart"/>
+      <w:r>
+        <w:t>belum</w:t>
+      </w:r>
+      <w:proofErr w:type="spellEnd"/>
+      <w:r>
+        <w:t xml:space="preserve"> login.</w:t>
+      </w:r>
+    </w:p>
+    <w:p>
+      <w:r>
+        <w:drawing>
+          <wp:inline distT="0" distB="0" distL="0" distR="0" wp14:anchorId="301BCDBF" wp14:editId="777257EE">
+            <wp:extent cx="4320000" cy="1087846"/>
+            <wp:effectExtent l="0" t="0" r="4445" b="0"/>
+            <wp:docPr id="226752507" name="Picture 1"/>
+            <wp:cNvGraphicFramePr>
+              <a:graphicFrameLocks xmlns:a="http://schemas.openxmlformats.org/drawingml/2006/main" noChangeAspect="1"/>
+            </wp:cNvGraphicFramePr>
+            <a:graphic xmlns:a="http://schemas.openxmlformats.org/drawingml/2006/main">
+              <a:graphicData uri="http://schemas.openxmlformats.org/drawingml/2006/picture">
+                <pic:pic xmlns:pic="http://schemas.openxmlformats.org/drawingml/2006/picture">
+                  <pic:nvPicPr>
+                    <pic:cNvPr id="226752507" name=""/>
+                    <pic:cNvPicPr/>
+                  </pic:nvPicPr>
+                  <pic:blipFill>
+                    <a:blip r:embed="rId35"/>
+                    <a:stretch>
+                      <a:fillRect/>
+                    </a:stretch>
+                  </pic:blipFill>
+                  <pic:spPr>
+                    <a:xfrm>
+                      <a:off x="0" y="0"/>
+                      <a:ext cx="4320000" cy="1087846"/>
+                    </a:xfrm>
+                    <a:prstGeom prst="rect">
+                      <a:avLst/>
+                    </a:prstGeom>
+                  </pic:spPr>
+                </pic:pic>
+              </a:graphicData>
+            </a:graphic>
+          </wp:inline>
+        </w:drawing>
+      </w:r>
+    </w:p>
+    <w:p>
+      <w:pPr>
+        <w:rPr>
+          <w:b/>
+          <w:bCs/>
+        </w:rPr>
+      </w:pPr>
+      <w:r>
+        <w:rPr>
+          <w:b/>
+          <w:bCs/>
+        </w:rPr>
+        <w:t xml:space="preserve">F. </w:t>
+      </w:r>
+      <w:proofErr w:type="spellStart"/>
+      <w:r>
+        <w:rPr>
+          <w:b/>
+          <w:bCs/>
+        </w:rPr>
+        <w:t>Pertanyaan</w:t>
+      </w:r>
+      <w:proofErr w:type="spellEnd"/>
+      <w:r>
+        <w:rPr>
+          <w:b/>
+          <w:bCs/>
+        </w:rPr>
+        <w:t xml:space="preserve"> </w:t>
+      </w:r>
+      <w:proofErr w:type="spellStart"/>
+      <w:r>
+        <w:rPr>
+          <w:b/>
+          <w:bCs/>
+        </w:rPr>
+        <w:t>Evaluasi</w:t>
+      </w:r>
+      <w:proofErr w:type="spellEnd"/>
+    </w:p>
+    <w:p>
+      <w:r>
+        <w:t xml:space="preserve">1. Apa </w:t>
+      </w:r>
+      <w:proofErr w:type="spellStart"/>
+      <w:r>
+        <w:t>perbedaan</w:t>
+      </w:r>
+      <w:proofErr w:type="spellEnd"/>
+      <w:r>
+        <w:t xml:space="preserve"> [id].js dan [...slug].</w:t>
+      </w:r>
+      <w:proofErr w:type="spellStart"/>
+      <w:r>
+        <w:t>js</w:t>
+      </w:r>
+      <w:proofErr w:type="spellEnd"/>
+      <w:r>
+        <w:t>?</w:t>
+      </w:r>
+    </w:p>
+    <w:p>
+      <w:pPr>
+        <w:rPr>
+          <w:u w:val="single"/>
+        </w:rPr>
+      </w:pPr>
+      <w:r>
+        <w:rPr>
+          <w:u w:val="single"/>
+        </w:rPr>
+        <w:t xml:space="preserve">[id].js </w:t>
+      </w:r>
+      <w:proofErr w:type="spellStart"/>
+      <w:r>
+        <w:rPr>
+          <w:u w:val="single"/>
+        </w:rPr>
+        <w:t>hanya</w:t>
+      </w:r>
+      <w:proofErr w:type="spellEnd"/>
+      <w:r>
+        <w:rPr>
+          <w:u w:val="single"/>
+        </w:rPr>
+        <w:t xml:space="preserve"> </w:t>
+      </w:r>
+      <w:proofErr w:type="spellStart"/>
+      <w:r>
+        <w:rPr>
+          <w:u w:val="single"/>
+        </w:rPr>
+        <w:t>menangkap</w:t>
+      </w:r>
+      <w:proofErr w:type="spellEnd"/>
+      <w:r>
+        <w:rPr>
+          <w:u w:val="single"/>
+        </w:rPr>
+        <w:t xml:space="preserve"> </w:t>
+      </w:r>
+      <w:proofErr w:type="spellStart"/>
+      <w:r>
+        <w:rPr>
+          <w:u w:val="single"/>
+        </w:rPr>
+        <w:t>satu</w:t>
+      </w:r>
+      <w:proofErr w:type="spellEnd"/>
+      <w:r>
+        <w:rPr>
+          <w:u w:val="single"/>
+        </w:rPr>
+        <w:t xml:space="preserve"> </w:t>
+      </w:r>
+      <w:proofErr w:type="spellStart"/>
+      <w:r>
+        <w:rPr>
+          <w:u w:val="single"/>
+        </w:rPr>
+        <w:t>segmen</w:t>
+      </w:r>
+      <w:proofErr w:type="spellEnd"/>
+      <w:r>
+        <w:rPr>
+          <w:u w:val="single"/>
+        </w:rPr>
+        <w:t xml:space="preserve"> URL (</w:t>
+      </w:r>
+      <w:proofErr w:type="spellStart"/>
+      <w:r>
+        <w:rPr>
+          <w:u w:val="single"/>
+        </w:rPr>
+        <w:t>misal</w:t>
+      </w:r>
+      <w:proofErr w:type="spellEnd"/>
+      <w:r>
+        <w:rPr>
+          <w:u w:val="single"/>
+        </w:rPr>
+        <w:t xml:space="preserve">: /123), </w:t>
+      </w:r>
+      <w:proofErr w:type="spellStart"/>
+      <w:r>
+        <w:rPr>
+          <w:u w:val="single"/>
+        </w:rPr>
+        <w:t>sedangkan</w:t>
+      </w:r>
+      <w:proofErr w:type="spellEnd"/>
+      <w:r>
+        <w:rPr>
+          <w:u w:val="single"/>
+        </w:rPr>
+        <w:t xml:space="preserve"> [...slug].js </w:t>
+      </w:r>
+      <w:proofErr w:type="spellStart"/>
+      <w:r>
+        <w:rPr>
+          <w:u w:val="single"/>
+        </w:rPr>
+        <w:t>adalah</w:t>
+      </w:r>
+      <w:proofErr w:type="spellEnd"/>
+      <w:r>
+        <w:rPr>
+          <w:u w:val="single"/>
+        </w:rPr>
+        <w:t xml:space="preserve"> catch-all route yang </w:t>
+      </w:r>
+      <w:proofErr w:type="spellStart"/>
+      <w:r>
+        <w:rPr>
+          <w:u w:val="single"/>
+        </w:rPr>
+        <w:t>bisa</w:t>
+      </w:r>
+      <w:proofErr w:type="spellEnd"/>
+      <w:r>
+        <w:rPr>
+          <w:u w:val="single"/>
+        </w:rPr>
+        <w:t xml:space="preserve"> </w:t>
+      </w:r>
+      <w:proofErr w:type="spellStart"/>
+      <w:r>
+        <w:rPr>
+          <w:u w:val="single"/>
+        </w:rPr>
+        <w:t>menangkap</w:t>
+      </w:r>
+      <w:proofErr w:type="spellEnd"/>
+      <w:r>
+        <w:rPr>
+          <w:u w:val="single"/>
+        </w:rPr>
+        <w:t xml:space="preserve"> </w:t>
+      </w:r>
+      <w:proofErr w:type="spellStart"/>
+      <w:r>
+        <w:rPr>
+          <w:u w:val="single"/>
+        </w:rPr>
+        <w:t>banyak</w:t>
+      </w:r>
+      <w:proofErr w:type="spellEnd"/>
+      <w:r>
+        <w:rPr>
+          <w:u w:val="single"/>
+        </w:rPr>
+        <w:t xml:space="preserve"> </w:t>
+      </w:r>
+      <w:proofErr w:type="spellStart"/>
+      <w:r>
+        <w:rPr>
+          <w:u w:val="single"/>
+        </w:rPr>
+        <w:t>segmen</w:t>
+      </w:r>
+      <w:proofErr w:type="spellEnd"/>
+      <w:r>
+        <w:rPr>
+          <w:u w:val="single"/>
+        </w:rPr>
+        <w:t xml:space="preserve"> </w:t>
+      </w:r>
+      <w:proofErr w:type="spellStart"/>
+      <w:r>
+        <w:rPr>
+          <w:u w:val="single"/>
+        </w:rPr>
+        <w:t>sekaligus</w:t>
+      </w:r>
+      <w:proofErr w:type="spellEnd"/>
+      <w:r>
+        <w:rPr>
+          <w:u w:val="single"/>
+        </w:rPr>
+        <w:t xml:space="preserve"> (</w:t>
+      </w:r>
+      <w:proofErr w:type="spellStart"/>
+      <w:r>
+        <w:rPr>
+          <w:u w:val="single"/>
+        </w:rPr>
+        <w:t>misal</w:t>
+      </w:r>
+      <w:proofErr w:type="spellEnd"/>
+      <w:r>
+        <w:rPr>
+          <w:u w:val="single"/>
+        </w:rPr>
+        <w:t>: /baju/</w:t>
+      </w:r>
+      <w:proofErr w:type="spellStart"/>
+      <w:r>
+        <w:rPr>
+          <w:u w:val="single"/>
+        </w:rPr>
+        <w:t>pria</w:t>
+      </w:r>
+      <w:proofErr w:type="spellEnd"/>
+      <w:r>
+        <w:rPr>
+          <w:u w:val="single"/>
+        </w:rPr>
+        <w:t>/</w:t>
+      </w:r>
+      <w:proofErr w:type="spellStart"/>
+      <w:r>
+        <w:rPr>
+          <w:u w:val="single"/>
+        </w:rPr>
+        <w:t>ukuran</w:t>
+      </w:r>
+      <w:proofErr w:type="spellEnd"/>
+      <w:r>
+        <w:rPr>
+          <w:u w:val="single"/>
+        </w:rPr>
+        <w:t>-l).</w:t>
+      </w:r>
+    </w:p>
+    <w:p>
+      <w:r>
+        <w:t xml:space="preserve">2. </w:t>
+      </w:r>
+      <w:proofErr w:type="spellStart"/>
+      <w:r>
+        <w:t>Mengapa</w:t>
+      </w:r>
+      <w:proofErr w:type="spellEnd"/>
+      <w:r>
+        <w:t xml:space="preserve"> slug </w:t>
+      </w:r>
+      <w:proofErr w:type="spellStart"/>
+      <w:r>
+        <w:t>berbentuk</w:t>
+      </w:r>
+      <w:proofErr w:type="spellEnd"/>
+      <w:r>
+        <w:t xml:space="preserve"> array?</w:t>
+      </w:r>
+    </w:p>
+    <w:p>
+      <w:pPr>
+        <w:rPr>
+          <w:u w:val="single"/>
+        </w:rPr>
+      </w:pPr>
+      <w:r>
+        <w:rPr>
+          <w:u w:val="single"/>
+        </w:rPr>
+        <w:t>K</w:t>
+      </w:r>
+      <w:r>
+        <w:rPr>
+          <w:u w:val="single"/>
+        </w:rPr>
+        <w:t xml:space="preserve">arena </w:t>
+      </w:r>
+      <w:proofErr w:type="spellStart"/>
+      <w:r>
+        <w:rPr>
+          <w:u w:val="single"/>
+        </w:rPr>
+        <w:t>menyimpan</w:t>
+      </w:r>
+      <w:proofErr w:type="spellEnd"/>
+      <w:r>
+        <w:rPr>
+          <w:u w:val="single"/>
+        </w:rPr>
+        <w:t xml:space="preserve"> </w:t>
+      </w:r>
+      <w:proofErr w:type="spellStart"/>
+      <w:r>
+        <w:rPr>
+          <w:u w:val="single"/>
+        </w:rPr>
+        <w:t>setiap</w:t>
+      </w:r>
+      <w:proofErr w:type="spellEnd"/>
+      <w:r>
+        <w:rPr>
+          <w:u w:val="single"/>
+        </w:rPr>
+        <w:t xml:space="preserve"> </w:t>
+      </w:r>
+      <w:proofErr w:type="spellStart"/>
+      <w:r>
+        <w:rPr>
+          <w:u w:val="single"/>
+        </w:rPr>
+        <w:t>bagian</w:t>
+      </w:r>
+      <w:proofErr w:type="spellEnd"/>
+      <w:r>
+        <w:rPr>
+          <w:u w:val="single"/>
+        </w:rPr>
+        <w:t xml:space="preserve"> </w:t>
+      </w:r>
+      <w:proofErr w:type="spellStart"/>
+      <w:r>
+        <w:rPr>
+          <w:u w:val="single"/>
+        </w:rPr>
+        <w:t>dari</w:t>
+      </w:r>
+      <w:proofErr w:type="spellEnd"/>
+      <w:r>
+        <w:rPr>
+          <w:u w:val="single"/>
+        </w:rPr>
+        <w:t xml:space="preserve"> </w:t>
+      </w:r>
+      <w:proofErr w:type="spellStart"/>
+      <w:r>
+        <w:rPr>
+          <w:u w:val="single"/>
+        </w:rPr>
+        <w:t>jalur</w:t>
+      </w:r>
+      <w:proofErr w:type="spellEnd"/>
+      <w:r>
+        <w:rPr>
+          <w:u w:val="single"/>
+        </w:rPr>
+        <w:t xml:space="preserve"> URL yang </w:t>
+      </w:r>
+      <w:proofErr w:type="spellStart"/>
+      <w:r>
+        <w:rPr>
+          <w:u w:val="single"/>
+        </w:rPr>
+        <w:t>ditangkap</w:t>
+      </w:r>
+      <w:proofErr w:type="spellEnd"/>
+      <w:r>
+        <w:rPr>
+          <w:u w:val="single"/>
+        </w:rPr>
+        <w:t xml:space="preserve"> </w:t>
+      </w:r>
+      <w:proofErr w:type="spellStart"/>
+      <w:r>
+        <w:rPr>
+          <w:u w:val="single"/>
+        </w:rPr>
+        <w:t>sebagai</w:t>
+      </w:r>
+      <w:proofErr w:type="spellEnd"/>
+      <w:r>
+        <w:rPr>
+          <w:u w:val="single"/>
+        </w:rPr>
+        <w:t xml:space="preserve"> </w:t>
+      </w:r>
+      <w:proofErr w:type="spellStart"/>
+      <w:r>
+        <w:rPr>
+          <w:u w:val="single"/>
+        </w:rPr>
+        <w:t>elemen-elemen</w:t>
+      </w:r>
+      <w:proofErr w:type="spellEnd"/>
+      <w:r>
+        <w:rPr>
+          <w:u w:val="single"/>
+        </w:rPr>
+        <w:t xml:space="preserve"> </w:t>
+      </w:r>
+      <w:proofErr w:type="spellStart"/>
+      <w:r>
+        <w:rPr>
+          <w:u w:val="single"/>
+        </w:rPr>
+        <w:t>terpisah</w:t>
+      </w:r>
+      <w:proofErr w:type="spellEnd"/>
+      <w:r>
+        <w:rPr>
+          <w:u w:val="single"/>
+        </w:rPr>
+        <w:t xml:space="preserve"> agar </w:t>
+      </w:r>
+      <w:proofErr w:type="spellStart"/>
+      <w:r>
+        <w:rPr>
+          <w:u w:val="single"/>
+        </w:rPr>
+        <w:t>mudah</w:t>
+      </w:r>
+      <w:proofErr w:type="spellEnd"/>
+      <w:r>
+        <w:rPr>
+          <w:u w:val="single"/>
+        </w:rPr>
+        <w:t xml:space="preserve"> </w:t>
+      </w:r>
+      <w:proofErr w:type="spellStart"/>
+      <w:r>
+        <w:rPr>
+          <w:u w:val="single"/>
+        </w:rPr>
+        <w:t>diakses</w:t>
+      </w:r>
+      <w:proofErr w:type="spellEnd"/>
+      <w:r>
+        <w:rPr>
+          <w:u w:val="single"/>
+        </w:rPr>
+        <w:t xml:space="preserve"> </w:t>
+      </w:r>
+      <w:proofErr w:type="spellStart"/>
+      <w:r>
+        <w:rPr>
+          <w:u w:val="single"/>
+        </w:rPr>
+        <w:t>satu</w:t>
+      </w:r>
+      <w:proofErr w:type="spellEnd"/>
+      <w:r>
+        <w:rPr>
+          <w:u w:val="single"/>
+        </w:rPr>
+        <w:t xml:space="preserve"> per </w:t>
+      </w:r>
+      <w:proofErr w:type="spellStart"/>
+      <w:r>
+        <w:rPr>
+          <w:u w:val="single"/>
+        </w:rPr>
+        <w:t>satu</w:t>
+      </w:r>
+      <w:proofErr w:type="spellEnd"/>
+      <w:r>
+        <w:rPr>
+          <w:u w:val="single"/>
+        </w:rPr>
+        <w:t>.</w:t>
+      </w:r>
+    </w:p>
+    <w:p>
+      <w:pPr>
+        <w:rPr>
+          <w:lang w:val="fi-FI"/>
+        </w:rPr>
+      </w:pPr>
+      <w:r>
+        <w:rPr>
+          <w:lang w:val="fi-FI"/>
+        </w:rPr>
+        <w:t xml:space="preserve">3. Kapan </w:t>
+      </w:r>
+      <w:proofErr w:type="spellStart"/>
+      <w:r>
+        <w:rPr>
+          <w:lang w:val="fi-FI"/>
+        </w:rPr>
+        <w:t>sebaiknya</w:t>
+      </w:r>
+      <w:proofErr w:type="spellEnd"/>
+      <w:r>
+        <w:rPr>
+          <w:lang w:val="fi-FI"/>
+        </w:rPr>
+        <w:t xml:space="preserve"> </w:t>
+      </w:r>
+      <w:proofErr w:type="spellStart"/>
+      <w:r>
+        <w:rPr>
+          <w:lang w:val="fi-FI"/>
+        </w:rPr>
+        <w:t>menggunakan</w:t>
+      </w:r>
+      <w:proofErr w:type="spellEnd"/>
+      <w:r>
+        <w:rPr>
+          <w:lang w:val="fi-FI"/>
+        </w:rPr>
+        <w:t xml:space="preserve"> </w:t>
+      </w:r>
+      <w:proofErr w:type="spellStart"/>
+      <w:r>
+        <w:rPr>
+          <w:lang w:val="fi-FI"/>
+        </w:rPr>
+        <w:t>Link</w:t>
+      </w:r>
+      <w:proofErr w:type="spellEnd"/>
+      <w:r>
+        <w:rPr>
+          <w:lang w:val="fi-FI"/>
+        </w:rPr>
+        <w:t xml:space="preserve"> </w:t>
+      </w:r>
+      <w:proofErr w:type="spellStart"/>
+      <w:r>
+        <w:rPr>
+          <w:lang w:val="fi-FI"/>
+        </w:rPr>
+        <w:t>dan</w:t>
+      </w:r>
+      <w:proofErr w:type="spellEnd"/>
+      <w:r>
+        <w:rPr>
+          <w:lang w:val="fi-FI"/>
+        </w:rPr>
+        <w:t xml:space="preserve"> </w:t>
+      </w:r>
+      <w:proofErr w:type="spellStart"/>
+      <w:r>
+        <w:rPr>
+          <w:lang w:val="fi-FI"/>
+        </w:rPr>
+        <w:t>router.push</w:t>
+      </w:r>
+      <w:proofErr w:type="spellEnd"/>
+      <w:r>
+        <w:rPr>
+          <w:lang w:val="fi-FI"/>
+        </w:rPr>
+        <w:t>()?</w:t>
+      </w:r>
+    </w:p>
+    <w:p>
+      <w:pPr>
+        <w:rPr>
+          <w:u w:val="single"/>
+          <w:lang w:val="fi-FI"/>
+        </w:rPr>
+      </w:pPr>
+      <w:proofErr w:type="spellStart"/>
+      <w:r>
+        <w:rPr>
+          <w:u w:val="single"/>
+          <w:lang w:val="fi-FI"/>
+        </w:rPr>
+        <w:t>Link</w:t>
+      </w:r>
+      <w:proofErr w:type="spellEnd"/>
+      <w:r>
+        <w:rPr>
+          <w:u w:val="single"/>
+          <w:lang w:val="fi-FI"/>
+        </w:rPr>
+        <w:t xml:space="preserve"> </w:t>
+      </w:r>
+      <w:proofErr w:type="spellStart"/>
+      <w:r>
+        <w:rPr>
+          <w:u w:val="single"/>
+          <w:lang w:val="fi-FI"/>
+        </w:rPr>
+        <w:t>untuk</w:t>
+      </w:r>
+      <w:proofErr w:type="spellEnd"/>
+      <w:r>
+        <w:rPr>
+          <w:u w:val="single"/>
+          <w:lang w:val="fi-FI"/>
+        </w:rPr>
+        <w:t xml:space="preserve"> </w:t>
+      </w:r>
+      <w:proofErr w:type="spellStart"/>
+      <w:r>
+        <w:rPr>
+          <w:u w:val="single"/>
+          <w:lang w:val="fi-FI"/>
+        </w:rPr>
+        <w:t>navigasi</w:t>
+      </w:r>
+      <w:proofErr w:type="spellEnd"/>
+      <w:r>
+        <w:rPr>
+          <w:u w:val="single"/>
+          <w:lang w:val="fi-FI"/>
+        </w:rPr>
+        <w:t xml:space="preserve"> </w:t>
+      </w:r>
+      <w:proofErr w:type="spellStart"/>
+      <w:r>
+        <w:rPr>
+          <w:u w:val="single"/>
+          <w:lang w:val="fi-FI"/>
+        </w:rPr>
+        <w:t>antar</w:t>
+      </w:r>
+      <w:proofErr w:type="spellEnd"/>
+      <w:r>
+        <w:rPr>
+          <w:u w:val="single"/>
+          <w:lang w:val="fi-FI"/>
+        </w:rPr>
+        <w:t xml:space="preserve"> </w:t>
+      </w:r>
+      <w:proofErr w:type="spellStart"/>
+      <w:r>
+        <w:rPr>
+          <w:u w:val="single"/>
+          <w:lang w:val="fi-FI"/>
+        </w:rPr>
+        <w:t>halaman</w:t>
+      </w:r>
+      <w:proofErr w:type="spellEnd"/>
+      <w:r>
+        <w:rPr>
+          <w:u w:val="single"/>
+          <w:lang w:val="fi-FI"/>
+        </w:rPr>
+        <w:t xml:space="preserve"> </w:t>
+      </w:r>
+      <w:proofErr w:type="spellStart"/>
+      <w:r>
+        <w:rPr>
+          <w:u w:val="single"/>
+          <w:lang w:val="fi-FI"/>
+        </w:rPr>
+        <w:t>yang</w:t>
+      </w:r>
+      <w:proofErr w:type="spellEnd"/>
+      <w:r>
+        <w:rPr>
+          <w:u w:val="single"/>
+          <w:lang w:val="fi-FI"/>
+        </w:rPr>
+        <w:t xml:space="preserve"> </w:t>
+      </w:r>
+      <w:proofErr w:type="spellStart"/>
+      <w:r>
+        <w:rPr>
+          <w:u w:val="single"/>
+          <w:lang w:val="fi-FI"/>
+        </w:rPr>
+        <w:t>standar</w:t>
+      </w:r>
+      <w:proofErr w:type="spellEnd"/>
+      <w:r>
+        <w:rPr>
+          <w:u w:val="single"/>
+          <w:lang w:val="fi-FI"/>
+        </w:rPr>
+        <w:t xml:space="preserve"> (</w:t>
+      </w:r>
+      <w:proofErr w:type="spellStart"/>
+      <w:r>
+        <w:rPr>
+          <w:u w:val="single"/>
+          <w:lang w:val="fi-FI"/>
+        </w:rPr>
+        <w:t>seperti</w:t>
+      </w:r>
+      <w:proofErr w:type="spellEnd"/>
+      <w:r>
+        <w:rPr>
+          <w:u w:val="single"/>
+          <w:lang w:val="fi-FI"/>
+        </w:rPr>
+        <w:t xml:space="preserve"> menu/</w:t>
+      </w:r>
+      <w:proofErr w:type="spellStart"/>
+      <w:r>
+        <w:rPr>
+          <w:u w:val="single"/>
+          <w:lang w:val="fi-FI"/>
+        </w:rPr>
+        <w:t>navbar</w:t>
+      </w:r>
+      <w:proofErr w:type="spellEnd"/>
+      <w:r>
+        <w:rPr>
+          <w:u w:val="single"/>
+          <w:lang w:val="fi-FI"/>
+        </w:rPr>
+        <w:t xml:space="preserve">), </w:t>
+      </w:r>
+      <w:proofErr w:type="spellStart"/>
+      <w:r>
+        <w:rPr>
+          <w:u w:val="single"/>
+          <w:lang w:val="fi-FI"/>
+        </w:rPr>
+        <w:t>dan</w:t>
+      </w:r>
+      <w:proofErr w:type="spellEnd"/>
+      <w:r>
+        <w:rPr>
+          <w:u w:val="single"/>
+          <w:lang w:val="fi-FI"/>
+        </w:rPr>
+        <w:t xml:space="preserve"> </w:t>
+      </w:r>
+      <w:proofErr w:type="spellStart"/>
+      <w:r>
+        <w:rPr>
+          <w:u w:val="single"/>
+          <w:lang w:val="fi-FI"/>
+        </w:rPr>
+        <w:t>router.push</w:t>
+      </w:r>
+      <w:proofErr w:type="spellEnd"/>
+      <w:r>
+        <w:rPr>
+          <w:u w:val="single"/>
+          <w:lang w:val="fi-FI"/>
+        </w:rPr>
+        <w:t xml:space="preserve">() </w:t>
+      </w:r>
+      <w:proofErr w:type="spellStart"/>
+      <w:r>
+        <w:rPr>
+          <w:u w:val="single"/>
+          <w:lang w:val="fi-FI"/>
+        </w:rPr>
+        <w:t>untuk</w:t>
+      </w:r>
+      <w:proofErr w:type="spellEnd"/>
+      <w:r>
+        <w:rPr>
+          <w:u w:val="single"/>
+          <w:lang w:val="fi-FI"/>
+        </w:rPr>
+        <w:t xml:space="preserve"> </w:t>
+      </w:r>
+      <w:proofErr w:type="spellStart"/>
+      <w:r>
+        <w:rPr>
+          <w:u w:val="single"/>
+          <w:lang w:val="fi-FI"/>
+        </w:rPr>
+        <w:t>navigasi</w:t>
+      </w:r>
+      <w:proofErr w:type="spellEnd"/>
+      <w:r>
+        <w:rPr>
+          <w:u w:val="single"/>
+          <w:lang w:val="fi-FI"/>
+        </w:rPr>
+        <w:t xml:space="preserve"> </w:t>
+      </w:r>
+      <w:proofErr w:type="spellStart"/>
+      <w:r>
+        <w:rPr>
+          <w:u w:val="single"/>
+          <w:lang w:val="fi-FI"/>
+        </w:rPr>
+        <w:t>yang</w:t>
+      </w:r>
+      <w:proofErr w:type="spellEnd"/>
+      <w:r>
+        <w:rPr>
+          <w:u w:val="single"/>
+          <w:lang w:val="fi-FI"/>
+        </w:rPr>
+        <w:t xml:space="preserve"> </w:t>
+      </w:r>
+      <w:proofErr w:type="spellStart"/>
+      <w:r>
+        <w:rPr>
+          <w:u w:val="single"/>
+          <w:lang w:val="fi-FI"/>
+        </w:rPr>
+        <w:t>dipicu</w:t>
+      </w:r>
+      <w:proofErr w:type="spellEnd"/>
+      <w:r>
+        <w:rPr>
+          <w:u w:val="single"/>
+          <w:lang w:val="fi-FI"/>
+        </w:rPr>
+        <w:t xml:space="preserve"> </w:t>
+      </w:r>
+      <w:proofErr w:type="spellStart"/>
+      <w:r>
+        <w:rPr>
+          <w:u w:val="single"/>
+          <w:lang w:val="fi-FI"/>
+        </w:rPr>
+        <w:t>oleh</w:t>
+      </w:r>
+      <w:proofErr w:type="spellEnd"/>
+      <w:r>
+        <w:rPr>
+          <w:u w:val="single"/>
+          <w:lang w:val="fi-FI"/>
+        </w:rPr>
+        <w:t xml:space="preserve"> </w:t>
+      </w:r>
+      <w:proofErr w:type="spellStart"/>
+      <w:r>
+        <w:rPr>
+          <w:u w:val="single"/>
+          <w:lang w:val="fi-FI"/>
+        </w:rPr>
+        <w:t>aksi</w:t>
+      </w:r>
+      <w:proofErr w:type="spellEnd"/>
+      <w:r>
+        <w:rPr>
+          <w:u w:val="single"/>
+          <w:lang w:val="fi-FI"/>
+        </w:rPr>
+        <w:t xml:space="preserve"> </w:t>
+      </w:r>
+      <w:proofErr w:type="spellStart"/>
+      <w:r>
+        <w:rPr>
+          <w:u w:val="single"/>
+          <w:lang w:val="fi-FI"/>
+        </w:rPr>
+        <w:t>tertentu</w:t>
+      </w:r>
+      <w:proofErr w:type="spellEnd"/>
+      <w:r>
+        <w:rPr>
+          <w:u w:val="single"/>
+          <w:lang w:val="fi-FI"/>
+        </w:rPr>
+        <w:t xml:space="preserve"> </w:t>
+      </w:r>
+      <w:proofErr w:type="spellStart"/>
+      <w:r>
+        <w:rPr>
+          <w:u w:val="single"/>
+          <w:lang w:val="fi-FI"/>
+        </w:rPr>
+        <w:t>atau</w:t>
+      </w:r>
+      <w:proofErr w:type="spellEnd"/>
+      <w:r>
+        <w:rPr>
+          <w:u w:val="single"/>
+          <w:lang w:val="fi-FI"/>
+        </w:rPr>
+        <w:t xml:space="preserve"> </w:t>
+      </w:r>
+      <w:proofErr w:type="spellStart"/>
+      <w:r>
+        <w:rPr>
+          <w:u w:val="single"/>
+          <w:lang w:val="fi-FI"/>
+        </w:rPr>
+        <w:t>fungsi</w:t>
+      </w:r>
+      <w:proofErr w:type="spellEnd"/>
+      <w:r>
+        <w:rPr>
+          <w:u w:val="single"/>
+          <w:lang w:val="fi-FI"/>
+        </w:rPr>
+        <w:t xml:space="preserve"> (</w:t>
+      </w:r>
+      <w:proofErr w:type="spellStart"/>
+      <w:r>
+        <w:rPr>
+          <w:u w:val="single"/>
+          <w:lang w:val="fi-FI"/>
+        </w:rPr>
+        <w:t>seperti</w:t>
+      </w:r>
+      <w:proofErr w:type="spellEnd"/>
+      <w:r>
+        <w:rPr>
+          <w:u w:val="single"/>
+          <w:lang w:val="fi-FI"/>
+        </w:rPr>
+        <w:t xml:space="preserve"> </w:t>
+      </w:r>
+      <w:proofErr w:type="spellStart"/>
+      <w:r>
+        <w:rPr>
+          <w:u w:val="single"/>
+          <w:lang w:val="fi-FI"/>
+        </w:rPr>
+        <w:t>setelah</w:t>
+      </w:r>
+      <w:proofErr w:type="spellEnd"/>
+      <w:r>
+        <w:rPr>
+          <w:u w:val="single"/>
+          <w:lang w:val="fi-FI"/>
+        </w:rPr>
+        <w:t xml:space="preserve"> </w:t>
+      </w:r>
+      <w:proofErr w:type="spellStart"/>
+      <w:r>
+        <w:rPr>
+          <w:u w:val="single"/>
+          <w:lang w:val="fi-FI"/>
+        </w:rPr>
+        <w:t>menekan</w:t>
+      </w:r>
+      <w:proofErr w:type="spellEnd"/>
+      <w:r>
+        <w:rPr>
+          <w:u w:val="single"/>
+          <w:lang w:val="fi-FI"/>
+        </w:rPr>
+        <w:t xml:space="preserve"> </w:t>
+      </w:r>
+      <w:proofErr w:type="spellStart"/>
+      <w:r>
+        <w:rPr>
+          <w:u w:val="single"/>
+          <w:lang w:val="fi-FI"/>
+        </w:rPr>
+        <w:t>tombol</w:t>
+      </w:r>
+      <w:proofErr w:type="spellEnd"/>
+      <w:r>
+        <w:rPr>
+          <w:u w:val="single"/>
+          <w:lang w:val="fi-FI"/>
+        </w:rPr>
+        <w:t xml:space="preserve"> </w:t>
+      </w:r>
+      <w:proofErr w:type="spellStart"/>
+      <w:r>
+        <w:rPr>
+          <w:u w:val="single"/>
+          <w:lang w:val="fi-FI"/>
+        </w:rPr>
+        <w:t>login</w:t>
+      </w:r>
+      <w:proofErr w:type="spellEnd"/>
+      <w:r>
+        <w:rPr>
+          <w:u w:val="single"/>
+          <w:lang w:val="fi-FI"/>
+        </w:rPr>
+        <w:t>).</w:t>
+      </w:r>
+    </w:p>
+    <w:p>
+      <w:r>
+        <w:t xml:space="preserve">4. </w:t>
+      </w:r>
+      <w:proofErr w:type="spellStart"/>
+      <w:r>
+        <w:t>Mengapa</w:t>
+      </w:r>
+      <w:proofErr w:type="spellEnd"/>
+      <w:r>
+        <w:t xml:space="preserve"> </w:t>
+      </w:r>
+      <w:proofErr w:type="spellStart"/>
+      <w:r>
+        <w:t>navigasi</w:t>
+      </w:r>
+      <w:proofErr w:type="spellEnd"/>
+      <w:r>
+        <w:t xml:space="preserve"> Next.js </w:t>
+      </w:r>
+      <w:proofErr w:type="spellStart"/>
+      <w:r>
+        <w:t>tidak</w:t>
+      </w:r>
+      <w:proofErr w:type="spellEnd"/>
+      <w:r>
+        <w:t xml:space="preserve"> me-refresh </w:t>
+      </w:r>
+      <w:proofErr w:type="spellStart"/>
+      <w:r>
+        <w:t>halaman</w:t>
+      </w:r>
+      <w:proofErr w:type="spellEnd"/>
+      <w:r>
+        <w:t>?</w:t>
+      </w:r>
+    </w:p>
+    <w:p>
+      <w:pPr>
+        <w:rPr>
+          <w:u w:val="single"/>
+        </w:rPr>
+      </w:pPr>
+      <w:r>
+        <w:rPr>
+          <w:u w:val="single"/>
+        </w:rPr>
+        <w:t>K</w:t>
+      </w:r>
+      <w:r>
+        <w:rPr>
+          <w:u w:val="single"/>
+        </w:rPr>
+        <w:t xml:space="preserve">arena </w:t>
+      </w:r>
+      <w:proofErr w:type="spellStart"/>
+      <w:r>
+        <w:rPr>
+          <w:u w:val="single"/>
+        </w:rPr>
+        <w:t>ia</w:t>
+      </w:r>
+      <w:proofErr w:type="spellEnd"/>
+      <w:r>
+        <w:rPr>
+          <w:u w:val="single"/>
+        </w:rPr>
+        <w:t xml:space="preserve"> </w:t>
+      </w:r>
+      <w:proofErr w:type="spellStart"/>
+      <w:r>
+        <w:rPr>
+          <w:u w:val="single"/>
+        </w:rPr>
+        <w:t>menggunakan</w:t>
+      </w:r>
+      <w:proofErr w:type="spellEnd"/>
+      <w:r>
+        <w:rPr>
+          <w:u w:val="single"/>
+        </w:rPr>
+        <w:t xml:space="preserve"> </w:t>
+      </w:r>
+      <w:proofErr w:type="spellStart"/>
+      <w:r>
+        <w:rPr>
+          <w:u w:val="single"/>
+        </w:rPr>
+        <w:t>konsep</w:t>
+      </w:r>
+      <w:proofErr w:type="spellEnd"/>
+      <w:r>
+        <w:rPr>
+          <w:u w:val="single"/>
+        </w:rPr>
+        <w:t xml:space="preserve"> Client-side Navigation yang </w:t>
+      </w:r>
+      <w:proofErr w:type="spellStart"/>
+      <w:r>
+        <w:rPr>
+          <w:u w:val="single"/>
+        </w:rPr>
+        <w:t>hanya</w:t>
+      </w:r>
+      <w:proofErr w:type="spellEnd"/>
+      <w:r>
+        <w:rPr>
+          <w:u w:val="single"/>
+        </w:rPr>
+        <w:t xml:space="preserve"> </w:t>
+      </w:r>
+      <w:proofErr w:type="spellStart"/>
+      <w:r>
+        <w:rPr>
+          <w:u w:val="single"/>
+        </w:rPr>
+        <w:t>memperbarui</w:t>
+      </w:r>
+      <w:proofErr w:type="spellEnd"/>
+      <w:r>
+        <w:rPr>
+          <w:u w:val="single"/>
+        </w:rPr>
+        <w:t xml:space="preserve"> </w:t>
+      </w:r>
+      <w:proofErr w:type="spellStart"/>
+      <w:r>
+        <w:rPr>
+          <w:u w:val="single"/>
+        </w:rPr>
+        <w:t>konten</w:t>
+      </w:r>
+      <w:proofErr w:type="spellEnd"/>
+      <w:r>
+        <w:rPr>
+          <w:u w:val="single"/>
+        </w:rPr>
+        <w:t xml:space="preserve"> yang </w:t>
+      </w:r>
+      <w:proofErr w:type="spellStart"/>
+      <w:r>
+        <w:rPr>
+          <w:u w:val="single"/>
+        </w:rPr>
+        <w:t>berubah</w:t>
+      </w:r>
+      <w:proofErr w:type="spellEnd"/>
+      <w:r>
+        <w:rPr>
+          <w:u w:val="single"/>
+        </w:rPr>
+        <w:t xml:space="preserve"> </w:t>
+      </w:r>
+      <w:proofErr w:type="spellStart"/>
+      <w:r>
+        <w:rPr>
+          <w:u w:val="single"/>
+        </w:rPr>
+        <w:t>tanpa</w:t>
+      </w:r>
+      <w:proofErr w:type="spellEnd"/>
+      <w:r>
+        <w:rPr>
+          <w:u w:val="single"/>
+        </w:rPr>
+        <w:t xml:space="preserve"> </w:t>
+      </w:r>
+      <w:proofErr w:type="spellStart"/>
+      <w:r>
+        <w:rPr>
+          <w:u w:val="single"/>
+        </w:rPr>
+        <w:t>mengunduh</w:t>
+      </w:r>
+      <w:proofErr w:type="spellEnd"/>
+      <w:r>
+        <w:rPr>
+          <w:u w:val="single"/>
+        </w:rPr>
+        <w:t xml:space="preserve"> </w:t>
+      </w:r>
+      <w:proofErr w:type="spellStart"/>
+      <w:r>
+        <w:rPr>
+          <w:u w:val="single"/>
+        </w:rPr>
+        <w:t>ulang</w:t>
+      </w:r>
+      <w:proofErr w:type="spellEnd"/>
+      <w:r>
+        <w:rPr>
+          <w:u w:val="single"/>
+        </w:rPr>
+        <w:t xml:space="preserve"> </w:t>
+      </w:r>
+      <w:proofErr w:type="spellStart"/>
+      <w:r>
+        <w:rPr>
+          <w:u w:val="single"/>
+        </w:rPr>
+        <w:t>seluruh</w:t>
+      </w:r>
+      <w:proofErr w:type="spellEnd"/>
+      <w:r>
+        <w:rPr>
+          <w:u w:val="single"/>
+        </w:rPr>
+        <w:t xml:space="preserve"> </w:t>
+      </w:r>
+      <w:proofErr w:type="spellStart"/>
+      <w:r>
+        <w:rPr>
+          <w:u w:val="single"/>
+        </w:rPr>
+        <w:t>aset</w:t>
+      </w:r>
+      <w:proofErr w:type="spellEnd"/>
+      <w:r>
+        <w:rPr>
+          <w:u w:val="single"/>
+        </w:rPr>
+        <w:t xml:space="preserve"> </w:t>
+      </w:r>
+      <w:proofErr w:type="spellStart"/>
+      <w:r>
+        <w:rPr>
+          <w:u w:val="single"/>
+        </w:rPr>
+        <w:t>halaman</w:t>
+      </w:r>
+      <w:proofErr w:type="spellEnd"/>
+      <w:r>
+        <w:rPr>
+          <w:u w:val="single"/>
+        </w:rPr>
+        <w:t xml:space="preserve"> </w:t>
+      </w:r>
+      <w:proofErr w:type="spellStart"/>
+      <w:r>
+        <w:rPr>
+          <w:u w:val="single"/>
+        </w:rPr>
+        <w:t>dari</w:t>
+      </w:r>
+      <w:proofErr w:type="spellEnd"/>
+      <w:r>
+        <w:rPr>
+          <w:u w:val="single"/>
+        </w:rPr>
+        <w:t xml:space="preserve"> </w:t>
+      </w:r>
+      <w:proofErr w:type="spellStart"/>
+      <w:r>
+        <w:rPr>
+          <w:u w:val="single"/>
+        </w:rPr>
+        <w:t>awal</w:t>
+      </w:r>
+      <w:proofErr w:type="spellEnd"/>
+      <w:r>
+        <w:rPr>
+          <w:u w:val="single"/>
+        </w:rPr>
+        <w:t>.</w:t>
       </w:r>
     </w:p>
     <w:p>
@@ -129,13 +3911,38 @@
           <w:bCs/>
         </w:rPr>
       </w:pPr>
+      <w:proofErr w:type="spellStart"/>
       <w:r>
         <w:rPr>
           <w:b/>
           <w:bCs/>
         </w:rPr>
         <w:lastRenderedPageBreak/>
-        <w:t xml:space="preserve">Laporan Jobsheet </w:t>
+        <w:t>Laporan</w:t>
+      </w:r>
+      <w:proofErr w:type="spellEnd"/>
+      <w:r>
+        <w:rPr>
+          <w:b/>
+          <w:bCs/>
+        </w:rPr>
+        <w:t xml:space="preserve"> </w:t>
+      </w:r>
+      <w:proofErr w:type="spellStart"/>
+      <w:r>
+        <w:rPr>
+          <w:b/>
+          <w:bCs/>
+        </w:rPr>
+        <w:t>Jobsheet</w:t>
+      </w:r>
+      <w:proofErr w:type="spellEnd"/>
+      <w:r>
+        <w:rPr>
+          <w:b/>
+          <w:bCs/>
+        </w:rPr>
+        <w:t xml:space="preserve"> </w:t>
       </w:r>
       <w:r>
         <w:rPr>
@@ -144,6 +3951,7 @@
         </w:rPr>
         <w:t xml:space="preserve">2: </w:t>
       </w:r>
+      <w:proofErr w:type="spellStart"/>
       <w:r>
         <w:rPr>
           <w:b/>
@@ -151,6 +3959,7 @@
         </w:rPr>
         <w:t>PageDanLayout</w:t>
       </w:r>
+      <w:proofErr w:type="spellEnd"/>
       <w:r>
         <w:rPr>
           <w:b/>
@@ -250,7 +4059,7 @@
                     <pic:cNvPicPr/>
                   </pic:nvPicPr>
                   <pic:blipFill>
-                    <a:blip r:embed="rId7"/>
+                    <a:blip r:embed="rId36"/>
                     <a:stretch>
                       <a:fillRect/>
                     </a:stretch>
@@ -307,7 +4116,7 @@
                     <pic:cNvPicPr/>
                   </pic:nvPicPr>
                   <pic:blipFill>
-                    <a:blip r:embed="rId8"/>
+                    <a:blip r:embed="rId37"/>
                     <a:stretch>
                       <a:fillRect/>
                     </a:stretch>
@@ -351,7 +4160,7 @@
                     <pic:cNvPicPr/>
                   </pic:nvPicPr>
                   <pic:blipFill>
-                    <a:blip r:embed="rId7"/>
+                    <a:blip r:embed="rId36"/>
                     <a:stretch>
                       <a:fillRect/>
                     </a:stretch>
@@ -416,7 +4225,7 @@
                     <pic:cNvPicPr/>
                   </pic:nvPicPr>
                   <pic:blipFill>
-                    <a:blip r:embed="rId9"/>
+                    <a:blip r:embed="rId38"/>
                     <a:stretch>
                       <a:fillRect/>
                     </a:stretch>
@@ -466,7 +4275,7 @@
                     <pic:cNvPicPr/>
                   </pic:nvPicPr>
                   <pic:blipFill>
-                    <a:blip r:embed="rId10"/>
+                    <a:blip r:embed="rId39"/>
                     <a:stretch>
                       <a:fillRect/>
                     </a:stretch>
@@ -531,7 +4340,7 @@
                     <pic:cNvPicPr/>
                   </pic:nvPicPr>
                   <pic:blipFill>
-                    <a:blip r:embed="rId11"/>
+                    <a:blip r:embed="rId40"/>
                     <a:stretch>
                       <a:fillRect/>
                     </a:stretch>
@@ -597,7 +4406,7 @@
                     <pic:cNvPicPr/>
                   </pic:nvPicPr>
                   <pic:blipFill>
-                    <a:blip r:embed="rId12"/>
+                    <a:blip r:embed="rId41"/>
                     <a:stretch>
                       <a:fillRect/>
                     </a:stretch>
@@ -677,7 +4486,7 @@
                     <pic:cNvPicPr/>
                   </pic:nvPicPr>
                   <pic:blipFill>
-                    <a:blip r:embed="rId13"/>
+                    <a:blip r:embed="rId42"/>
                     <a:stretch>
                       <a:fillRect/>
                     </a:stretch>
@@ -727,7 +4536,7 @@
                     <pic:cNvPicPr/>
                   </pic:nvPicPr>
                   <pic:blipFill>
-                    <a:blip r:embed="rId14"/>
+                    <a:blip r:embed="rId43"/>
                     <a:stretch>
                       <a:fillRect/>
                     </a:stretch>
@@ -792,7 +4601,7 @@
                     <pic:cNvPicPr/>
                   </pic:nvPicPr>
                   <pic:blipFill>
-                    <a:blip r:embed="rId15"/>
+                    <a:blip r:embed="rId44"/>
                     <a:stretch>
                       <a:fillRect/>
                     </a:stretch>
@@ -842,7 +4651,7 @@
                     <pic:cNvPicPr/>
                   </pic:nvPicPr>
                   <pic:blipFill>
-                    <a:blip r:embed="rId16"/>
+                    <a:blip r:embed="rId45"/>
                     <a:stretch>
                       <a:fillRect/>
                     </a:stretch>
@@ -892,7 +4701,7 @@
                     <pic:cNvPicPr/>
                   </pic:nvPicPr>
                   <pic:blipFill>
-                    <a:blip r:embed="rId17"/>
+                    <a:blip r:embed="rId46"/>
                     <a:stretch>
                       <a:fillRect/>
                     </a:stretch>
@@ -958,7 +4767,7 @@
                     <pic:cNvPicPr/>
                   </pic:nvPicPr>
                   <pic:blipFill>
-                    <a:blip r:embed="rId18"/>
+                    <a:blip r:embed="rId47"/>
                     <a:stretch>
                       <a:fillRect/>
                     </a:stretch>
@@ -1023,7 +4832,7 @@
                     <pic:cNvPicPr/>
                   </pic:nvPicPr>
                   <pic:blipFill>
-                    <a:blip r:embed="rId19"/>
+                    <a:blip r:embed="rId48"/>
                     <a:stretch>
                       <a:fillRect/>
                     </a:stretch>
@@ -1065,7 +4874,7 @@
                     <pic:cNvPicPr/>
                   </pic:nvPicPr>
                   <pic:blipFill>
-                    <a:blip r:embed="rId20"/>
+                    <a:blip r:embed="rId49"/>
                     <a:stretch>
                       <a:fillRect/>
                     </a:stretch>
@@ -1115,7 +4924,7 @@
                     <pic:cNvPicPr/>
                   </pic:nvPicPr>
                   <pic:blipFill>
-                    <a:blip r:embed="rId21"/>
+                    <a:blip r:embed="rId50"/>
                     <a:stretch>
                       <a:fillRect/>
                     </a:stretch>
@@ -1157,7 +4966,7 @@
                     <pic:cNvPicPr/>
                   </pic:nvPicPr>
                   <pic:blipFill>
-                    <a:blip r:embed="rId22"/>
+                    <a:blip r:embed="rId51"/>
                     <a:stretch>
                       <a:fillRect/>
                     </a:stretch>
@@ -1222,7 +5031,7 @@
                     <pic:cNvPicPr/>
                   </pic:nvPicPr>
                   <pic:blipFill>
-                    <a:blip r:embed="rId23"/>
+                    <a:blip r:embed="rId52"/>
                     <a:stretch>
                       <a:fillRect/>
                     </a:stretch>
@@ -1264,7 +5073,7 @@
                     <pic:cNvPicPr/>
                   </pic:nvPicPr>
                   <pic:blipFill>
-                    <a:blip r:embed="rId24"/>
+                    <a:blip r:embed="rId53"/>
                     <a:stretch>
                       <a:fillRect/>
                     </a:stretch>
@@ -1357,7 +5166,7 @@
                     <pic:cNvPicPr/>
                   </pic:nvPicPr>
                   <pic:blipFill>
-                    <a:blip r:embed="rId25"/>
+                    <a:blip r:embed="rId54"/>
                     <a:stretch>
                       <a:fillRect/>
                     </a:stretch>
@@ -1397,7 +5206,7 @@
                     <pic:cNvPicPr/>
                   </pic:nvPicPr>
                   <pic:blipFill>
-                    <a:blip r:embed="rId26"/>
+                    <a:blip r:embed="rId55"/>
                     <a:stretch>
                       <a:fillRect/>
                     </a:stretch>
@@ -1491,7 +5300,7 @@
                     <pic:cNvPicPr/>
                   </pic:nvPicPr>
                   <pic:blipFill>
-                    <a:blip r:embed="rId27"/>
+                    <a:blip r:embed="rId56"/>
                     <a:stretch>
                       <a:fillRect/>
                     </a:stretch>
@@ -1558,7 +5367,7 @@
                     <pic:cNvPicPr/>
                   </pic:nvPicPr>
                   <pic:blipFill>
-                    <a:blip r:embed="rId28"/>
+                    <a:blip r:embed="rId57"/>
                     <a:stretch>
                       <a:fillRect/>
                     </a:stretch>
@@ -1601,7 +5410,7 @@
                     <pic:cNvPicPr/>
                   </pic:nvPicPr>
                   <pic:blipFill>
-                    <a:blip r:embed="rId29"/>
+                    <a:blip r:embed="rId58"/>
                     <a:stretch>
                       <a:fillRect/>
                     </a:stretch>
@@ -1641,7 +5450,7 @@
                     <pic:cNvPicPr/>
                   </pic:nvPicPr>
                   <pic:blipFill>
-                    <a:blip r:embed="rId30"/>
+                    <a:blip r:embed="rId59"/>
                     <a:stretch>
                       <a:fillRect/>
                     </a:stretch>
@@ -1683,7 +5492,7 @@
                     <pic:cNvPicPr/>
                   </pic:nvPicPr>
                   <pic:blipFill>
-                    <a:blip r:embed="rId31"/>
+                    <a:blip r:embed="rId60"/>
                     <a:stretch>
                       <a:fillRect/>
                     </a:stretch>
@@ -1723,7 +5532,7 @@
                     <pic:cNvPicPr/>
                   </pic:nvPicPr>
                   <pic:blipFill>
-                    <a:blip r:embed="rId32"/>
+                    <a:blip r:embed="rId61"/>
                     <a:stretch>
                       <a:fillRect/>
                     </a:stretch>

</xml_diff>

<commit_message>
Tugas 3: Terapkan tailwindcss
</commit_message>
<xml_diff>
--- a/Laporan/03_Ahmad Dzul Fadhli Jobsheet 4,5&6.docx
+++ b/Laporan/03_Ahmad Dzul Fadhli Jobsheet 4,5&6.docx
@@ -9,19 +9,44 @@
           <w:bCs/>
         </w:rPr>
       </w:pPr>
-      <w:r>
-        <w:rPr>
-          <w:b/>
-          <w:bCs/>
-        </w:rPr>
-        <w:t xml:space="preserve">Laporan Jobsheet </w:t>
-      </w:r>
-      <w:r>
-        <w:rPr>
-          <w:b/>
-          <w:bCs/>
-        </w:rPr>
-        <w:t>3</w:t>
+      <w:proofErr w:type="spellStart"/>
+      <w:r>
+        <w:rPr>
+          <w:b/>
+          <w:bCs/>
+        </w:rPr>
+        <w:t>Laporan</w:t>
+      </w:r>
+      <w:proofErr w:type="spellEnd"/>
+      <w:r>
+        <w:rPr>
+          <w:b/>
+          <w:bCs/>
+        </w:rPr>
+        <w:t xml:space="preserve"> </w:t>
+      </w:r>
+      <w:proofErr w:type="spellStart"/>
+      <w:r>
+        <w:rPr>
+          <w:b/>
+          <w:bCs/>
+        </w:rPr>
+        <w:t>Jobsheet</w:t>
+      </w:r>
+      <w:proofErr w:type="spellEnd"/>
+      <w:r>
+        <w:rPr>
+          <w:b/>
+          <w:bCs/>
+        </w:rPr>
+        <w:t xml:space="preserve"> </w:t>
+      </w:r>
+      <w:r>
+        <w:rPr>
+          <w:b/>
+          <w:bCs/>
+        </w:rPr>
+        <w:t>4</w:t>
       </w:r>
       <w:r>
         <w:rPr>
@@ -30,6 +55,7 @@
         </w:rPr>
         <w:t xml:space="preserve">: </w:t>
       </w:r>
+      <w:proofErr w:type="spellStart"/>
       <w:r>
         <w:rPr>
           <w:b/>
@@ -37,26 +63,45 @@
         </w:rPr>
         <w:t>LinkNavigation</w:t>
       </w:r>
-      <w:r>
-        <w:rPr>
-          <w:b/>
-          <w:bCs/>
-        </w:rPr>
-        <w:t xml:space="preserve"> </w:t>
-      </w:r>
-      <w:r>
-        <w:rPr>
-          <w:b/>
-          <w:bCs/>
-        </w:rPr>
-        <w:t xml:space="preserve">Matkul </w:t>
-      </w:r>
-      <w:r>
-        <w:rPr>
-          <w:b/>
-          <w:bCs/>
-        </w:rPr>
-        <w:t xml:space="preserve">Pemograman Berbasis Network </w:t>
+      <w:proofErr w:type="spellEnd"/>
+      <w:r>
+        <w:rPr>
+          <w:b/>
+          <w:bCs/>
+        </w:rPr>
+        <w:t xml:space="preserve"> </w:t>
+      </w:r>
+      <w:proofErr w:type="spellStart"/>
+      <w:r>
+        <w:rPr>
+          <w:b/>
+          <w:bCs/>
+        </w:rPr>
+        <w:t>Matkul</w:t>
+      </w:r>
+      <w:proofErr w:type="spellEnd"/>
+      <w:r>
+        <w:rPr>
+          <w:b/>
+          <w:bCs/>
+        </w:rPr>
+        <w:t xml:space="preserve"> </w:t>
+      </w:r>
+      <w:proofErr w:type="spellStart"/>
+      <w:r>
+        <w:rPr>
+          <w:b/>
+          <w:bCs/>
+        </w:rPr>
+        <w:t>Pemograman</w:t>
+      </w:r>
+      <w:proofErr w:type="spellEnd"/>
+      <w:r>
+        <w:rPr>
+          <w:b/>
+          <w:bCs/>
+        </w:rPr>
+        <w:t xml:space="preserve"> Berbasis Network </w:t>
       </w:r>
     </w:p>
     <w:p>
@@ -3949,37 +3994,67 @@
           <w:b/>
           <w:bCs/>
         </w:rPr>
-        <w:t xml:space="preserve">2: </w:t>
-      </w:r>
-      <w:proofErr w:type="spellStart"/>
-      <w:r>
-        <w:rPr>
-          <w:b/>
-          <w:bCs/>
-        </w:rPr>
-        <w:t>PageDanLayout</w:t>
-      </w:r>
-      <w:proofErr w:type="spellEnd"/>
-      <w:r>
-        <w:rPr>
-          <w:b/>
-          <w:bCs/>
-        </w:rPr>
-        <w:t xml:space="preserve"> </w:t>
-      </w:r>
-      <w:r>
-        <w:rPr>
-          <w:b/>
-          <w:bCs/>
-        </w:rPr>
-        <w:t xml:space="preserve">Matkul </w:t>
-      </w:r>
-      <w:r>
-        <w:rPr>
-          <w:b/>
-          <w:bCs/>
-        </w:rPr>
-        <w:t xml:space="preserve">Pemograman Berbasis Network </w:t>
+        <w:t>5</w:t>
+      </w:r>
+      <w:r>
+        <w:rPr>
+          <w:b/>
+          <w:bCs/>
+        </w:rPr>
+        <w:t xml:space="preserve">: </w:t>
+      </w:r>
+      <w:r>
+        <w:rPr>
+          <w:b/>
+          <w:bCs/>
+        </w:rPr>
+        <w:t>Styling</w:t>
+      </w:r>
+      <w:r>
+        <w:rPr>
+          <w:b/>
+          <w:bCs/>
+        </w:rPr>
+        <w:t xml:space="preserve"> </w:t>
+      </w:r>
+      <w:proofErr w:type="spellStart"/>
+      <w:r>
+        <w:rPr>
+          <w:b/>
+          <w:bCs/>
+        </w:rPr>
+        <w:t>Matkul</w:t>
+      </w:r>
+      <w:proofErr w:type="spellEnd"/>
+      <w:r>
+        <w:rPr>
+          <w:b/>
+          <w:bCs/>
+        </w:rPr>
+        <w:t xml:space="preserve"> </w:t>
+      </w:r>
+      <w:r>
+        <w:rPr>
+          <w:b/>
+          <w:bCs/>
+        </w:rPr>
+        <w:t xml:space="preserve">Pemograman </w:t>
+      </w:r>
+      <w:proofErr w:type="spellStart"/>
+      <w:r>
+        <w:rPr>
+          <w:b/>
+          <w:bCs/>
+        </w:rPr>
+        <w:t>Berbasis</w:t>
+      </w:r>
+      <w:proofErr w:type="spellEnd"/>
+      <w:r>
+        <w:rPr>
+          <w:b/>
+          <w:bCs/>
+        </w:rPr>
+        <w:t xml:space="preserve"> Network </w:t>
       </w:r>
     </w:p>
     <w:p>
@@ -4027,27 +4102,21 @@
           <w:b/>
           <w:bCs/>
         </w:rPr>
-        <w:t>1. Routing Dasar (Static Routing)</w:t>
+        <w:t>1. Global CSS</w:t>
       </w:r>
     </w:p>
     <w:p>
       <w:pPr>
         <w:rPr>
-          <w:b/>
-          <w:bCs/>
+          <w:u w:val="single"/>
         </w:rPr>
       </w:pPr>
       <w:r>
-        <w:rPr>
-          <w:b/>
-          <w:bCs/>
-          <w:noProof/>
-        </w:rPr>
         <w:drawing>
-          <wp:inline distT="0" distB="0" distL="0" distR="0" wp14:anchorId="6F53BC51" wp14:editId="2E09C2A2">
-            <wp:extent cx="2880000" cy="1005538"/>
-            <wp:effectExtent l="0" t="0" r="0" b="4445"/>
-            <wp:docPr id="13034889" name="Picture 1"/>
+          <wp:inline distT="0" distB="0" distL="0" distR="0" wp14:anchorId="6A637A18" wp14:editId="69D5A7AF">
+            <wp:extent cx="4320000" cy="6052016"/>
+            <wp:effectExtent l="0" t="0" r="4445" b="6350"/>
+            <wp:docPr id="1153503918" name="Picture 1"/>
             <wp:cNvGraphicFramePr>
               <a:graphicFrameLocks xmlns:a="http://schemas.openxmlformats.org/drawingml/2006/main" noChangeAspect="1"/>
             </wp:cNvGraphicFramePr>
@@ -4055,7 +4124,7 @@
               <a:graphicData uri="http://schemas.openxmlformats.org/drawingml/2006/picture">
                 <pic:pic xmlns:pic="http://schemas.openxmlformats.org/drawingml/2006/picture">
                   <pic:nvPicPr>
-                    <pic:cNvPr id="13034889" name=""/>
+                    <pic:cNvPr id="1153503918" name=""/>
                     <pic:cNvPicPr/>
                   </pic:nvPicPr>
                   <pic:blipFill>
@@ -4067,7 +4136,7 @@
                   <pic:spPr>
                     <a:xfrm>
                       <a:off x="0" y="0"/>
-                      <a:ext cx="2880000" cy="1005538"/>
+                      <a:ext cx="4320000" cy="6052016"/>
                     </a:xfrm>
                     <a:prstGeom prst="rect">
                       <a:avLst/>
@@ -4081,30 +4150,18 @@
       </w:r>
     </w:p>
     <w:p>
-      <w:pPr>
-        <w:rPr>
-          <w:b/>
-          <w:bCs/>
-        </w:rPr>
-      </w:pPr>
-      <w:r>
-        <w:rPr>
-          <w:b/>
-          <w:bCs/>
-        </w:rPr>
-        <w:t>2. Routing Menggunakan Folder</w:t>
-      </w:r>
-    </w:p>
-    <w:p>
-      <w:r>
-        <w:rPr>
-          <w:noProof/>
-        </w:rPr>
+      <w:r>
+        <w:t>Import Global CSS</w:t>
+      </w:r>
+    </w:p>
+    <w:p>
+      <w:r>
+        <w:lastRenderedPageBreak/>
         <w:drawing>
-          <wp:inline distT="0" distB="0" distL="0" distR="0" wp14:anchorId="0722FA99" wp14:editId="11365757">
-            <wp:extent cx="1080000" cy="447567"/>
-            <wp:effectExtent l="0" t="0" r="6350" b="0"/>
-            <wp:docPr id="438908125" name="Picture 1"/>
+          <wp:inline distT="0" distB="0" distL="0" distR="0" wp14:anchorId="40335BC2" wp14:editId="092D09EA">
+            <wp:extent cx="4320000" cy="994615"/>
+            <wp:effectExtent l="0" t="0" r="4445" b="0"/>
+            <wp:docPr id="520306261" name="Picture 1"/>
             <wp:cNvGraphicFramePr>
               <a:graphicFrameLocks xmlns:a="http://schemas.openxmlformats.org/drawingml/2006/main" noChangeAspect="1"/>
             </wp:cNvGraphicFramePr>
@@ -4112,7 +4169,7 @@
               <a:graphicData uri="http://schemas.openxmlformats.org/drawingml/2006/picture">
                 <pic:pic xmlns:pic="http://schemas.openxmlformats.org/drawingml/2006/picture">
                   <pic:nvPicPr>
-                    <pic:cNvPr id="438908125" name=""/>
+                    <pic:cNvPr id="520306261" name=""/>
                     <pic:cNvPicPr/>
                   </pic:nvPicPr>
                   <pic:blipFill>
@@ -4124,7 +4181,7 @@
                   <pic:spPr>
                     <a:xfrm>
                       <a:off x="0" y="0"/>
-                      <a:ext cx="1080000" cy="447567"/>
+                      <a:ext cx="4320000" cy="994615"/>
                     </a:xfrm>
                     <a:prstGeom prst="rect">
                       <a:avLst/>
@@ -4138,17 +4195,37 @@
       </w:r>
     </w:p>
     <w:p>
-      <w:r>
-        <w:rPr>
-          <w:b/>
-          <w:bCs/>
-          <w:noProof/>
-        </w:rPr>
+      <w:pPr>
+        <w:rPr>
+          <w:b/>
+          <w:bCs/>
+        </w:rPr>
+      </w:pPr>
+      <w:r>
+        <w:rPr>
+          <w:b/>
+          <w:bCs/>
+        </w:rPr>
+        <w:t>2. CSS Module (Local Scope)</w:t>
+      </w:r>
+    </w:p>
+    <w:p>
+      <w:proofErr w:type="spellStart"/>
+      <w:r>
+        <w:t>Modifikasi</w:t>
+      </w:r>
+      <w:proofErr w:type="spellEnd"/>
+      <w:r>
+        <w:t xml:space="preserve"> </w:t>
+      </w:r>
+    </w:p>
+    <w:p>
+      <w:r>
         <w:drawing>
-          <wp:inline distT="0" distB="0" distL="0" distR="0" wp14:anchorId="34326EF9" wp14:editId="0DD80387">
-            <wp:extent cx="2880000" cy="1005538"/>
-            <wp:effectExtent l="0" t="0" r="0" b="4445"/>
-            <wp:docPr id="1383692261" name="Picture 1"/>
+          <wp:inline distT="0" distB="0" distL="0" distR="0" wp14:anchorId="35583E72" wp14:editId="1F987C2E">
+            <wp:extent cx="4320000" cy="2634923"/>
+            <wp:effectExtent l="0" t="0" r="4445" b="0"/>
+            <wp:docPr id="441451964" name="Picture 1"/>
             <wp:cNvGraphicFramePr>
               <a:graphicFrameLocks xmlns:a="http://schemas.openxmlformats.org/drawingml/2006/main" noChangeAspect="1"/>
             </wp:cNvGraphicFramePr>
@@ -4156,72 +4233,7 @@
               <a:graphicData uri="http://schemas.openxmlformats.org/drawingml/2006/picture">
                 <pic:pic xmlns:pic="http://schemas.openxmlformats.org/drawingml/2006/picture">
                   <pic:nvPicPr>
-                    <pic:cNvPr id="13034889" name=""/>
-                    <pic:cNvPicPr/>
-                  </pic:nvPicPr>
-                  <pic:blipFill>
-                    <a:blip r:embed="rId36"/>
-                    <a:stretch>
-                      <a:fillRect/>
-                    </a:stretch>
-                  </pic:blipFill>
-                  <pic:spPr>
-                    <a:xfrm>
-                      <a:off x="0" y="0"/>
-                      <a:ext cx="2880000" cy="1005538"/>
-                    </a:xfrm>
-                    <a:prstGeom prst="rect">
-                      <a:avLst/>
-                    </a:prstGeom>
-                  </pic:spPr>
-                </pic:pic>
-              </a:graphicData>
-            </a:graphic>
-          </wp:inline>
-        </w:drawing>
-      </w:r>
-    </w:p>
-    <w:p>
-      <w:pPr>
-        <w:rPr>
-          <w:b/>
-          <w:bCs/>
-        </w:rPr>
-      </w:pPr>
-      <w:r>
-        <w:rPr>
-          <w:b/>
-          <w:bCs/>
-        </w:rPr>
-        <w:t>3. Nested Routing</w:t>
-      </w:r>
-    </w:p>
-    <w:p>
-      <w:pPr>
-        <w:rPr>
-          <w:b/>
-          <w:bCs/>
-        </w:rPr>
-      </w:pPr>
-      <w:r>
-        <w:rPr>
-          <w:b/>
-          <w:bCs/>
-          <w:noProof/>
-        </w:rPr>
-        <w:drawing>
-          <wp:inline distT="0" distB="0" distL="0" distR="0" wp14:anchorId="3A0B7A8C" wp14:editId="0C3038EF">
-            <wp:extent cx="2880000" cy="969231"/>
-            <wp:effectExtent l="0" t="0" r="0" b="2540"/>
-            <wp:docPr id="919240044" name="Picture 1"/>
-            <wp:cNvGraphicFramePr>
-              <a:graphicFrameLocks xmlns:a="http://schemas.openxmlformats.org/drawingml/2006/main" noChangeAspect="1"/>
-            </wp:cNvGraphicFramePr>
-            <a:graphic xmlns:a="http://schemas.openxmlformats.org/drawingml/2006/main">
-              <a:graphicData uri="http://schemas.openxmlformats.org/drawingml/2006/picture">
-                <pic:pic xmlns:pic="http://schemas.openxmlformats.org/drawingml/2006/picture">
-                  <pic:nvPicPr>
-                    <pic:cNvPr id="919240044" name=""/>
+                    <pic:cNvPr id="441451964" name=""/>
                     <pic:cNvPicPr/>
                   </pic:nvPicPr>
                   <pic:blipFill>
@@ -4233,7 +4245,7 @@
                   <pic:spPr>
                     <a:xfrm>
                       <a:off x="0" y="0"/>
-                      <a:ext cx="2880000" cy="969231"/>
+                      <a:ext cx="4320000" cy="2634923"/>
                     </a:xfrm>
                     <a:prstGeom prst="rect">
                       <a:avLst/>
@@ -4247,23 +4259,19 @@
       </w:r>
     </w:p>
     <w:p>
-      <w:pPr>
-        <w:rPr>
-          <w:b/>
-          <w:bCs/>
-        </w:rPr>
-      </w:pPr>
-      <w:r>
-        <w:rPr>
-          <w:b/>
-          <w:bCs/>
-          <w:noProof/>
-        </w:rPr>
+      <w:proofErr w:type="spellStart"/>
+      <w:r>
+        <w:t>Modifikasi</w:t>
+      </w:r>
+      <w:proofErr w:type="spellEnd"/>
+    </w:p>
+    <w:p>
+      <w:r>
         <w:drawing>
-          <wp:inline distT="0" distB="0" distL="0" distR="0" wp14:anchorId="5A52E60E" wp14:editId="657B8DF3">
-            <wp:extent cx="2880000" cy="750154"/>
-            <wp:effectExtent l="0" t="0" r="0" b="0"/>
-            <wp:docPr id="1956549094" name="Picture 1"/>
+          <wp:inline distT="0" distB="0" distL="0" distR="0" wp14:anchorId="5CE57CA4" wp14:editId="2157B10A">
+            <wp:extent cx="4320000" cy="2996308"/>
+            <wp:effectExtent l="0" t="0" r="4445" b="0"/>
+            <wp:docPr id="981303163" name="Picture 1"/>
             <wp:cNvGraphicFramePr>
               <a:graphicFrameLocks xmlns:a="http://schemas.openxmlformats.org/drawingml/2006/main" noChangeAspect="1"/>
             </wp:cNvGraphicFramePr>
@@ -4271,7 +4279,7 @@
               <a:graphicData uri="http://schemas.openxmlformats.org/drawingml/2006/picture">
                 <pic:pic xmlns:pic="http://schemas.openxmlformats.org/drawingml/2006/picture">
                   <pic:nvPicPr>
-                    <pic:cNvPr id="1956549094" name=""/>
+                    <pic:cNvPr id="981303163" name=""/>
                     <pic:cNvPicPr/>
                   </pic:nvPicPr>
                   <pic:blipFill>
@@ -4283,7 +4291,7 @@
                   <pic:spPr>
                     <a:xfrm>
                       <a:off x="0" y="0"/>
-                      <a:ext cx="2880000" cy="750154"/>
+                      <a:ext cx="4320000" cy="2996308"/>
                     </a:xfrm>
                     <a:prstGeom prst="rect">
                       <a:avLst/>
@@ -4297,38 +4305,18 @@
       </w:r>
     </w:p>
     <w:p>
-      <w:pPr>
-        <w:rPr>
-          <w:b/>
-          <w:bCs/>
-        </w:rPr>
-      </w:pPr>
-      <w:r>
-        <w:rPr>
-          <w:b/>
-          <w:bCs/>
-        </w:rPr>
-        <w:t>Modifikasi</w:t>
-      </w:r>
-    </w:p>
-    <w:p>
-      <w:pPr>
-        <w:rPr>
-          <w:b/>
-          <w:bCs/>
-        </w:rPr>
-      </w:pPr>
-      <w:r>
-        <w:rPr>
-          <w:b/>
-          <w:bCs/>
-          <w:noProof/>
-        </w:rPr>
+      <w:r>
+        <w:t>Output</w:t>
+      </w:r>
+    </w:p>
+    <w:p>
+      <w:r>
+        <w:lastRenderedPageBreak/>
         <w:drawing>
-          <wp:inline distT="0" distB="0" distL="0" distR="0" wp14:anchorId="7BC40B69" wp14:editId="1E6D5458">
-            <wp:extent cx="1080000" cy="736822"/>
-            <wp:effectExtent l="0" t="0" r="6350" b="6350"/>
-            <wp:docPr id="545931243" name="Picture 1"/>
+          <wp:inline distT="0" distB="0" distL="0" distR="0" wp14:anchorId="48233218" wp14:editId="622CC449">
+            <wp:extent cx="4320000" cy="2326615"/>
+            <wp:effectExtent l="0" t="0" r="4445" b="0"/>
+            <wp:docPr id="876918527" name="Picture 1"/>
             <wp:cNvGraphicFramePr>
               <a:graphicFrameLocks xmlns:a="http://schemas.openxmlformats.org/drawingml/2006/main" noChangeAspect="1"/>
             </wp:cNvGraphicFramePr>
@@ -4336,7 +4324,7 @@
               <a:graphicData uri="http://schemas.openxmlformats.org/drawingml/2006/picture">
                 <pic:pic xmlns:pic="http://schemas.openxmlformats.org/drawingml/2006/picture">
                   <pic:nvPicPr>
-                    <pic:cNvPr id="545931243" name=""/>
+                    <pic:cNvPr id="876918527" name=""/>
                     <pic:cNvPicPr/>
                   </pic:nvPicPr>
                   <pic:blipFill>
@@ -4348,7 +4336,7 @@
                   <pic:spPr>
                     <a:xfrm>
                       <a:off x="0" y="0"/>
-                      <a:ext cx="1080000" cy="736822"/>
+                      <a:ext cx="4320000" cy="2326615"/>
                     </a:xfrm>
                     <a:prstGeom prst="rect">
                       <a:avLst/>
@@ -4373,28 +4361,39 @@
           <w:b/>
           <w:bCs/>
         </w:rPr>
-        <w:t>Nested Lebih Dalam</w:t>
-      </w:r>
-    </w:p>
-    <w:p>
-      <w:pPr>
-        <w:rPr>
-          <w:b/>
-          <w:bCs/>
-        </w:rPr>
-      </w:pPr>
-      <w:r>
-        <w:rPr>
-          <w:b/>
-          <w:bCs/>
-          <w:noProof/>
-        </w:rPr>
-        <w:lastRenderedPageBreak/>
+        <w:t xml:space="preserve">3. Styling </w:t>
+      </w:r>
+      <w:proofErr w:type="spellStart"/>
+      <w:r>
+        <w:rPr>
+          <w:b/>
+          <w:bCs/>
+        </w:rPr>
+        <w:t>untuk</w:t>
+      </w:r>
+      <w:proofErr w:type="spellEnd"/>
+      <w:r>
+        <w:rPr>
+          <w:b/>
+          <w:bCs/>
+        </w:rPr>
+        <w:t xml:space="preserve"> Pages (CSS Module)</w:t>
+      </w:r>
+    </w:p>
+    <w:p>
+      <w:proofErr w:type="spellStart"/>
+      <w:r>
+        <w:t>Modifikasi</w:t>
+      </w:r>
+      <w:proofErr w:type="spellEnd"/>
+    </w:p>
+    <w:p>
+      <w:r>
         <w:drawing>
-          <wp:inline distT="0" distB="0" distL="0" distR="0" wp14:anchorId="046D5512" wp14:editId="5BC17C83">
-            <wp:extent cx="2880000" cy="733539"/>
-            <wp:effectExtent l="0" t="0" r="0" b="9525"/>
-            <wp:docPr id="1367703807" name="Picture 1"/>
+          <wp:inline distT="0" distB="0" distL="0" distR="0" wp14:anchorId="41037793" wp14:editId="07041393">
+            <wp:extent cx="4320000" cy="1969846"/>
+            <wp:effectExtent l="0" t="0" r="4445" b="0"/>
+            <wp:docPr id="497841648" name="Picture 1"/>
             <wp:cNvGraphicFramePr>
               <a:graphicFrameLocks xmlns:a="http://schemas.openxmlformats.org/drawingml/2006/main" noChangeAspect="1"/>
             </wp:cNvGraphicFramePr>
@@ -4402,7 +4401,7 @@
               <a:graphicData uri="http://schemas.openxmlformats.org/drawingml/2006/picture">
                 <pic:pic xmlns:pic="http://schemas.openxmlformats.org/drawingml/2006/picture">
                   <pic:nvPicPr>
-                    <pic:cNvPr id="1367703807" name=""/>
+                    <pic:cNvPr id="497841648" name=""/>
                     <pic:cNvPicPr/>
                   </pic:nvPicPr>
                   <pic:blipFill>
@@ -4414,7 +4413,7 @@
                   <pic:spPr>
                     <a:xfrm>
                       <a:off x="0" y="0"/>
-                      <a:ext cx="2880000" cy="733539"/>
+                      <a:ext cx="4320000" cy="1969846"/>
                     </a:xfrm>
                     <a:prstGeom prst="rect">
                       <a:avLst/>
@@ -4428,53 +4427,19 @@
       </w:r>
     </w:p>
     <w:p>
-      <w:pPr>
-        <w:rPr>
-          <w:b/>
-          <w:bCs/>
-        </w:rPr>
-      </w:pPr>
-      <w:r>
-        <w:rPr>
-          <w:b/>
-          <w:bCs/>
-        </w:rPr>
-        <w:t>4. Dynamic Routing</w:t>
-      </w:r>
-    </w:p>
-    <w:p>
-      <w:pPr>
-        <w:rPr>
-          <w:b/>
-          <w:bCs/>
-        </w:rPr>
-      </w:pPr>
-      <w:r>
-        <w:rPr>
-          <w:b/>
-          <w:bCs/>
-        </w:rPr>
-        <w:t>Console Log</w:t>
-      </w:r>
-    </w:p>
-    <w:p>
-      <w:pPr>
-        <w:rPr>
-          <w:b/>
-          <w:bCs/>
-        </w:rPr>
-      </w:pPr>
-      <w:r>
-        <w:rPr>
-          <w:b/>
-          <w:bCs/>
-          <w:noProof/>
-        </w:rPr>
+      <w:proofErr w:type="spellStart"/>
+      <w:r>
+        <w:t>Modifikasi</w:t>
+      </w:r>
+      <w:proofErr w:type="spellEnd"/>
+    </w:p>
+    <w:p>
+      <w:r>
         <w:drawing>
-          <wp:inline distT="0" distB="0" distL="0" distR="0" wp14:anchorId="03028033" wp14:editId="754969FE">
-            <wp:extent cx="2880000" cy="1041538"/>
-            <wp:effectExtent l="0" t="0" r="0" b="6350"/>
-            <wp:docPr id="70233803" name="Picture 1"/>
+          <wp:inline distT="0" distB="0" distL="0" distR="0" wp14:anchorId="47235005" wp14:editId="6B2836DC">
+            <wp:extent cx="4320000" cy="2494615"/>
+            <wp:effectExtent l="0" t="0" r="4445" b="1270"/>
+            <wp:docPr id="1826245611" name="Picture 1"/>
             <wp:cNvGraphicFramePr>
               <a:graphicFrameLocks xmlns:a="http://schemas.openxmlformats.org/drawingml/2006/main" noChangeAspect="1"/>
             </wp:cNvGraphicFramePr>
@@ -4482,7 +4447,7 @@
               <a:graphicData uri="http://schemas.openxmlformats.org/drawingml/2006/picture">
                 <pic:pic xmlns:pic="http://schemas.openxmlformats.org/drawingml/2006/picture">
                   <pic:nvPicPr>
-                    <pic:cNvPr id="70233803" name=""/>
+                    <pic:cNvPr id="1826245611" name=""/>
                     <pic:cNvPicPr/>
                   </pic:nvPicPr>
                   <pic:blipFill>
@@ -4494,7 +4459,7 @@
                   <pic:spPr>
                     <a:xfrm>
                       <a:off x="0" y="0"/>
-                      <a:ext cx="2880000" cy="1041538"/>
+                      <a:ext cx="4320000" cy="2494615"/>
                     </a:xfrm>
                     <a:prstGeom prst="rect">
                       <a:avLst/>
@@ -4508,23 +4473,18 @@
       </w:r>
     </w:p>
     <w:p>
-      <w:pPr>
-        <w:rPr>
-          <w:b/>
-          <w:bCs/>
-        </w:rPr>
-      </w:pPr>
-      <w:r>
-        <w:rPr>
-          <w:b/>
-          <w:bCs/>
-          <w:noProof/>
-        </w:rPr>
+      <w:r>
+        <w:lastRenderedPageBreak/>
+        <w:t>Output</w:t>
+      </w:r>
+    </w:p>
+    <w:p>
+      <w:r>
         <w:drawing>
-          <wp:inline distT="0" distB="0" distL="0" distR="0" wp14:anchorId="66C427BE" wp14:editId="6F0949FF">
-            <wp:extent cx="2880000" cy="239077"/>
-            <wp:effectExtent l="0" t="0" r="0" b="8890"/>
-            <wp:docPr id="582498175" name="Picture 1"/>
+          <wp:inline distT="0" distB="0" distL="0" distR="0" wp14:anchorId="6069148F" wp14:editId="2E8E9A5D">
+            <wp:extent cx="4320000" cy="2701846"/>
+            <wp:effectExtent l="0" t="0" r="4445" b="3810"/>
+            <wp:docPr id="87933635" name="Picture 1"/>
             <wp:cNvGraphicFramePr>
               <a:graphicFrameLocks xmlns:a="http://schemas.openxmlformats.org/drawingml/2006/main" noChangeAspect="1"/>
             </wp:cNvGraphicFramePr>
@@ -4532,7 +4492,7 @@
               <a:graphicData uri="http://schemas.openxmlformats.org/drawingml/2006/picture">
                 <pic:pic xmlns:pic="http://schemas.openxmlformats.org/drawingml/2006/picture">
                   <pic:nvPicPr>
-                    <pic:cNvPr id="582498175" name=""/>
+                    <pic:cNvPr id="87933635" name=""/>
                     <pic:cNvPicPr/>
                   </pic:nvPicPr>
                   <pic:blipFill>
@@ -4544,7 +4504,7 @@
                   <pic:spPr>
                     <a:xfrm>
                       <a:off x="0" y="0"/>
-                      <a:ext cx="2880000" cy="239077"/>
+                      <a:ext cx="4320000" cy="2701846"/>
                     </a:xfrm>
                     <a:prstGeom prst="rect">
                       <a:avLst/>
@@ -4569,27 +4529,47 @@
           <w:b/>
           <w:bCs/>
         </w:rPr>
-        <w:t>Statis Router</w:t>
-      </w:r>
-    </w:p>
-    <w:p>
-      <w:pPr>
-        <w:rPr>
-          <w:b/>
-          <w:bCs/>
-        </w:rPr>
-      </w:pPr>
-      <w:r>
-        <w:rPr>
-          <w:b/>
-          <w:bCs/>
-          <w:noProof/>
-        </w:rPr>
+        <w:t>4. Conditional Rendering Navbar (</w:t>
+      </w:r>
+      <w:proofErr w:type="spellStart"/>
+      <w:r>
+        <w:rPr>
+          <w:b/>
+          <w:bCs/>
+        </w:rPr>
+        <w:t>Tanpa</w:t>
+      </w:r>
+      <w:proofErr w:type="spellEnd"/>
+      <w:r>
+        <w:rPr>
+          <w:b/>
+          <w:bCs/>
+        </w:rPr>
+        <w:t xml:space="preserve"> Navbar di Login)</w:t>
+      </w:r>
+    </w:p>
+    <w:p>
+      <w:proofErr w:type="spellStart"/>
+      <w:r>
+        <w:t>Modifikasi</w:t>
+      </w:r>
+      <w:proofErr w:type="spellEnd"/>
+      <w:r>
+        <w:t xml:space="preserve"> </w:t>
+      </w:r>
+      <w:proofErr w:type="spellStart"/>
+      <w:r>
+        <w:t>AppShell</w:t>
+      </w:r>
+      <w:proofErr w:type="spellEnd"/>
+    </w:p>
+    <w:p>
+      <w:r>
         <w:drawing>
-          <wp:inline distT="0" distB="0" distL="0" distR="0" wp14:anchorId="2EC82874" wp14:editId="3D9B32E9">
-            <wp:extent cx="2880000" cy="1076000"/>
-            <wp:effectExtent l="0" t="0" r="0" b="0"/>
-            <wp:docPr id="1817793454" name="Picture 1"/>
+          <wp:inline distT="0" distB="0" distL="0" distR="0" wp14:anchorId="67F6BF9D" wp14:editId="193CCDA5">
+            <wp:extent cx="4320000" cy="3701538"/>
+            <wp:effectExtent l="0" t="0" r="4445" b="0"/>
+            <wp:docPr id="802100370" name="Picture 1"/>
             <wp:cNvGraphicFramePr>
               <a:graphicFrameLocks xmlns:a="http://schemas.openxmlformats.org/drawingml/2006/main" noChangeAspect="1"/>
             </wp:cNvGraphicFramePr>
@@ -4597,7 +4577,7 @@
               <a:graphicData uri="http://schemas.openxmlformats.org/drawingml/2006/picture">
                 <pic:pic xmlns:pic="http://schemas.openxmlformats.org/drawingml/2006/picture">
                   <pic:nvPicPr>
-                    <pic:cNvPr id="1817793454" name=""/>
+                    <pic:cNvPr id="802100370" name=""/>
                     <pic:cNvPicPr/>
                   </pic:nvPicPr>
                   <pic:blipFill>
@@ -4609,7 +4589,7 @@
                   <pic:spPr>
                     <a:xfrm>
                       <a:off x="0" y="0"/>
-                      <a:ext cx="2880000" cy="1076000"/>
+                      <a:ext cx="4320000" cy="3701538"/>
                     </a:xfrm>
                     <a:prstGeom prst="rect">
                       <a:avLst/>
@@ -4623,23 +4603,18 @@
       </w:r>
     </w:p>
     <w:p>
-      <w:pPr>
-        <w:rPr>
-          <w:b/>
-          <w:bCs/>
-        </w:rPr>
-      </w:pPr>
-      <w:r>
-        <w:rPr>
-          <w:b/>
-          <w:bCs/>
-          <w:noProof/>
-        </w:rPr>
+      <w:r>
+        <w:t>Output</w:t>
+      </w:r>
+    </w:p>
+    <w:p>
+      <w:r>
+        <w:lastRenderedPageBreak/>
         <w:drawing>
-          <wp:inline distT="0" distB="0" distL="0" distR="0" wp14:anchorId="1045521C" wp14:editId="0A2BE921">
-            <wp:extent cx="2880000" cy="984000"/>
-            <wp:effectExtent l="0" t="0" r="0" b="6985"/>
-            <wp:docPr id="94778052" name="Picture 1"/>
+          <wp:inline distT="0" distB="0" distL="0" distR="0" wp14:anchorId="7AF2BB9C" wp14:editId="7CB446A0">
+            <wp:extent cx="4320000" cy="2791846"/>
+            <wp:effectExtent l="0" t="0" r="4445" b="8890"/>
+            <wp:docPr id="1987699904" name="Picture 1"/>
             <wp:cNvGraphicFramePr>
               <a:graphicFrameLocks xmlns:a="http://schemas.openxmlformats.org/drawingml/2006/main" noChangeAspect="1"/>
             </wp:cNvGraphicFramePr>
@@ -4647,7 +4622,7 @@
               <a:graphicData uri="http://schemas.openxmlformats.org/drawingml/2006/picture">
                 <pic:pic xmlns:pic="http://schemas.openxmlformats.org/drawingml/2006/picture">
                   <pic:nvPicPr>
-                    <pic:cNvPr id="94778052" name=""/>
+                    <pic:cNvPr id="1987699904" name=""/>
                     <pic:cNvPicPr/>
                   </pic:nvPicPr>
                   <pic:blipFill>
@@ -4659,7 +4634,7 @@
                   <pic:spPr>
                     <a:xfrm>
                       <a:off x="0" y="0"/>
-                      <a:ext cx="2880000" cy="984000"/>
+                      <a:ext cx="4320000" cy="2791846"/>
                     </a:xfrm>
                     <a:prstGeom prst="rect">
                       <a:avLst/>
@@ -4673,23 +4648,17 @@
       </w:r>
     </w:p>
     <w:p>
-      <w:pPr>
-        <w:rPr>
-          <w:b/>
-          <w:bCs/>
-        </w:rPr>
-      </w:pPr>
-      <w:r>
-        <w:rPr>
-          <w:b/>
-          <w:bCs/>
-          <w:noProof/>
-        </w:rPr>
+      <w:r>
+        <w:t>Insight</w:t>
+      </w:r>
+    </w:p>
+    <w:p>
+      <w:r>
         <w:drawing>
-          <wp:inline distT="0" distB="0" distL="0" distR="0" wp14:anchorId="5667DE75" wp14:editId="1DF764A2">
-            <wp:extent cx="2880000" cy="971077"/>
-            <wp:effectExtent l="0" t="0" r="0" b="635"/>
-            <wp:docPr id="934733363" name="Picture 1"/>
+          <wp:inline distT="0" distB="0" distL="0" distR="0" wp14:anchorId="222C03DB" wp14:editId="4D2FF95C">
+            <wp:extent cx="4320000" cy="1751538"/>
+            <wp:effectExtent l="0" t="0" r="4445" b="1270"/>
+            <wp:docPr id="1031272938" name="Picture 1"/>
             <wp:cNvGraphicFramePr>
               <a:graphicFrameLocks xmlns:a="http://schemas.openxmlformats.org/drawingml/2006/main" noChangeAspect="1"/>
             </wp:cNvGraphicFramePr>
@@ -4697,7 +4666,7 @@
               <a:graphicData uri="http://schemas.openxmlformats.org/drawingml/2006/picture">
                 <pic:pic xmlns:pic="http://schemas.openxmlformats.org/drawingml/2006/picture">
                   <pic:nvPicPr>
-                    <pic:cNvPr id="934733363" name=""/>
+                    <pic:cNvPr id="1031272938" name=""/>
                     <pic:cNvPicPr/>
                   </pic:nvPicPr>
                   <pic:blipFill>
@@ -4709,7 +4678,7 @@
                   <pic:spPr>
                     <a:xfrm>
                       <a:off x="0" y="0"/>
-                      <a:ext cx="2880000" cy="971077"/>
+                      <a:ext cx="4320000" cy="1751538"/>
                     </a:xfrm>
                     <a:prstGeom prst="rect">
                       <a:avLst/>
@@ -4734,28 +4703,42 @@
           <w:b/>
           <w:bCs/>
         </w:rPr>
-        <w:t>5. Membuat Komponen Navbar</w:t>
-      </w:r>
-    </w:p>
-    <w:p>
-      <w:pPr>
-        <w:rPr>
-          <w:b/>
-          <w:bCs/>
-        </w:rPr>
-      </w:pPr>
-      <w:r>
-        <w:rPr>
-          <w:b/>
-          <w:bCs/>
-          <w:noProof/>
-        </w:rPr>
-        <w:lastRenderedPageBreak/>
+        <w:t xml:space="preserve">5. Refactoring </w:t>
+      </w:r>
+      <w:proofErr w:type="spellStart"/>
+      <w:r>
+        <w:rPr>
+          <w:b/>
+          <w:bCs/>
+        </w:rPr>
+        <w:t>Struktur</w:t>
+      </w:r>
+      <w:proofErr w:type="spellEnd"/>
+      <w:r>
+        <w:rPr>
+          <w:b/>
+          <w:bCs/>
+        </w:rPr>
+        <w:t xml:space="preserve"> Project (Best Practice)</w:t>
+      </w:r>
+    </w:p>
+    <w:p>
+      <w:proofErr w:type="spellStart"/>
+      <w:r>
+        <w:t>Struktur</w:t>
+      </w:r>
+      <w:proofErr w:type="spellEnd"/>
+      <w:r>
+        <w:t xml:space="preserve"> Folder</w:t>
+      </w:r>
+    </w:p>
+    <w:p>
+      <w:r>
         <w:drawing>
-          <wp:inline distT="0" distB="0" distL="0" distR="0" wp14:anchorId="798200CD" wp14:editId="3014175D">
-            <wp:extent cx="2880000" cy="1301231"/>
-            <wp:effectExtent l="0" t="0" r="0" b="0"/>
-            <wp:docPr id="405933831" name="Picture 1"/>
+          <wp:inline distT="0" distB="0" distL="0" distR="0" wp14:anchorId="77226A76" wp14:editId="5C4F6BA4">
+            <wp:extent cx="1440000" cy="2386983"/>
+            <wp:effectExtent l="0" t="0" r="8255" b="0"/>
+            <wp:docPr id="1641842445" name="Picture 1"/>
             <wp:cNvGraphicFramePr>
               <a:graphicFrameLocks xmlns:a="http://schemas.openxmlformats.org/drawingml/2006/main" noChangeAspect="1"/>
             </wp:cNvGraphicFramePr>
@@ -4763,7 +4746,7 @@
               <a:graphicData uri="http://schemas.openxmlformats.org/drawingml/2006/picture">
                 <pic:pic xmlns:pic="http://schemas.openxmlformats.org/drawingml/2006/picture">
                   <pic:nvPicPr>
-                    <pic:cNvPr id="405933831" name=""/>
+                    <pic:cNvPr id="1641842445" name=""/>
                     <pic:cNvPicPr/>
                   </pic:nvPicPr>
                   <pic:blipFill>
@@ -4775,7 +4758,7 @@
                   <pic:spPr>
                     <a:xfrm>
                       <a:off x="0" y="0"/>
-                      <a:ext cx="2880000" cy="1301231"/>
+                      <a:ext cx="1440000" cy="2386983"/>
                     </a:xfrm>
                     <a:prstGeom prst="rect">
                       <a:avLst/>
@@ -4789,38 +4772,20 @@
       </w:r>
     </w:p>
     <w:p>
-      <w:pPr>
-        <w:rPr>
-          <w:b/>
-          <w:bCs/>
-        </w:rPr>
-      </w:pPr>
-      <w:r>
-        <w:rPr>
-          <w:b/>
-          <w:bCs/>
-        </w:rPr>
-        <w:t>Terapkan ke semua page</w:t>
-      </w:r>
-    </w:p>
-    <w:p>
-      <w:pPr>
-        <w:rPr>
-          <w:b/>
-          <w:bCs/>
-        </w:rPr>
-      </w:pPr>
-      <w:r>
-        <w:rPr>
-          <w:b/>
-          <w:bCs/>
-          <w:noProof/>
-        </w:rPr>
+      <w:proofErr w:type="spellStart"/>
+      <w:r>
+        <w:lastRenderedPageBreak/>
+        <w:t>Modifikasi</w:t>
+      </w:r>
+      <w:proofErr w:type="spellEnd"/>
+    </w:p>
+    <w:p>
+      <w:r>
         <w:drawing>
-          <wp:inline distT="0" distB="0" distL="0" distR="0" wp14:anchorId="54B2C29C" wp14:editId="0A2096B2">
-            <wp:extent cx="2880000" cy="927077"/>
-            <wp:effectExtent l="0" t="0" r="0" b="6985"/>
-            <wp:docPr id="1300622776" name="Picture 1"/>
+          <wp:inline distT="0" distB="0" distL="0" distR="0" wp14:anchorId="444385EB" wp14:editId="1EDB8BA7">
+            <wp:extent cx="4320000" cy="1969846"/>
+            <wp:effectExtent l="0" t="0" r="4445" b="0"/>
+            <wp:docPr id="505841037" name="Picture 1"/>
             <wp:cNvGraphicFramePr>
               <a:graphicFrameLocks xmlns:a="http://schemas.openxmlformats.org/drawingml/2006/main" noChangeAspect="1"/>
             </wp:cNvGraphicFramePr>
@@ -4828,7 +4793,56 @@
               <a:graphicData uri="http://schemas.openxmlformats.org/drawingml/2006/picture">
                 <pic:pic xmlns:pic="http://schemas.openxmlformats.org/drawingml/2006/picture">
                   <pic:nvPicPr>
-                    <pic:cNvPr id="1300622776" name=""/>
+                    <pic:cNvPr id="505841037" name=""/>
+                    <pic:cNvPicPr/>
+                  </pic:nvPicPr>
+                  <pic:blipFill>
+                    <a:blip r:embed="rId41"/>
+                    <a:stretch>
+                      <a:fillRect/>
+                    </a:stretch>
+                  </pic:blipFill>
+                  <pic:spPr>
+                    <a:xfrm>
+                      <a:off x="0" y="0"/>
+                      <a:ext cx="4320000" cy="1969846"/>
+                    </a:xfrm>
+                    <a:prstGeom prst="rect">
+                      <a:avLst/>
+                    </a:prstGeom>
+                  </pic:spPr>
+                </pic:pic>
+              </a:graphicData>
+            </a:graphic>
+          </wp:inline>
+        </w:drawing>
+      </w:r>
+    </w:p>
+    <w:p>
+      <w:r>
+        <w:t xml:space="preserve">Login.module.css pada folder pages/auth </w:t>
+      </w:r>
+      <w:proofErr w:type="spellStart"/>
+      <w:r>
+        <w:t>dihapus</w:t>
+      </w:r>
+      <w:proofErr w:type="spellEnd"/>
+    </w:p>
+    <w:p>
+      <w:r>
+        <w:drawing>
+          <wp:inline distT="0" distB="0" distL="0" distR="0" wp14:anchorId="331E7ED2" wp14:editId="6126FB60">
+            <wp:extent cx="1080000" cy="468679"/>
+            <wp:effectExtent l="0" t="0" r="6350" b="7620"/>
+            <wp:docPr id="2110544841" name="Picture 1"/>
+            <wp:cNvGraphicFramePr>
+              <a:graphicFrameLocks xmlns:a="http://schemas.openxmlformats.org/drawingml/2006/main" noChangeAspect="1"/>
+            </wp:cNvGraphicFramePr>
+            <a:graphic xmlns:a="http://schemas.openxmlformats.org/drawingml/2006/main">
+              <a:graphicData uri="http://schemas.openxmlformats.org/drawingml/2006/picture">
+                <pic:pic xmlns:pic="http://schemas.openxmlformats.org/drawingml/2006/picture">
+                  <pic:nvPicPr>
+                    <pic:cNvPr id="2110544841" name=""/>
                     <pic:cNvPicPr/>
                   </pic:nvPicPr>
                   <pic:blipFill>
@@ -4840,7 +4854,7 @@
                   <pic:spPr>
                     <a:xfrm>
                       <a:off x="0" y="0"/>
-                      <a:ext cx="2880000" cy="927077"/>
+                      <a:ext cx="1080000" cy="468679"/>
                     </a:xfrm>
                     <a:prstGeom prst="rect">
                       <a:avLst/>
@@ -4852,17 +4866,32 @@
           </wp:inline>
         </w:drawing>
       </w:r>
-      <w:r>
-        <w:rPr>
-          <w:b/>
-          <w:bCs/>
-          <w:noProof/>
-        </w:rPr>
+    </w:p>
+    <w:p>
+      <w:proofErr w:type="spellStart"/>
+      <w:r>
+        <w:t>Modifikasi</w:t>
+      </w:r>
+      <w:proofErr w:type="spellEnd"/>
+      <w:r>
+        <w:t xml:space="preserve"> </w:t>
+      </w:r>
+      <w:proofErr w:type="spellStart"/>
+      <w:r>
+        <w:t>login.tsx</w:t>
+      </w:r>
+      <w:proofErr w:type="spellEnd"/>
+      <w:r>
+        <w:t xml:space="preserve"> pada folder pages/auth</w:t>
+      </w:r>
+    </w:p>
+    <w:p>
+      <w:r>
         <w:drawing>
-          <wp:inline distT="0" distB="0" distL="0" distR="0" wp14:anchorId="6AEF7CA4" wp14:editId="138FAD59">
-            <wp:extent cx="2880000" cy="967692"/>
-            <wp:effectExtent l="0" t="0" r="0" b="4445"/>
-            <wp:docPr id="876880491" name="Picture 1"/>
+          <wp:inline distT="0" distB="0" distL="0" distR="0" wp14:anchorId="163E7DDE" wp14:editId="4227373B">
+            <wp:extent cx="4320000" cy="2753538"/>
+            <wp:effectExtent l="0" t="0" r="4445" b="8890"/>
+            <wp:docPr id="1775666492" name="Picture 1"/>
             <wp:cNvGraphicFramePr>
               <a:graphicFrameLocks xmlns:a="http://schemas.openxmlformats.org/drawingml/2006/main" noChangeAspect="1"/>
             </wp:cNvGraphicFramePr>
@@ -4870,7 +4899,7 @@
               <a:graphicData uri="http://schemas.openxmlformats.org/drawingml/2006/picture">
                 <pic:pic xmlns:pic="http://schemas.openxmlformats.org/drawingml/2006/picture">
                   <pic:nvPicPr>
-                    <pic:cNvPr id="876880491" name=""/>
+                    <pic:cNvPr id="1775666492" name=""/>
                     <pic:cNvPicPr/>
                   </pic:nvPicPr>
                   <pic:blipFill>
@@ -4882,7 +4911,7 @@
                   <pic:spPr>
                     <a:xfrm>
                       <a:off x="0" y="0"/>
-                      <a:ext cx="2880000" cy="967692"/>
+                      <a:ext cx="4320000" cy="2753538"/>
                     </a:xfrm>
                     <a:prstGeom prst="rect">
                       <a:avLst/>
@@ -4896,23 +4925,31 @@
       </w:r>
     </w:p>
     <w:p>
-      <w:pPr>
-        <w:rPr>
-          <w:b/>
-          <w:bCs/>
-        </w:rPr>
-      </w:pPr>
-      <w:r>
-        <w:rPr>
-          <w:b/>
-          <w:bCs/>
-          <w:noProof/>
-        </w:rPr>
+      <w:proofErr w:type="spellStart"/>
+      <w:r>
+        <w:t>Modifikasi</w:t>
+      </w:r>
+      <w:proofErr w:type="spellEnd"/>
+      <w:r>
+        <w:t xml:space="preserve"> </w:t>
+      </w:r>
+      <w:proofErr w:type="spellStart"/>
+      <w:r>
+        <w:t>index.tsx</w:t>
+      </w:r>
+      <w:proofErr w:type="spellEnd"/>
+      <w:r>
+        <w:t xml:space="preserve"> pada folder views/auth/login</w:t>
+      </w:r>
+    </w:p>
+    <w:p>
+      <w:r>
+        <w:lastRenderedPageBreak/>
         <w:drawing>
-          <wp:inline distT="0" distB="0" distL="0" distR="0" wp14:anchorId="1D837698" wp14:editId="1B184E47">
-            <wp:extent cx="2880000" cy="1155077"/>
-            <wp:effectExtent l="0" t="0" r="0" b="6985"/>
-            <wp:docPr id="148502373" name="Picture 1"/>
+          <wp:inline distT="0" distB="0" distL="0" distR="0" wp14:anchorId="77010A8E" wp14:editId="10A3706C">
+            <wp:extent cx="4320000" cy="3236308"/>
+            <wp:effectExtent l="0" t="0" r="4445" b="2540"/>
+            <wp:docPr id="1368513415" name="Picture 1"/>
             <wp:cNvGraphicFramePr>
               <a:graphicFrameLocks xmlns:a="http://schemas.openxmlformats.org/drawingml/2006/main" noChangeAspect="1"/>
             </wp:cNvGraphicFramePr>
@@ -4920,7 +4957,7 @@
               <a:graphicData uri="http://schemas.openxmlformats.org/drawingml/2006/picture">
                 <pic:pic xmlns:pic="http://schemas.openxmlformats.org/drawingml/2006/picture">
                   <pic:nvPicPr>
-                    <pic:cNvPr id="148502373" name=""/>
+                    <pic:cNvPr id="1368513415" name=""/>
                     <pic:cNvPicPr/>
                   </pic:nvPicPr>
                   <pic:blipFill>
@@ -4932,7 +4969,7 @@
                   <pic:spPr>
                     <a:xfrm>
                       <a:off x="0" y="0"/>
-                      <a:ext cx="2880000" cy="1155077"/>
+                      <a:ext cx="4320000" cy="3236308"/>
                     </a:xfrm>
                     <a:prstGeom prst="rect">
                       <a:avLst/>
@@ -4944,17 +4981,19 @@
           </wp:inline>
         </w:drawing>
       </w:r>
-      <w:r>
-        <w:rPr>
-          <w:b/>
-          <w:bCs/>
-          <w:noProof/>
-        </w:rPr>
+    </w:p>
+    <w:p>
+      <w:r>
+        <w:t>Output</w:t>
+      </w:r>
+    </w:p>
+    <w:p>
+      <w:r>
         <w:drawing>
-          <wp:inline distT="0" distB="0" distL="0" distR="0" wp14:anchorId="42E213FE" wp14:editId="177094FA">
-            <wp:extent cx="2880000" cy="1435692"/>
-            <wp:effectExtent l="0" t="0" r="0" b="0"/>
-            <wp:docPr id="1688008636" name="Picture 1"/>
+          <wp:inline distT="0" distB="0" distL="0" distR="0" wp14:anchorId="17AF6063" wp14:editId="28CB4D91">
+            <wp:extent cx="4320000" cy="2750308"/>
+            <wp:effectExtent l="0" t="0" r="4445" b="0"/>
+            <wp:docPr id="422931131" name="Picture 1"/>
             <wp:cNvGraphicFramePr>
               <a:graphicFrameLocks xmlns:a="http://schemas.openxmlformats.org/drawingml/2006/main" noChangeAspect="1"/>
             </wp:cNvGraphicFramePr>
@@ -4962,7 +5001,7 @@
               <a:graphicData uri="http://schemas.openxmlformats.org/drawingml/2006/picture">
                 <pic:pic xmlns:pic="http://schemas.openxmlformats.org/drawingml/2006/picture">
                   <pic:nvPicPr>
-                    <pic:cNvPr id="1688008636" name=""/>
+                    <pic:cNvPr id="422931131" name=""/>
                     <pic:cNvPicPr/>
                   </pic:nvPicPr>
                   <pic:blipFill>
@@ -4974,7 +5013,7 @@
                   <pic:spPr>
                     <a:xfrm>
                       <a:off x="0" y="0"/>
-                      <a:ext cx="2880000" cy="1435692"/>
+                      <a:ext cx="4320000" cy="2750308"/>
                     </a:xfrm>
                     <a:prstGeom prst="rect">
                       <a:avLst/>
@@ -4999,27 +5038,34 @@
           <w:b/>
           <w:bCs/>
         </w:rPr>
-        <w:t>6. Membuat Layout Global (App Shell)</w:t>
-      </w:r>
-    </w:p>
-    <w:p>
-      <w:pPr>
-        <w:rPr>
-          <w:b/>
-          <w:bCs/>
-        </w:rPr>
-      </w:pPr>
-      <w:r>
-        <w:rPr>
-          <w:b/>
-          <w:bCs/>
-          <w:noProof/>
-        </w:rPr>
+        <w:t>6. Inline Styling (CSS-in-JS)</w:t>
+      </w:r>
+    </w:p>
+    <w:p>
+      <w:proofErr w:type="spellStart"/>
+      <w:r>
+        <w:t>Modifikasi</w:t>
+      </w:r>
+      <w:proofErr w:type="spellEnd"/>
+      <w:r>
+        <w:t xml:space="preserve"> </w:t>
+      </w:r>
+      <w:proofErr w:type="spellStart"/>
+      <w:r>
+        <w:t>index.tsx</w:t>
+      </w:r>
+      <w:proofErr w:type="spellEnd"/>
+      <w:r>
+        <w:t xml:space="preserve"> pada folder views/auth/login</w:t>
+      </w:r>
+    </w:p>
+    <w:p>
+      <w:r>
         <w:drawing>
-          <wp:inline distT="0" distB="0" distL="0" distR="0" wp14:anchorId="745C5922" wp14:editId="29E766A9">
-            <wp:extent cx="2880000" cy="1192308"/>
-            <wp:effectExtent l="0" t="0" r="0" b="8255"/>
-            <wp:docPr id="1176241510" name="Picture 1"/>
+          <wp:inline distT="0" distB="0" distL="0" distR="0" wp14:anchorId="5A8280C6" wp14:editId="3E0EB8F6">
+            <wp:extent cx="4320000" cy="425077"/>
+            <wp:effectExtent l="0" t="0" r="4445" b="0"/>
+            <wp:docPr id="438216066" name="Picture 1"/>
             <wp:cNvGraphicFramePr>
               <a:graphicFrameLocks xmlns:a="http://schemas.openxmlformats.org/drawingml/2006/main" noChangeAspect="1"/>
             </wp:cNvGraphicFramePr>
@@ -5027,7 +5073,7 @@
               <a:graphicData uri="http://schemas.openxmlformats.org/drawingml/2006/picture">
                 <pic:pic xmlns:pic="http://schemas.openxmlformats.org/drawingml/2006/picture">
                   <pic:nvPicPr>
-                    <pic:cNvPr id="1176241510" name=""/>
+                    <pic:cNvPr id="438216066" name=""/>
                     <pic:cNvPicPr/>
                   </pic:nvPicPr>
                   <pic:blipFill>
@@ -5039,7 +5085,7 @@
                   <pic:spPr>
                     <a:xfrm>
                       <a:off x="0" y="0"/>
-                      <a:ext cx="2880000" cy="1192308"/>
+                      <a:ext cx="4320000" cy="425077"/>
                     </a:xfrm>
                     <a:prstGeom prst="rect">
                       <a:avLst/>
@@ -5051,17 +5097,56 @@
           </wp:inline>
         </w:drawing>
       </w:r>
-      <w:r>
-        <w:rPr>
-          <w:b/>
-          <w:bCs/>
-          <w:noProof/>
-        </w:rPr>
+    </w:p>
+    <w:p>
+      <w:pPr>
+        <w:rPr>
+          <w:b/>
+          <w:bCs/>
+        </w:rPr>
+      </w:pPr>
+      <w:r>
+        <w:rPr>
+          <w:b/>
+          <w:bCs/>
+        </w:rPr>
+        <w:t xml:space="preserve">7. </w:t>
+      </w:r>
+      <w:proofErr w:type="spellStart"/>
+      <w:r>
+        <w:rPr>
+          <w:b/>
+          <w:bCs/>
+        </w:rPr>
+        <w:t>Kombinasi</w:t>
+      </w:r>
+      <w:proofErr w:type="spellEnd"/>
+      <w:r>
+        <w:rPr>
+          <w:b/>
+          <w:bCs/>
+        </w:rPr>
+        <w:t xml:space="preserve"> Global CSS + CSS Module</w:t>
+      </w:r>
+    </w:p>
+    <w:p>
+      <w:proofErr w:type="spellStart"/>
+      <w:r>
+        <w:lastRenderedPageBreak/>
+        <w:t>Modifikasi</w:t>
+      </w:r>
+      <w:proofErr w:type="spellEnd"/>
+      <w:r>
+        <w:t xml:space="preserve"> global.css</w:t>
+      </w:r>
+    </w:p>
+    <w:p>
+      <w:r>
         <w:drawing>
-          <wp:inline distT="0" distB="0" distL="0" distR="0" wp14:anchorId="33066AED" wp14:editId="55E9FFC7">
-            <wp:extent cx="2880000" cy="1547385"/>
-            <wp:effectExtent l="0" t="0" r="0" b="0"/>
-            <wp:docPr id="1338454774" name="Picture 1"/>
+          <wp:inline distT="0" distB="0" distL="0" distR="0" wp14:anchorId="0EC853C7" wp14:editId="11AA564B">
+            <wp:extent cx="4320000" cy="1546615"/>
+            <wp:effectExtent l="0" t="0" r="4445" b="0"/>
+            <wp:docPr id="1627171770" name="Picture 1"/>
             <wp:cNvGraphicFramePr>
               <a:graphicFrameLocks xmlns:a="http://schemas.openxmlformats.org/drawingml/2006/main" noChangeAspect="1"/>
             </wp:cNvGraphicFramePr>
@@ -5069,7 +5154,7 @@
               <a:graphicData uri="http://schemas.openxmlformats.org/drawingml/2006/picture">
                 <pic:pic xmlns:pic="http://schemas.openxmlformats.org/drawingml/2006/picture">
                   <pic:nvPicPr>
-                    <pic:cNvPr id="1338454774" name=""/>
+                    <pic:cNvPr id="1627171770" name=""/>
                     <pic:cNvPicPr/>
                   </pic:nvPicPr>
                   <pic:blipFill>
@@ -5081,7 +5166,7 @@
                   <pic:spPr>
                     <a:xfrm>
                       <a:off x="0" y="0"/>
-                      <a:ext cx="2880000" cy="1547385"/>
+                      <a:ext cx="4320000" cy="1546615"/>
                     </a:xfrm>
                     <a:prstGeom prst="rect">
                       <a:avLst/>
@@ -5095,66 +5180,30 @@
       </w:r>
     </w:p>
     <w:p>
-      <w:pPr>
-        <w:rPr>
-          <w:b/>
-          <w:bCs/>
-        </w:rPr>
-      </w:pPr>
-      <w:r>
-        <w:rPr>
-          <w:b/>
-          <w:bCs/>
-        </w:rPr>
-        <w:t>E. Tugas Praktikum</w:t>
-      </w:r>
-    </w:p>
-    <w:p>
-      <w:pPr>
-        <w:rPr>
-          <w:b/>
-          <w:bCs/>
-        </w:rPr>
-      </w:pPr>
-      <w:r>
-        <w:rPr>
-          <w:b/>
-          <w:bCs/>
-        </w:rPr>
-        <w:t>Tugas 1 – Routing</w:t>
-      </w:r>
-    </w:p>
-    <w:p>
-      <w:r>
-        <w:t>1. Buat halaman:</w:t>
-      </w:r>
-    </w:p>
-    <w:p>
-      <w:r>
-        <w:t>o /profile</w:t>
-      </w:r>
-    </w:p>
-    <w:p>
-      <w:r>
-        <w:t>o /profile/edit</w:t>
-      </w:r>
-    </w:p>
-    <w:p>
-      <w:r>
-        <w:t>2. Pastikan routing berjalan tanpa error</w:t>
-      </w:r>
-    </w:p>
-    <w:p>
-      <w:r>
-        <w:rPr>
-          <w:noProof/>
-        </w:rPr>
-        <w:lastRenderedPageBreak/>
+      <w:proofErr w:type="spellStart"/>
+      <w:r>
+        <w:t>Modifikasi</w:t>
+      </w:r>
+      <w:proofErr w:type="spellEnd"/>
+      <w:r>
+        <w:t xml:space="preserve"> </w:t>
+      </w:r>
+      <w:proofErr w:type="spellStart"/>
+      <w:r>
+        <w:t>index.tsx</w:t>
+      </w:r>
+      <w:proofErr w:type="spellEnd"/>
+      <w:r>
+        <w:t xml:space="preserve"> pada folder components/layouts/navbar</w:t>
+      </w:r>
+    </w:p>
+    <w:p>
+      <w:r>
         <w:drawing>
-          <wp:inline distT="0" distB="0" distL="0" distR="0" wp14:anchorId="313CA4B4" wp14:editId="4F79978E">
-            <wp:extent cx="2880000" cy="1333538"/>
-            <wp:effectExtent l="0" t="0" r="0" b="0"/>
-            <wp:docPr id="1885626048" name="Picture 1"/>
+          <wp:inline distT="0" distB="0" distL="0" distR="0" wp14:anchorId="38CF4C04" wp14:editId="64D8B502">
+            <wp:extent cx="4320000" cy="1789385"/>
+            <wp:effectExtent l="0" t="0" r="4445" b="1905"/>
+            <wp:docPr id="747468612" name="Picture 1"/>
             <wp:cNvGraphicFramePr>
               <a:graphicFrameLocks xmlns:a="http://schemas.openxmlformats.org/drawingml/2006/main" noChangeAspect="1"/>
             </wp:cNvGraphicFramePr>
@@ -5162,7 +5211,7 @@
               <a:graphicData uri="http://schemas.openxmlformats.org/drawingml/2006/picture">
                 <pic:pic xmlns:pic="http://schemas.openxmlformats.org/drawingml/2006/picture">
                   <pic:nvPicPr>
-                    <pic:cNvPr id="1885626048" name=""/>
+                    <pic:cNvPr id="747468612" name=""/>
                     <pic:cNvPicPr/>
                   </pic:nvPicPr>
                   <pic:blipFill>
@@ -5174,7 +5223,7 @@
                   <pic:spPr>
                     <a:xfrm>
                       <a:off x="0" y="0"/>
-                      <a:ext cx="2880000" cy="1333538"/>
+                      <a:ext cx="4320000" cy="1789385"/>
                     </a:xfrm>
                     <a:prstGeom prst="rect">
                       <a:avLst/>
@@ -5186,15 +5235,19 @@
           </wp:inline>
         </w:drawing>
       </w:r>
-      <w:r>
-        <w:rPr>
-          <w:noProof/>
-        </w:rPr>
+    </w:p>
+    <w:p>
+      <w:r>
+        <w:t>Output</w:t>
+      </w:r>
+    </w:p>
+    <w:p>
+      <w:r>
         <w:drawing>
-          <wp:inline distT="0" distB="0" distL="0" distR="0" wp14:anchorId="4FA67B82" wp14:editId="37381673">
-            <wp:extent cx="2880000" cy="1148923"/>
-            <wp:effectExtent l="0" t="0" r="0" b="0"/>
-            <wp:docPr id="1827725405" name="Picture 1"/>
+          <wp:inline distT="0" distB="0" distL="0" distR="0" wp14:anchorId="24C770D6" wp14:editId="6695B14F">
+            <wp:extent cx="4320000" cy="1515692"/>
+            <wp:effectExtent l="0" t="0" r="4445" b="8890"/>
+            <wp:docPr id="267881664" name="Picture 1"/>
             <wp:cNvGraphicFramePr>
               <a:graphicFrameLocks xmlns:a="http://schemas.openxmlformats.org/drawingml/2006/main" noChangeAspect="1"/>
             </wp:cNvGraphicFramePr>
@@ -5202,7 +5255,7 @@
               <a:graphicData uri="http://schemas.openxmlformats.org/drawingml/2006/picture">
                 <pic:pic xmlns:pic="http://schemas.openxmlformats.org/drawingml/2006/picture">
                   <pic:nvPicPr>
-                    <pic:cNvPr id="1827725405" name=""/>
+                    <pic:cNvPr id="267881664" name=""/>
                     <pic:cNvPicPr/>
                   </pic:nvPicPr>
                   <pic:blipFill>
@@ -5214,7 +5267,7 @@
                   <pic:spPr>
                     <a:xfrm>
                       <a:off x="0" y="0"/>
-                      <a:ext cx="2880000" cy="1148923"/>
+                      <a:ext cx="4320000" cy="1515692"/>
                     </a:xfrm>
                     <a:prstGeom prst="rect">
                       <a:avLst/>
@@ -5239,56 +5292,26 @@
           <w:b/>
           <w:bCs/>
         </w:rPr>
-        <w:t>Tugas 2 – Dynamic Routing</w:t>
-      </w:r>
-    </w:p>
-    <w:p>
-      <w:r>
-        <w:t>1. Buat routing:</w:t>
+        <w:t>8. SCSS (SASS)</w:t>
       </w:r>
     </w:p>
     <w:p>
       <w:pPr>
         <w:rPr>
-          <w:lang w:val="fi-FI"/>
+          <w:b/>
+          <w:bCs/>
         </w:rPr>
       </w:pPr>
       <w:r>
         <w:rPr>
-          <w:lang w:val="fi-FI"/>
-        </w:rPr>
-        <w:t>2. /blog/[slug]</w:t>
-      </w:r>
-    </w:p>
-    <w:p>
-      <w:pPr>
-        <w:rPr>
-          <w:lang w:val="fi-FI"/>
-        </w:rPr>
-      </w:pPr>
-      <w:r>
-        <w:rPr>
-          <w:lang w:val="fi-FI"/>
-        </w:rPr>
-        <w:t>3. Tampilkan nilai slug di halaman</w:t>
-      </w:r>
-    </w:p>
-    <w:p>
-      <w:pPr>
-        <w:rPr>
-          <w:lang w:val="fi-FI"/>
-        </w:rPr>
-      </w:pPr>
-      <w:r>
-        <w:rPr>
-          <w:noProof/>
-          <w:lang w:val="fi-FI"/>
+          <w:b/>
+          <w:bCs/>
         </w:rPr>
         <w:drawing>
-          <wp:inline distT="0" distB="0" distL="0" distR="0" wp14:anchorId="60343C83" wp14:editId="3D558872">
-            <wp:extent cx="2880000" cy="1018154"/>
-            <wp:effectExtent l="0" t="0" r="0" b="0"/>
-            <wp:docPr id="1691339207" name="Picture 1"/>
+          <wp:inline distT="0" distB="0" distL="0" distR="0" wp14:anchorId="35612194" wp14:editId="11BA700A">
+            <wp:extent cx="4320000" cy="1647231"/>
+            <wp:effectExtent l="0" t="0" r="4445" b="0"/>
+            <wp:docPr id="1163634398" name="Picture 1"/>
             <wp:cNvGraphicFramePr>
               <a:graphicFrameLocks xmlns:a="http://schemas.openxmlformats.org/drawingml/2006/main" noChangeAspect="1"/>
             </wp:cNvGraphicFramePr>
@@ -5296,7 +5319,7 @@
               <a:graphicData uri="http://schemas.openxmlformats.org/drawingml/2006/picture">
                 <pic:pic xmlns:pic="http://schemas.openxmlformats.org/drawingml/2006/picture">
                   <pic:nvPicPr>
-                    <pic:cNvPr id="1691339207" name=""/>
+                    <pic:cNvPr id="1163634398" name=""/>
                     <pic:cNvPicPr/>
                   </pic:nvPicPr>
                   <pic:blipFill>
@@ -5308,7 +5331,7 @@
                   <pic:spPr>
                     <a:xfrm>
                       <a:off x="0" y="0"/>
-                      <a:ext cx="2880000" cy="1018154"/>
+                      <a:ext cx="4320000" cy="1647231"/>
                     </a:xfrm>
                     <a:prstGeom prst="rect">
                       <a:avLst/>
@@ -5322,40 +5345,13 @@
       </w:r>
     </w:p>
     <w:p>
-      <w:pPr>
-        <w:rPr>
-          <w:b/>
-          <w:bCs/>
-        </w:rPr>
-      </w:pPr>
-      <w:r>
-        <w:rPr>
-          <w:b/>
-          <w:bCs/>
-        </w:rPr>
-        <w:t>Tugas 3 – Layout</w:t>
-      </w:r>
-    </w:p>
-    <w:p>
-      <w:r>
-        <w:t>1. Tambahkan Footer pada AppShell</w:t>
-      </w:r>
-    </w:p>
-    <w:p>
-      <w:r>
-        <w:t>2. Footer tampil di semua halaman</w:t>
-      </w:r>
-    </w:p>
-    <w:p>
-      <w:r>
-        <w:rPr>
-          <w:noProof/>
-        </w:rPr>
+      <w:r>
+        <w:lastRenderedPageBreak/>
         <w:drawing>
-          <wp:inline distT="0" distB="0" distL="0" distR="0" wp14:anchorId="13F75173" wp14:editId="1DBEE24C">
-            <wp:extent cx="2880000" cy="1794462"/>
-            <wp:effectExtent l="0" t="0" r="0" b="0"/>
-            <wp:docPr id="478043275" name="Picture 1"/>
+          <wp:inline distT="0" distB="0" distL="0" distR="0" wp14:anchorId="3EECA366" wp14:editId="22E8CD1E">
+            <wp:extent cx="4320000" cy="930000"/>
+            <wp:effectExtent l="0" t="0" r="4445" b="3810"/>
+            <wp:docPr id="1939903433" name="Picture 1"/>
             <wp:cNvGraphicFramePr>
               <a:graphicFrameLocks xmlns:a="http://schemas.openxmlformats.org/drawingml/2006/main" noChangeAspect="1"/>
             </wp:cNvGraphicFramePr>
@@ -5363,7 +5359,7 @@
               <a:graphicData uri="http://schemas.openxmlformats.org/drawingml/2006/picture">
                 <pic:pic xmlns:pic="http://schemas.openxmlformats.org/drawingml/2006/picture">
                   <pic:nvPicPr>
-                    <pic:cNvPr id="478043275" name=""/>
+                    <pic:cNvPr id="1939903433" name=""/>
                     <pic:cNvPicPr/>
                   </pic:nvPicPr>
                   <pic:blipFill>
@@ -5375,7 +5371,7 @@
                   <pic:spPr>
                     <a:xfrm>
                       <a:off x="0" y="0"/>
-                      <a:ext cx="2880000" cy="1794462"/>
+                      <a:ext cx="4320000" cy="930000"/>
                     </a:xfrm>
                     <a:prstGeom prst="rect">
                       <a:avLst/>
@@ -5389,16 +5385,21 @@
       </w:r>
     </w:p>
     <w:p>
-      <w:r>
-        <w:rPr>
-          <w:noProof/>
-        </w:rPr>
-        <w:lastRenderedPageBreak/>
+      <w:proofErr w:type="spellStart"/>
+      <w:proofErr w:type="gramStart"/>
+      <w:r>
+        <w:t>colors.scss</w:t>
+      </w:r>
+      <w:proofErr w:type="spellEnd"/>
+      <w:proofErr w:type="gramEnd"/>
+    </w:p>
+    <w:p>
+      <w:r>
         <w:drawing>
-          <wp:inline distT="0" distB="0" distL="0" distR="0" wp14:anchorId="1C9C95CD" wp14:editId="273997A1">
-            <wp:extent cx="2880000" cy="1516615"/>
-            <wp:effectExtent l="0" t="0" r="0" b="7620"/>
-            <wp:docPr id="1155799646" name="Picture 1"/>
+          <wp:inline distT="0" distB="0" distL="0" distR="0" wp14:anchorId="38661C98" wp14:editId="3970988C">
+            <wp:extent cx="4320000" cy="2139231"/>
+            <wp:effectExtent l="0" t="0" r="4445" b="0"/>
+            <wp:docPr id="497747530" name="Picture 1"/>
             <wp:cNvGraphicFramePr>
               <a:graphicFrameLocks xmlns:a="http://schemas.openxmlformats.org/drawingml/2006/main" noChangeAspect="1"/>
             </wp:cNvGraphicFramePr>
@@ -5406,7 +5407,7 @@
               <a:graphicData uri="http://schemas.openxmlformats.org/drawingml/2006/picture">
                 <pic:pic xmlns:pic="http://schemas.openxmlformats.org/drawingml/2006/picture">
                   <pic:nvPicPr>
-                    <pic:cNvPr id="1155799646" name=""/>
+                    <pic:cNvPr id="497747530" name=""/>
                     <pic:cNvPicPr/>
                   </pic:nvPicPr>
                   <pic:blipFill>
@@ -5418,7 +5419,7 @@
                   <pic:spPr>
                     <a:xfrm>
                       <a:off x="0" y="0"/>
-                      <a:ext cx="2880000" cy="1516615"/>
+                      <a:ext cx="4320000" cy="2139231"/>
                     </a:xfrm>
                     <a:prstGeom prst="rect">
                       <a:avLst/>
@@ -5430,15 +5431,29 @@
           </wp:inline>
         </w:drawing>
       </w:r>
-      <w:r>
-        <w:rPr>
-          <w:noProof/>
-        </w:rPr>
+    </w:p>
+    <w:p>
+      <w:proofErr w:type="spellStart"/>
+      <w:r>
+        <w:t>Modifikasi</w:t>
+      </w:r>
+      <w:proofErr w:type="spellEnd"/>
+      <w:r>
+        <w:t xml:space="preserve"> </w:t>
+      </w:r>
+      <w:proofErr w:type="spellStart"/>
+      <w:r>
+        <w:t>index.tsx</w:t>
+      </w:r>
+      <w:proofErr w:type="spellEnd"/>
+    </w:p>
+    <w:p>
+      <w:r>
         <w:drawing>
-          <wp:inline distT="0" distB="0" distL="0" distR="0" wp14:anchorId="2DEF5DD5" wp14:editId="00458313">
-            <wp:extent cx="2880000" cy="1079385"/>
-            <wp:effectExtent l="0" t="0" r="0" b="6985"/>
-            <wp:docPr id="1789596335" name="Picture 1"/>
+          <wp:inline distT="0" distB="0" distL="0" distR="0" wp14:anchorId="7D6FD9E5" wp14:editId="1C5579E5">
+            <wp:extent cx="4320000" cy="1185692"/>
+            <wp:effectExtent l="0" t="0" r="4445" b="0"/>
+            <wp:docPr id="1234459785" name="Picture 1"/>
             <wp:cNvGraphicFramePr>
               <a:graphicFrameLocks xmlns:a="http://schemas.openxmlformats.org/drawingml/2006/main" noChangeAspect="1"/>
             </wp:cNvGraphicFramePr>
@@ -5446,7 +5461,7 @@
               <a:graphicData uri="http://schemas.openxmlformats.org/drawingml/2006/picture">
                 <pic:pic xmlns:pic="http://schemas.openxmlformats.org/drawingml/2006/picture">
                   <pic:nvPicPr>
-                    <pic:cNvPr id="1789596335" name=""/>
+                    <pic:cNvPr id="1234459785" name=""/>
                     <pic:cNvPicPr/>
                   </pic:nvPicPr>
                   <pic:blipFill>
@@ -5458,7 +5473,7 @@
                   <pic:spPr>
                     <a:xfrm>
                       <a:off x="0" y="0"/>
-                      <a:ext cx="2880000" cy="1079385"/>
+                      <a:ext cx="4320000" cy="1185692"/>
                     </a:xfrm>
                     <a:prstGeom prst="rect">
                       <a:avLst/>
@@ -5472,15 +5487,32 @@
       </w:r>
     </w:p>
     <w:p>
-      <w:r>
-        <w:rPr>
-          <w:noProof/>
-        </w:rPr>
+      <w:proofErr w:type="spellStart"/>
+      <w:r>
+        <w:t>Modifikasi</w:t>
+      </w:r>
+      <w:proofErr w:type="spellEnd"/>
+      <w:r>
+        <w:t xml:space="preserve"> </w:t>
+      </w:r>
+      <w:proofErr w:type="spellStart"/>
+      <w:proofErr w:type="gramStart"/>
+      <w:r>
+        <w:t>login.module</w:t>
+      </w:r>
+      <w:proofErr w:type="gramEnd"/>
+      <w:r>
+        <w:t>.scss</w:t>
+      </w:r>
+      <w:proofErr w:type="spellEnd"/>
+    </w:p>
+    <w:p>
+      <w:r>
         <w:drawing>
-          <wp:inline distT="0" distB="0" distL="0" distR="0" wp14:anchorId="3CDE3488" wp14:editId="5EA46B5C">
-            <wp:extent cx="2880000" cy="974462"/>
-            <wp:effectExtent l="0" t="0" r="0" b="0"/>
-            <wp:docPr id="1627199812" name="Picture 1"/>
+          <wp:inline distT="0" distB="0" distL="0" distR="0" wp14:anchorId="57008E0A" wp14:editId="5C2D5F14">
+            <wp:extent cx="4320000" cy="1882154"/>
+            <wp:effectExtent l="0" t="0" r="4445" b="3810"/>
+            <wp:docPr id="386719433" name="Picture 1"/>
             <wp:cNvGraphicFramePr>
               <a:graphicFrameLocks xmlns:a="http://schemas.openxmlformats.org/drawingml/2006/main" noChangeAspect="1"/>
             </wp:cNvGraphicFramePr>
@@ -5488,7 +5520,7 @@
               <a:graphicData uri="http://schemas.openxmlformats.org/drawingml/2006/picture">
                 <pic:pic xmlns:pic="http://schemas.openxmlformats.org/drawingml/2006/picture">
                   <pic:nvPicPr>
-                    <pic:cNvPr id="1627199812" name=""/>
+                    <pic:cNvPr id="386719433" name=""/>
                     <pic:cNvPicPr/>
                   </pic:nvPicPr>
                   <pic:blipFill>
@@ -5500,7 +5532,7 @@
                   <pic:spPr>
                     <a:xfrm>
                       <a:off x="0" y="0"/>
-                      <a:ext cx="2880000" cy="974462"/>
+                      <a:ext cx="4320000" cy="1882154"/>
                     </a:xfrm>
                     <a:prstGeom prst="rect">
                       <a:avLst/>
@@ -5512,15 +5544,23 @@
           </wp:inline>
         </w:drawing>
       </w:r>
-      <w:r>
-        <w:rPr>
-          <w:noProof/>
-        </w:rPr>
+    </w:p>
+    <w:p>
+      <w:r>
+        <w:rPr>
+          <w:rFonts w:hint="eastAsia"/>
+        </w:rPr>
+        <w:t>Output</w:t>
+      </w:r>
+    </w:p>
+    <w:p>
+      <w:r>
+        <w:lastRenderedPageBreak/>
         <w:drawing>
-          <wp:inline distT="0" distB="0" distL="0" distR="0" wp14:anchorId="69DC8CE5" wp14:editId="162E9C26">
-            <wp:extent cx="2880000" cy="1131077"/>
-            <wp:effectExtent l="0" t="0" r="0" b="0"/>
-            <wp:docPr id="863367778" name="Picture 1"/>
+          <wp:inline distT="0" distB="0" distL="0" distR="0" wp14:anchorId="7BEDA739" wp14:editId="0B363BA0">
+            <wp:extent cx="4320000" cy="2772000"/>
+            <wp:effectExtent l="0" t="0" r="4445" b="9525"/>
+            <wp:docPr id="784288161" name="Picture 1"/>
             <wp:cNvGraphicFramePr>
               <a:graphicFrameLocks xmlns:a="http://schemas.openxmlformats.org/drawingml/2006/main" noChangeAspect="1"/>
             </wp:cNvGraphicFramePr>
@@ -5528,7 +5568,7 @@
               <a:graphicData uri="http://schemas.openxmlformats.org/drawingml/2006/picture">
                 <pic:pic xmlns:pic="http://schemas.openxmlformats.org/drawingml/2006/picture">
                   <pic:nvPicPr>
-                    <pic:cNvPr id="863367778" name=""/>
+                    <pic:cNvPr id="784288161" name=""/>
                     <pic:cNvPicPr/>
                   </pic:nvPicPr>
                   <pic:blipFill>
@@ -5540,7 +5580,7 @@
                   <pic:spPr>
                     <a:xfrm>
                       <a:off x="0" y="0"/>
-                      <a:ext cx="2880000" cy="1131077"/>
+                      <a:ext cx="4320000" cy="2772000"/>
                     </a:xfrm>
                     <a:prstGeom prst="rect">
                       <a:avLst/>
@@ -5553,7 +5593,6 @@
         </w:drawing>
       </w:r>
     </w:p>
-    <w:p/>
     <w:p>
       <w:pPr>
         <w:rPr>
@@ -5566,98 +5605,1184 @@
           <w:b/>
           <w:bCs/>
         </w:rPr>
-        <w:t>F. Pertanyaan Refleksi</w:t>
-      </w:r>
-    </w:p>
-    <w:p>
-      <w:r>
-        <w:t>1. Apa perbedaan routing berbasis file dan routing manual?</w:t>
+        <w:t>9. Tailwind CSS</w:t>
+      </w:r>
+    </w:p>
+    <w:p>
+      <w:r>
+        <w:rPr>
+          <w:rFonts w:hint="eastAsia"/>
+        </w:rPr>
+        <w:t>Install</w:t>
+      </w:r>
+    </w:p>
+    <w:p>
+      <w:r>
+        <w:drawing>
+          <wp:inline distT="0" distB="0" distL="0" distR="0" wp14:anchorId="68B89F72" wp14:editId="64229947">
+            <wp:extent cx="4320000" cy="1789385"/>
+            <wp:effectExtent l="0" t="0" r="4445" b="1905"/>
+            <wp:docPr id="426551188" name="Picture 1"/>
+            <wp:cNvGraphicFramePr>
+              <a:graphicFrameLocks xmlns:a="http://schemas.openxmlformats.org/drawingml/2006/main" noChangeAspect="1"/>
+            </wp:cNvGraphicFramePr>
+            <a:graphic xmlns:a="http://schemas.openxmlformats.org/drawingml/2006/main">
+              <a:graphicData uri="http://schemas.openxmlformats.org/drawingml/2006/picture">
+                <pic:pic xmlns:pic="http://schemas.openxmlformats.org/drawingml/2006/picture">
+                  <pic:nvPicPr>
+                    <pic:cNvPr id="426551188" name=""/>
+                    <pic:cNvPicPr/>
+                  </pic:nvPicPr>
+                  <pic:blipFill>
+                    <a:blip r:embed="rId62"/>
+                    <a:stretch>
+                      <a:fillRect/>
+                    </a:stretch>
+                  </pic:blipFill>
+                  <pic:spPr>
+                    <a:xfrm>
+                      <a:off x="0" y="0"/>
+                      <a:ext cx="4320000" cy="1789385"/>
+                    </a:xfrm>
+                    <a:prstGeom prst="rect">
+                      <a:avLst/>
+                    </a:prstGeom>
+                  </pic:spPr>
+                </pic:pic>
+              </a:graphicData>
+            </a:graphic>
+          </wp:inline>
+        </w:drawing>
+      </w:r>
+    </w:p>
+    <w:p>
+      <w:proofErr w:type="spellStart"/>
+      <w:r>
+        <w:t>Konfigurasi</w:t>
+      </w:r>
+      <w:proofErr w:type="spellEnd"/>
+      <w:r>
+        <w:t xml:space="preserve"> tailwind.config.js</w:t>
+      </w:r>
+    </w:p>
+    <w:p>
+      <w:r>
+        <w:lastRenderedPageBreak/>
+        <w:drawing>
+          <wp:inline distT="0" distB="0" distL="0" distR="0" wp14:anchorId="6FC6CE2C" wp14:editId="40F09642">
+            <wp:extent cx="4320000" cy="3423692"/>
+            <wp:effectExtent l="0" t="0" r="4445" b="5715"/>
+            <wp:docPr id="705528921" name="Picture 1"/>
+            <wp:cNvGraphicFramePr>
+              <a:graphicFrameLocks xmlns:a="http://schemas.openxmlformats.org/drawingml/2006/main" noChangeAspect="1"/>
+            </wp:cNvGraphicFramePr>
+            <a:graphic xmlns:a="http://schemas.openxmlformats.org/drawingml/2006/main">
+              <a:graphicData uri="http://schemas.openxmlformats.org/drawingml/2006/picture">
+                <pic:pic xmlns:pic="http://schemas.openxmlformats.org/drawingml/2006/picture">
+                  <pic:nvPicPr>
+                    <pic:cNvPr id="705528921" name=""/>
+                    <pic:cNvPicPr/>
+                  </pic:nvPicPr>
+                  <pic:blipFill>
+                    <a:blip r:embed="rId63"/>
+                    <a:stretch>
+                      <a:fillRect/>
+                    </a:stretch>
+                  </pic:blipFill>
+                  <pic:spPr>
+                    <a:xfrm>
+                      <a:off x="0" y="0"/>
+                      <a:ext cx="4320000" cy="3423692"/>
+                    </a:xfrm>
+                    <a:prstGeom prst="rect">
+                      <a:avLst/>
+                    </a:prstGeom>
+                  </pic:spPr>
+                </pic:pic>
+              </a:graphicData>
+            </a:graphic>
+          </wp:inline>
+        </w:drawing>
+      </w:r>
+    </w:p>
+    <w:p>
+      <w:r>
+        <w:t>Import di Global CSS</w:t>
+      </w:r>
+    </w:p>
+    <w:p>
+      <w:r>
+        <w:drawing>
+          <wp:inline distT="0" distB="0" distL="0" distR="0" wp14:anchorId="281F098C" wp14:editId="46C02879">
+            <wp:extent cx="4320000" cy="1350462"/>
+            <wp:effectExtent l="0" t="0" r="4445" b="2540"/>
+            <wp:docPr id="1611102849" name="Picture 1"/>
+            <wp:cNvGraphicFramePr>
+              <a:graphicFrameLocks xmlns:a="http://schemas.openxmlformats.org/drawingml/2006/main" noChangeAspect="1"/>
+            </wp:cNvGraphicFramePr>
+            <a:graphic xmlns:a="http://schemas.openxmlformats.org/drawingml/2006/main">
+              <a:graphicData uri="http://schemas.openxmlformats.org/drawingml/2006/picture">
+                <pic:pic xmlns:pic="http://schemas.openxmlformats.org/drawingml/2006/picture">
+                  <pic:nvPicPr>
+                    <pic:cNvPr id="1611102849" name=""/>
+                    <pic:cNvPicPr/>
+                  </pic:nvPicPr>
+                  <pic:blipFill>
+                    <a:blip r:embed="rId64"/>
+                    <a:stretch>
+                      <a:fillRect/>
+                    </a:stretch>
+                  </pic:blipFill>
+                  <pic:spPr>
+                    <a:xfrm>
+                      <a:off x="0" y="0"/>
+                      <a:ext cx="4320000" cy="1350462"/>
+                    </a:xfrm>
+                    <a:prstGeom prst="rect">
+                      <a:avLst/>
+                    </a:prstGeom>
+                  </pic:spPr>
+                </pic:pic>
+              </a:graphicData>
+            </a:graphic>
+          </wp:inline>
+        </w:drawing>
       </w:r>
     </w:p>
     <w:p>
       <w:pPr>
         <w:rPr>
-          <w:u w:val="single"/>
+          <w:rFonts w:hint="eastAsia"/>
         </w:rPr>
       </w:pPr>
-      <w:r>
-        <w:rPr>
-          <w:u w:val="single"/>
-        </w:rPr>
-        <w:t>Routing berbasis file secara otomatis</w:t>
-      </w:r>
-      <w:r>
-        <w:rPr>
-          <w:u w:val="single"/>
-        </w:rPr>
-        <w:t xml:space="preserve"> membuat</w:t>
-      </w:r>
-      <w:r>
-        <w:rPr>
-          <w:u w:val="single"/>
-        </w:rPr>
-        <w:t xml:space="preserve"> struktur file di direktori tertentu menjadi URL, sedangkan routing manual </w:t>
-      </w:r>
-      <w:r>
-        <w:rPr>
-          <w:u w:val="single"/>
-        </w:rPr>
-        <w:t xml:space="preserve">harus </w:t>
-      </w:r>
-      <w:r>
-        <w:rPr>
-          <w:u w:val="single"/>
-        </w:rPr>
-        <w:t>mendefinisikan setiap jalur dan komponennya secara eksplisit</w:t>
-      </w:r>
-      <w:r>
-        <w:rPr>
-          <w:u w:val="single"/>
-        </w:rPr>
-        <w:t xml:space="preserve"> (biasanya ada di file route)</w:t>
-      </w:r>
-      <w:r>
-        <w:rPr>
-          <w:u w:val="single"/>
-        </w:rPr>
-        <w:t xml:space="preserve"> di dalam kode program.</w:t>
-      </w:r>
-    </w:p>
-    <w:p>
-      <w:r>
-        <w:t>2. Mengapa dynamic routing penting dalam aplikasi web?</w:t>
+      <w:proofErr w:type="spellStart"/>
+      <w:r>
+        <w:t>Contoh</w:t>
+      </w:r>
+      <w:proofErr w:type="spellEnd"/>
+      <w:r>
+        <w:t xml:space="preserve"> </w:t>
+      </w:r>
+      <w:proofErr w:type="spellStart"/>
+      <w:r>
+        <w:t>Penggunaan</w:t>
+      </w:r>
+      <w:proofErr w:type="spellEnd"/>
+      <w:r>
+        <w:rPr>
+          <w:rFonts w:hint="eastAsia"/>
+        </w:rPr>
+        <w:t xml:space="preserve"> </w:t>
+      </w:r>
+      <w:proofErr w:type="spellStart"/>
+      <w:r>
+        <w:t>index.tsx</w:t>
+      </w:r>
+      <w:proofErr w:type="spellEnd"/>
+      <w:r>
+        <w:t xml:space="preserve"> pada folder auth/login/</w:t>
+      </w:r>
+    </w:p>
+    <w:p>
+      <w:r>
+        <w:drawing>
+          <wp:inline distT="0" distB="0" distL="0" distR="0" wp14:anchorId="0A1D04B4" wp14:editId="1172AA50">
+            <wp:extent cx="4320000" cy="662769"/>
+            <wp:effectExtent l="0" t="0" r="4445" b="4445"/>
+            <wp:docPr id="31032462" name="Picture 1"/>
+            <wp:cNvGraphicFramePr>
+              <a:graphicFrameLocks xmlns:a="http://schemas.openxmlformats.org/drawingml/2006/main" noChangeAspect="1"/>
+            </wp:cNvGraphicFramePr>
+            <a:graphic xmlns:a="http://schemas.openxmlformats.org/drawingml/2006/main">
+              <a:graphicData uri="http://schemas.openxmlformats.org/drawingml/2006/picture">
+                <pic:pic xmlns:pic="http://schemas.openxmlformats.org/drawingml/2006/picture">
+                  <pic:nvPicPr>
+                    <pic:cNvPr id="31032462" name=""/>
+                    <pic:cNvPicPr/>
+                  </pic:nvPicPr>
+                  <pic:blipFill>
+                    <a:blip r:embed="rId65"/>
+                    <a:stretch>
+                      <a:fillRect/>
+                    </a:stretch>
+                  </pic:blipFill>
+                  <pic:spPr>
+                    <a:xfrm>
+                      <a:off x="0" y="0"/>
+                      <a:ext cx="4320000" cy="662769"/>
+                    </a:xfrm>
+                    <a:prstGeom prst="rect">
+                      <a:avLst/>
+                    </a:prstGeom>
+                  </pic:spPr>
+                </pic:pic>
+              </a:graphicData>
+            </a:graphic>
+          </wp:inline>
+        </w:drawing>
+      </w:r>
+    </w:p>
+    <w:p>
+      <w:r>
+        <w:rPr>
+          <w:rFonts w:hint="eastAsia"/>
+        </w:rPr>
+        <w:t>Output</w:t>
+      </w:r>
+    </w:p>
+    <w:p>
+      <w:r>
+        <w:lastRenderedPageBreak/>
+        <w:drawing>
+          <wp:inline distT="0" distB="0" distL="0" distR="0" wp14:anchorId="08D0A16E" wp14:editId="1697CE60">
+            <wp:extent cx="4320000" cy="2821385"/>
+            <wp:effectExtent l="0" t="0" r="4445" b="0"/>
+            <wp:docPr id="773894023" name="Picture 1"/>
+            <wp:cNvGraphicFramePr>
+              <a:graphicFrameLocks xmlns:a="http://schemas.openxmlformats.org/drawingml/2006/main" noChangeAspect="1"/>
+            </wp:cNvGraphicFramePr>
+            <a:graphic xmlns:a="http://schemas.openxmlformats.org/drawingml/2006/main">
+              <a:graphicData uri="http://schemas.openxmlformats.org/drawingml/2006/picture">
+                <pic:pic xmlns:pic="http://schemas.openxmlformats.org/drawingml/2006/picture">
+                  <pic:nvPicPr>
+                    <pic:cNvPr id="773894023" name=""/>
+                    <pic:cNvPicPr/>
+                  </pic:nvPicPr>
+                  <pic:blipFill>
+                    <a:blip r:embed="rId66"/>
+                    <a:stretch>
+                      <a:fillRect/>
+                    </a:stretch>
+                  </pic:blipFill>
+                  <pic:spPr>
+                    <a:xfrm>
+                      <a:off x="0" y="0"/>
+                      <a:ext cx="4320000" cy="2821385"/>
+                    </a:xfrm>
+                    <a:prstGeom prst="rect">
+                      <a:avLst/>
+                    </a:prstGeom>
+                  </pic:spPr>
+                </pic:pic>
+              </a:graphicData>
+            </a:graphic>
+          </wp:inline>
+        </w:drawing>
       </w:r>
     </w:p>
     <w:p>
       <w:pPr>
         <w:rPr>
-          <w:u w:val="single"/>
+          <w:b/>
+          <w:bCs/>
         </w:rPr>
       </w:pPr>
       <w:r>
         <w:rPr>
-          <w:u w:val="single"/>
-        </w:rPr>
-        <w:t>Karena memungkinkan satu template halaman menangani berbagai data unik berdasarkan parameter URL, seperti ID produk atau nama pengguna, tanpa perlu membuat file terpisah untuk setiap konten.</w:t>
-      </w:r>
-    </w:p>
-    <w:p>
-      <w:r>
-        <w:t>3. Apa keuntungan menggunakan layout global dibanding memanggil komponen satu per satu?</w:t>
+          <w:b/>
+          <w:bCs/>
+        </w:rPr>
+        <w:t xml:space="preserve">E. </w:t>
+      </w:r>
+      <w:proofErr w:type="spellStart"/>
+      <w:r>
+        <w:rPr>
+          <w:b/>
+          <w:bCs/>
+        </w:rPr>
+        <w:t>Tugas</w:t>
+      </w:r>
+      <w:proofErr w:type="spellEnd"/>
+      <w:r>
+        <w:rPr>
+          <w:b/>
+          <w:bCs/>
+        </w:rPr>
+        <w:t xml:space="preserve"> </w:t>
+      </w:r>
+      <w:proofErr w:type="spellStart"/>
+      <w:r>
+        <w:rPr>
+          <w:b/>
+          <w:bCs/>
+        </w:rPr>
+        <w:t>Praktikum</w:t>
+      </w:r>
+      <w:proofErr w:type="spellEnd"/>
+    </w:p>
+    <w:p>
+      <w:proofErr w:type="spellStart"/>
+      <w:r>
+        <w:t>Tugas</w:t>
+      </w:r>
+      <w:proofErr w:type="spellEnd"/>
+      <w:r>
+        <w:t xml:space="preserve"> 1</w:t>
+      </w:r>
+    </w:p>
+    <w:p>
+      <w:r>
+        <w:t xml:space="preserve">• </w:t>
+      </w:r>
+      <w:proofErr w:type="spellStart"/>
+      <w:r>
+        <w:t>Buat</w:t>
+      </w:r>
+      <w:proofErr w:type="spellEnd"/>
+      <w:r>
+        <w:t xml:space="preserve"> </w:t>
+      </w:r>
+      <w:proofErr w:type="spellStart"/>
+      <w:r>
+        <w:t>halaman</w:t>
+      </w:r>
+      <w:proofErr w:type="spellEnd"/>
+      <w:r>
+        <w:t xml:space="preserve"> Register</w:t>
+      </w:r>
+    </w:p>
+    <w:p>
+      <w:r>
+        <w:t xml:space="preserve">• </w:t>
+      </w:r>
+      <w:proofErr w:type="spellStart"/>
+      <w:r>
+        <w:t>Gunakan</w:t>
+      </w:r>
+      <w:proofErr w:type="spellEnd"/>
+      <w:r>
+        <w:t xml:space="preserve"> CSS Module</w:t>
       </w:r>
     </w:p>
     <w:p>
       <w:pPr>
         <w:rPr>
-          <w:u w:val="single"/>
+          <w:rFonts w:hint="eastAsia"/>
         </w:rPr>
       </w:pPr>
       <w:r>
         <w:rPr>
-          <w:u w:val="single"/>
-        </w:rPr>
-        <w:t>Karena dapat membungkus seluruh halaman aplikasi secara konsisten (seperti navbar dan footer) tanpa harus memanggil dan menulis ulang kode komponen tersebut di setiap file halaman secara manual.</w:t>
-      </w:r>
+          <w:rFonts w:hint="eastAsia"/>
+        </w:rPr>
+        <w:t>/pages/</w:t>
+      </w:r>
+      <w:proofErr w:type="spellStart"/>
+      <w:r>
+        <w:rPr>
+          <w:rFonts w:hint="eastAsia"/>
+        </w:rPr>
+        <w:t>src</w:t>
+      </w:r>
+      <w:proofErr w:type="spellEnd"/>
+      <w:r>
+        <w:rPr>
+          <w:rFonts w:hint="eastAsia"/>
+        </w:rPr>
+        <w:t>/auth</w:t>
+      </w:r>
+    </w:p>
+    <w:p>
+      <w:r>
+        <w:drawing>
+          <wp:inline distT="0" distB="0" distL="0" distR="0" wp14:anchorId="0B457163" wp14:editId="4146F3CF">
+            <wp:extent cx="4320000" cy="2490000"/>
+            <wp:effectExtent l="0" t="0" r="4445" b="5715"/>
+            <wp:docPr id="751100893" name="Picture 1"/>
+            <wp:cNvGraphicFramePr>
+              <a:graphicFrameLocks xmlns:a="http://schemas.openxmlformats.org/drawingml/2006/main" noChangeAspect="1"/>
+            </wp:cNvGraphicFramePr>
+            <a:graphic xmlns:a="http://schemas.openxmlformats.org/drawingml/2006/main">
+              <a:graphicData uri="http://schemas.openxmlformats.org/drawingml/2006/picture">
+                <pic:pic xmlns:pic="http://schemas.openxmlformats.org/drawingml/2006/picture">
+                  <pic:nvPicPr>
+                    <pic:cNvPr id="751100893" name=""/>
+                    <pic:cNvPicPr/>
+                  </pic:nvPicPr>
+                  <pic:blipFill>
+                    <a:blip r:embed="rId67"/>
+                    <a:stretch>
+                      <a:fillRect/>
+                    </a:stretch>
+                  </pic:blipFill>
+                  <pic:spPr>
+                    <a:xfrm>
+                      <a:off x="0" y="0"/>
+                      <a:ext cx="4320000" cy="2490000"/>
+                    </a:xfrm>
+                    <a:prstGeom prst="rect">
+                      <a:avLst/>
+                    </a:prstGeom>
+                  </pic:spPr>
+                </pic:pic>
+              </a:graphicData>
+            </a:graphic>
+          </wp:inline>
+        </w:drawing>
+      </w:r>
+    </w:p>
+    <w:p>
+      <w:pPr>
+        <w:rPr>
+          <w:rFonts w:hint="eastAsia"/>
+        </w:rPr>
+      </w:pPr>
+      <w:r>
+        <w:rPr>
+          <w:rFonts w:hint="eastAsia"/>
+        </w:rPr>
+        <w:t>/views/auth/register</w:t>
+      </w:r>
+    </w:p>
+    <w:p>
+      <w:r>
+        <w:lastRenderedPageBreak/>
+        <w:drawing>
+          <wp:inline distT="0" distB="0" distL="0" distR="0" wp14:anchorId="4164FCA0" wp14:editId="1E003F1D">
+            <wp:extent cx="1440000" cy="765752"/>
+            <wp:effectExtent l="0" t="0" r="8255" b="0"/>
+            <wp:docPr id="872600025" name="Picture 1"/>
+            <wp:cNvGraphicFramePr>
+              <a:graphicFrameLocks xmlns:a="http://schemas.openxmlformats.org/drawingml/2006/main" noChangeAspect="1"/>
+            </wp:cNvGraphicFramePr>
+            <a:graphic xmlns:a="http://schemas.openxmlformats.org/drawingml/2006/main">
+              <a:graphicData uri="http://schemas.openxmlformats.org/drawingml/2006/picture">
+                <pic:pic xmlns:pic="http://schemas.openxmlformats.org/drawingml/2006/picture">
+                  <pic:nvPicPr>
+                    <pic:cNvPr id="872600025" name=""/>
+                    <pic:cNvPicPr/>
+                  </pic:nvPicPr>
+                  <pic:blipFill>
+                    <a:blip r:embed="rId68"/>
+                    <a:stretch>
+                      <a:fillRect/>
+                    </a:stretch>
+                  </pic:blipFill>
+                  <pic:spPr>
+                    <a:xfrm>
+                      <a:off x="0" y="0"/>
+                      <a:ext cx="1440000" cy="765752"/>
+                    </a:xfrm>
+                    <a:prstGeom prst="rect">
+                      <a:avLst/>
+                    </a:prstGeom>
+                  </pic:spPr>
+                </pic:pic>
+              </a:graphicData>
+            </a:graphic>
+          </wp:inline>
+        </w:drawing>
+      </w:r>
+    </w:p>
+    <w:p>
+      <w:r>
+        <w:drawing>
+          <wp:inline distT="0" distB="0" distL="0" distR="0" wp14:anchorId="2B3AEB11" wp14:editId="2A31CDCA">
+            <wp:extent cx="4320000" cy="2128615"/>
+            <wp:effectExtent l="0" t="0" r="4445" b="5080"/>
+            <wp:docPr id="1375610421" name="Picture 1"/>
+            <wp:cNvGraphicFramePr>
+              <a:graphicFrameLocks xmlns:a="http://schemas.openxmlformats.org/drawingml/2006/main" noChangeAspect="1"/>
+            </wp:cNvGraphicFramePr>
+            <a:graphic xmlns:a="http://schemas.openxmlformats.org/drawingml/2006/main">
+              <a:graphicData uri="http://schemas.openxmlformats.org/drawingml/2006/picture">
+                <pic:pic xmlns:pic="http://schemas.openxmlformats.org/drawingml/2006/picture">
+                  <pic:nvPicPr>
+                    <pic:cNvPr id="1375610421" name=""/>
+                    <pic:cNvPicPr/>
+                  </pic:nvPicPr>
+                  <pic:blipFill>
+                    <a:blip r:embed="rId69"/>
+                    <a:stretch>
+                      <a:fillRect/>
+                    </a:stretch>
+                  </pic:blipFill>
+                  <pic:spPr>
+                    <a:xfrm>
+                      <a:off x="0" y="0"/>
+                      <a:ext cx="4320000" cy="2128615"/>
+                    </a:xfrm>
+                    <a:prstGeom prst="rect">
+                      <a:avLst/>
+                    </a:prstGeom>
+                  </pic:spPr>
+                </pic:pic>
+              </a:graphicData>
+            </a:graphic>
+          </wp:inline>
+        </w:drawing>
+      </w:r>
+    </w:p>
+    <w:p>
+      <w:r>
+        <w:drawing>
+          <wp:inline distT="0" distB="0" distL="0" distR="0" wp14:anchorId="679C518D" wp14:editId="415BCF0B">
+            <wp:extent cx="4320000" cy="1910769"/>
+            <wp:effectExtent l="0" t="0" r="4445" b="0"/>
+            <wp:docPr id="692132833" name="Picture 1"/>
+            <wp:cNvGraphicFramePr>
+              <a:graphicFrameLocks xmlns:a="http://schemas.openxmlformats.org/drawingml/2006/main" noChangeAspect="1"/>
+            </wp:cNvGraphicFramePr>
+            <a:graphic xmlns:a="http://schemas.openxmlformats.org/drawingml/2006/main">
+              <a:graphicData uri="http://schemas.openxmlformats.org/drawingml/2006/picture">
+                <pic:pic xmlns:pic="http://schemas.openxmlformats.org/drawingml/2006/picture">
+                  <pic:nvPicPr>
+                    <pic:cNvPr id="692132833" name=""/>
+                    <pic:cNvPicPr/>
+                  </pic:nvPicPr>
+                  <pic:blipFill>
+                    <a:blip r:embed="rId70"/>
+                    <a:stretch>
+                      <a:fillRect/>
+                    </a:stretch>
+                  </pic:blipFill>
+                  <pic:spPr>
+                    <a:xfrm>
+                      <a:off x="0" y="0"/>
+                      <a:ext cx="4320000" cy="1910769"/>
+                    </a:xfrm>
+                    <a:prstGeom prst="rect">
+                      <a:avLst/>
+                    </a:prstGeom>
+                  </pic:spPr>
+                </pic:pic>
+              </a:graphicData>
+            </a:graphic>
+          </wp:inline>
+        </w:drawing>
+      </w:r>
+    </w:p>
+    <w:p>
+      <w:r>
+        <w:rPr>
+          <w:rFonts w:hint="eastAsia"/>
+        </w:rPr>
+        <w:t>Output</w:t>
+      </w:r>
+    </w:p>
+    <w:p>
+      <w:pPr>
+        <w:rPr>
+          <w:rFonts w:hint="eastAsia"/>
+        </w:rPr>
+      </w:pPr>
+      <w:r>
+        <w:lastRenderedPageBreak/>
+        <w:drawing>
+          <wp:inline distT="0" distB="0" distL="0" distR="0" wp14:anchorId="411D3366" wp14:editId="4AA9E209">
+            <wp:extent cx="4320000" cy="2772462"/>
+            <wp:effectExtent l="0" t="0" r="4445" b="8890"/>
+            <wp:docPr id="2011388653" name="Picture 1"/>
+            <wp:cNvGraphicFramePr>
+              <a:graphicFrameLocks xmlns:a="http://schemas.openxmlformats.org/drawingml/2006/main" noChangeAspect="1"/>
+            </wp:cNvGraphicFramePr>
+            <a:graphic xmlns:a="http://schemas.openxmlformats.org/drawingml/2006/main">
+              <a:graphicData uri="http://schemas.openxmlformats.org/drawingml/2006/picture">
+                <pic:pic xmlns:pic="http://schemas.openxmlformats.org/drawingml/2006/picture">
+                  <pic:nvPicPr>
+                    <pic:cNvPr id="2011388653" name=""/>
+                    <pic:cNvPicPr/>
+                  </pic:nvPicPr>
+                  <pic:blipFill>
+                    <a:blip r:embed="rId71"/>
+                    <a:stretch>
+                      <a:fillRect/>
+                    </a:stretch>
+                  </pic:blipFill>
+                  <pic:spPr>
+                    <a:xfrm>
+                      <a:off x="0" y="0"/>
+                      <a:ext cx="4320000" cy="2772462"/>
+                    </a:xfrm>
+                    <a:prstGeom prst="rect">
+                      <a:avLst/>
+                    </a:prstGeom>
+                  </pic:spPr>
+                </pic:pic>
+              </a:graphicData>
+            </a:graphic>
+          </wp:inline>
+        </w:drawing>
+      </w:r>
+    </w:p>
+    <w:p>
+      <w:proofErr w:type="spellStart"/>
+      <w:r>
+        <w:t>Tugas</w:t>
+      </w:r>
+      <w:proofErr w:type="spellEnd"/>
+      <w:r>
+        <w:t xml:space="preserve"> 2</w:t>
+      </w:r>
+    </w:p>
+    <w:p>
+      <w:r>
+        <w:t xml:space="preserve">• Refactor </w:t>
+      </w:r>
+      <w:proofErr w:type="spellStart"/>
+      <w:r>
+        <w:t>halaman</w:t>
+      </w:r>
+      <w:proofErr w:type="spellEnd"/>
+      <w:r>
+        <w:t xml:space="preserve"> </w:t>
+      </w:r>
+      <w:proofErr w:type="spellStart"/>
+      <w:r>
+        <w:t>Produk</w:t>
+      </w:r>
+      <w:proofErr w:type="spellEnd"/>
+      <w:r>
+        <w:t xml:space="preserve"> </w:t>
+      </w:r>
+      <w:proofErr w:type="spellStart"/>
+      <w:r>
+        <w:t>ke</w:t>
+      </w:r>
+      <w:proofErr w:type="spellEnd"/>
+      <w:r>
+        <w:t xml:space="preserve"> folder views</w:t>
+      </w:r>
+    </w:p>
+    <w:p>
+      <w:r>
+        <w:t xml:space="preserve">• </w:t>
+      </w:r>
+      <w:proofErr w:type="spellStart"/>
+      <w:r>
+        <w:t>Pisahkan</w:t>
+      </w:r>
+      <w:proofErr w:type="spellEnd"/>
+      <w:r>
+        <w:t xml:space="preserve"> Hero Section dan Main Section</w:t>
+      </w:r>
+    </w:p>
+    <w:p>
+      <w:r>
+        <w:drawing>
+          <wp:inline distT="0" distB="0" distL="0" distR="0" wp14:anchorId="1A328B3C" wp14:editId="1BE1F205">
+            <wp:extent cx="1440000" cy="2035307"/>
+            <wp:effectExtent l="0" t="0" r="8255" b="3175"/>
+            <wp:docPr id="1149336147" name="Picture 1"/>
+            <wp:cNvGraphicFramePr>
+              <a:graphicFrameLocks xmlns:a="http://schemas.openxmlformats.org/drawingml/2006/main" noChangeAspect="1"/>
+            </wp:cNvGraphicFramePr>
+            <a:graphic xmlns:a="http://schemas.openxmlformats.org/drawingml/2006/main">
+              <a:graphicData uri="http://schemas.openxmlformats.org/drawingml/2006/picture">
+                <pic:pic xmlns:pic="http://schemas.openxmlformats.org/drawingml/2006/picture">
+                  <pic:nvPicPr>
+                    <pic:cNvPr id="1149336147" name=""/>
+                    <pic:cNvPicPr/>
+                  </pic:nvPicPr>
+                  <pic:blipFill>
+                    <a:blip r:embed="rId72"/>
+                    <a:stretch>
+                      <a:fillRect/>
+                    </a:stretch>
+                  </pic:blipFill>
+                  <pic:spPr>
+                    <a:xfrm>
+                      <a:off x="0" y="0"/>
+                      <a:ext cx="1440000" cy="2035307"/>
+                    </a:xfrm>
+                    <a:prstGeom prst="rect">
+                      <a:avLst/>
+                    </a:prstGeom>
+                  </pic:spPr>
+                </pic:pic>
+              </a:graphicData>
+            </a:graphic>
+          </wp:inline>
+        </w:drawing>
+      </w:r>
+    </w:p>
+    <w:p>
+      <w:r>
+        <w:rPr>
+          <w:rFonts w:hint="eastAsia"/>
+        </w:rPr>
+        <w:t>/pages/</w:t>
+      </w:r>
+      <w:proofErr w:type="spellStart"/>
+      <w:r>
+        <w:rPr>
+          <w:rFonts w:hint="eastAsia"/>
+        </w:rPr>
+        <w:t>produk</w:t>
+      </w:r>
+      <w:proofErr w:type="spellEnd"/>
+    </w:p>
+    <w:p>
+      <w:r>
+        <w:lastRenderedPageBreak/>
+        <w:drawing>
+          <wp:inline distT="0" distB="0" distL="0" distR="0" wp14:anchorId="006D10A3" wp14:editId="242BE91F">
+            <wp:extent cx="4320000" cy="3142615"/>
+            <wp:effectExtent l="0" t="0" r="4445" b="635"/>
+            <wp:docPr id="1863091082" name="Picture 1"/>
+            <wp:cNvGraphicFramePr>
+              <a:graphicFrameLocks xmlns:a="http://schemas.openxmlformats.org/drawingml/2006/main" noChangeAspect="1"/>
+            </wp:cNvGraphicFramePr>
+            <a:graphic xmlns:a="http://schemas.openxmlformats.org/drawingml/2006/main">
+              <a:graphicData uri="http://schemas.openxmlformats.org/drawingml/2006/picture">
+                <pic:pic xmlns:pic="http://schemas.openxmlformats.org/drawingml/2006/picture">
+                  <pic:nvPicPr>
+                    <pic:cNvPr id="1863091082" name=""/>
+                    <pic:cNvPicPr/>
+                  </pic:nvPicPr>
+                  <pic:blipFill>
+                    <a:blip r:embed="rId73"/>
+                    <a:stretch>
+                      <a:fillRect/>
+                    </a:stretch>
+                  </pic:blipFill>
+                  <pic:spPr>
+                    <a:xfrm>
+                      <a:off x="0" y="0"/>
+                      <a:ext cx="4320000" cy="3142615"/>
+                    </a:xfrm>
+                    <a:prstGeom prst="rect">
+                      <a:avLst/>
+                    </a:prstGeom>
+                  </pic:spPr>
+                </pic:pic>
+              </a:graphicData>
+            </a:graphic>
+          </wp:inline>
+        </w:drawing>
+      </w:r>
+    </w:p>
+    <w:p>
+      <w:r>
+        <w:drawing>
+          <wp:inline distT="0" distB="0" distL="0" distR="0" wp14:anchorId="6E167A43" wp14:editId="0716FCDB">
+            <wp:extent cx="4320000" cy="2238923"/>
+            <wp:effectExtent l="0" t="0" r="4445" b="9525"/>
+            <wp:docPr id="1768525856" name="Picture 1"/>
+            <wp:cNvGraphicFramePr>
+              <a:graphicFrameLocks xmlns:a="http://schemas.openxmlformats.org/drawingml/2006/main" noChangeAspect="1"/>
+            </wp:cNvGraphicFramePr>
+            <a:graphic xmlns:a="http://schemas.openxmlformats.org/drawingml/2006/main">
+              <a:graphicData uri="http://schemas.openxmlformats.org/drawingml/2006/picture">
+                <pic:pic xmlns:pic="http://schemas.openxmlformats.org/drawingml/2006/picture">
+                  <pic:nvPicPr>
+                    <pic:cNvPr id="1768525856" name=""/>
+                    <pic:cNvPicPr/>
+                  </pic:nvPicPr>
+                  <pic:blipFill>
+                    <a:blip r:embed="rId74"/>
+                    <a:stretch>
+                      <a:fillRect/>
+                    </a:stretch>
+                  </pic:blipFill>
+                  <pic:spPr>
+                    <a:xfrm>
+                      <a:off x="0" y="0"/>
+                      <a:ext cx="4320000" cy="2238923"/>
+                    </a:xfrm>
+                    <a:prstGeom prst="rect">
+                      <a:avLst/>
+                    </a:prstGeom>
+                  </pic:spPr>
+                </pic:pic>
+              </a:graphicData>
+            </a:graphic>
+          </wp:inline>
+        </w:drawing>
+      </w:r>
+    </w:p>
+    <w:p>
+      <w:r>
+        <w:rPr>
+          <w:rFonts w:hint="eastAsia"/>
+        </w:rPr>
+        <w:t>/views/</w:t>
+      </w:r>
+      <w:proofErr w:type="spellStart"/>
+      <w:r>
+        <w:rPr>
+          <w:rFonts w:hint="eastAsia"/>
+        </w:rPr>
+        <w:t>produk</w:t>
+      </w:r>
+      <w:proofErr w:type="spellEnd"/>
+    </w:p>
+    <w:p>
+      <w:r>
+        <w:lastRenderedPageBreak/>
+        <w:drawing>
+          <wp:inline distT="0" distB="0" distL="0" distR="0" wp14:anchorId="6C7480A8" wp14:editId="6A5E0F31">
+            <wp:extent cx="4320000" cy="3033692"/>
+            <wp:effectExtent l="0" t="0" r="4445" b="0"/>
+            <wp:docPr id="1879249252" name="Picture 1"/>
+            <wp:cNvGraphicFramePr>
+              <a:graphicFrameLocks xmlns:a="http://schemas.openxmlformats.org/drawingml/2006/main" noChangeAspect="1"/>
+            </wp:cNvGraphicFramePr>
+            <a:graphic xmlns:a="http://schemas.openxmlformats.org/drawingml/2006/main">
+              <a:graphicData uri="http://schemas.openxmlformats.org/drawingml/2006/picture">
+                <pic:pic xmlns:pic="http://schemas.openxmlformats.org/drawingml/2006/picture">
+                  <pic:nvPicPr>
+                    <pic:cNvPr id="1879249252" name=""/>
+                    <pic:cNvPicPr/>
+                  </pic:nvPicPr>
+                  <pic:blipFill>
+                    <a:blip r:embed="rId75"/>
+                    <a:stretch>
+                      <a:fillRect/>
+                    </a:stretch>
+                  </pic:blipFill>
+                  <pic:spPr>
+                    <a:xfrm>
+                      <a:off x="0" y="0"/>
+                      <a:ext cx="4320000" cy="3033692"/>
+                    </a:xfrm>
+                    <a:prstGeom prst="rect">
+                      <a:avLst/>
+                    </a:prstGeom>
+                  </pic:spPr>
+                </pic:pic>
+              </a:graphicData>
+            </a:graphic>
+          </wp:inline>
+        </w:drawing>
+      </w:r>
+    </w:p>
+    <w:p>
+      <w:r>
+        <w:drawing>
+          <wp:inline distT="0" distB="0" distL="0" distR="0" wp14:anchorId="2BB64FF6" wp14:editId="5306827C">
+            <wp:extent cx="4320000" cy="1942154"/>
+            <wp:effectExtent l="0" t="0" r="4445" b="1270"/>
+            <wp:docPr id="1583991932" name="Picture 1"/>
+            <wp:cNvGraphicFramePr>
+              <a:graphicFrameLocks xmlns:a="http://schemas.openxmlformats.org/drawingml/2006/main" noChangeAspect="1"/>
+            </wp:cNvGraphicFramePr>
+            <a:graphic xmlns:a="http://schemas.openxmlformats.org/drawingml/2006/main">
+              <a:graphicData uri="http://schemas.openxmlformats.org/drawingml/2006/picture">
+                <pic:pic xmlns:pic="http://schemas.openxmlformats.org/drawingml/2006/picture">
+                  <pic:nvPicPr>
+                    <pic:cNvPr id="1583991932" name=""/>
+                    <pic:cNvPicPr/>
+                  </pic:nvPicPr>
+                  <pic:blipFill>
+                    <a:blip r:embed="rId76"/>
+                    <a:stretch>
+                      <a:fillRect/>
+                    </a:stretch>
+                  </pic:blipFill>
+                  <pic:spPr>
+                    <a:xfrm>
+                      <a:off x="0" y="0"/>
+                      <a:ext cx="4320000" cy="1942154"/>
+                    </a:xfrm>
+                    <a:prstGeom prst="rect">
+                      <a:avLst/>
+                    </a:prstGeom>
+                  </pic:spPr>
+                </pic:pic>
+              </a:graphicData>
+            </a:graphic>
+          </wp:inline>
+        </w:drawing>
+      </w:r>
+    </w:p>
+    <w:p>
+      <w:r>
+        <w:drawing>
+          <wp:inline distT="0" distB="0" distL="0" distR="0" wp14:anchorId="4A13EB2E" wp14:editId="2B5D47C8">
+            <wp:extent cx="4320000" cy="2270769"/>
+            <wp:effectExtent l="0" t="0" r="4445" b="0"/>
+            <wp:docPr id="1788702789" name="Picture 1"/>
+            <wp:cNvGraphicFramePr>
+              <a:graphicFrameLocks xmlns:a="http://schemas.openxmlformats.org/drawingml/2006/main" noChangeAspect="1"/>
+            </wp:cNvGraphicFramePr>
+            <a:graphic xmlns:a="http://schemas.openxmlformats.org/drawingml/2006/main">
+              <a:graphicData uri="http://schemas.openxmlformats.org/drawingml/2006/picture">
+                <pic:pic xmlns:pic="http://schemas.openxmlformats.org/drawingml/2006/picture">
+                  <pic:nvPicPr>
+                    <pic:cNvPr id="1788702789" name=""/>
+                    <pic:cNvPicPr/>
+                  </pic:nvPicPr>
+                  <pic:blipFill>
+                    <a:blip r:embed="rId77"/>
+                    <a:stretch>
+                      <a:fillRect/>
+                    </a:stretch>
+                  </pic:blipFill>
+                  <pic:spPr>
+                    <a:xfrm>
+                      <a:off x="0" y="0"/>
+                      <a:ext cx="4320000" cy="2270769"/>
+                    </a:xfrm>
+                    <a:prstGeom prst="rect">
+                      <a:avLst/>
+                    </a:prstGeom>
+                  </pic:spPr>
+                </pic:pic>
+              </a:graphicData>
+            </a:graphic>
+          </wp:inline>
+        </w:drawing>
+      </w:r>
+    </w:p>
+    <w:p>
+      <w:r>
+        <w:lastRenderedPageBreak/>
+        <w:drawing>
+          <wp:inline distT="0" distB="0" distL="0" distR="0" wp14:anchorId="16519B1F" wp14:editId="3AC494B9">
+            <wp:extent cx="4320000" cy="3328154"/>
+            <wp:effectExtent l="0" t="0" r="4445" b="5715"/>
+            <wp:docPr id="168763915" name="Picture 1"/>
+            <wp:cNvGraphicFramePr>
+              <a:graphicFrameLocks xmlns:a="http://schemas.openxmlformats.org/drawingml/2006/main" noChangeAspect="1"/>
+            </wp:cNvGraphicFramePr>
+            <a:graphic xmlns:a="http://schemas.openxmlformats.org/drawingml/2006/main">
+              <a:graphicData uri="http://schemas.openxmlformats.org/drawingml/2006/picture">
+                <pic:pic xmlns:pic="http://schemas.openxmlformats.org/drawingml/2006/picture">
+                  <pic:nvPicPr>
+                    <pic:cNvPr id="168763915" name=""/>
+                    <pic:cNvPicPr/>
+                  </pic:nvPicPr>
+                  <pic:blipFill>
+                    <a:blip r:embed="rId78"/>
+                    <a:stretch>
+                      <a:fillRect/>
+                    </a:stretch>
+                  </pic:blipFill>
+                  <pic:spPr>
+                    <a:xfrm>
+                      <a:off x="0" y="0"/>
+                      <a:ext cx="4320000" cy="3328154"/>
+                    </a:xfrm>
+                    <a:prstGeom prst="rect">
+                      <a:avLst/>
+                    </a:prstGeom>
+                  </pic:spPr>
+                </pic:pic>
+              </a:graphicData>
+            </a:graphic>
+          </wp:inline>
+        </w:drawing>
+      </w:r>
+    </w:p>
+    <w:p>
+      <w:r>
+        <w:rPr>
+          <w:rFonts w:hint="eastAsia"/>
+        </w:rPr>
+        <w:t>Output</w:t>
+      </w:r>
+    </w:p>
+    <w:p>
+      <w:r>
+        <w:drawing>
+          <wp:inline distT="0" distB="0" distL="0" distR="0" wp14:anchorId="77F7692E" wp14:editId="6C51A00E">
+            <wp:extent cx="4320000" cy="2752154"/>
+            <wp:effectExtent l="0" t="0" r="4445" b="0"/>
+            <wp:docPr id="2099778465" name="Picture 1"/>
+            <wp:cNvGraphicFramePr>
+              <a:graphicFrameLocks xmlns:a="http://schemas.openxmlformats.org/drawingml/2006/main" noChangeAspect="1"/>
+            </wp:cNvGraphicFramePr>
+            <a:graphic xmlns:a="http://schemas.openxmlformats.org/drawingml/2006/main">
+              <a:graphicData uri="http://schemas.openxmlformats.org/drawingml/2006/picture">
+                <pic:pic xmlns:pic="http://schemas.openxmlformats.org/drawingml/2006/picture">
+                  <pic:nvPicPr>
+                    <pic:cNvPr id="2099778465" name=""/>
+                    <pic:cNvPicPr/>
+                  </pic:nvPicPr>
+                  <pic:blipFill>
+                    <a:blip r:embed="rId79"/>
+                    <a:stretch>
+                      <a:fillRect/>
+                    </a:stretch>
+                  </pic:blipFill>
+                  <pic:spPr>
+                    <a:xfrm>
+                      <a:off x="0" y="0"/>
+                      <a:ext cx="4320000" cy="2752154"/>
+                    </a:xfrm>
+                    <a:prstGeom prst="rect">
+                      <a:avLst/>
+                    </a:prstGeom>
+                  </pic:spPr>
+                </pic:pic>
+              </a:graphicData>
+            </a:graphic>
+          </wp:inline>
+        </w:drawing>
+      </w:r>
+    </w:p>
+    <w:p>
+      <w:pPr>
+        <w:rPr>
+          <w:rFonts w:hint="eastAsia"/>
+        </w:rPr>
+      </w:pPr>
+      <w:r>
+        <w:lastRenderedPageBreak/>
+        <w:drawing>
+          <wp:inline distT="0" distB="0" distL="0" distR="0" wp14:anchorId="24367407" wp14:editId="59DA1602">
+            <wp:extent cx="4320000" cy="2759077"/>
+            <wp:effectExtent l="0" t="0" r="4445" b="3175"/>
+            <wp:docPr id="852827318" name="Picture 1"/>
+            <wp:cNvGraphicFramePr>
+              <a:graphicFrameLocks xmlns:a="http://schemas.openxmlformats.org/drawingml/2006/main" noChangeAspect="1"/>
+            </wp:cNvGraphicFramePr>
+            <a:graphic xmlns:a="http://schemas.openxmlformats.org/drawingml/2006/main">
+              <a:graphicData uri="http://schemas.openxmlformats.org/drawingml/2006/picture">
+                <pic:pic xmlns:pic="http://schemas.openxmlformats.org/drawingml/2006/picture">
+                  <pic:nvPicPr>
+                    <pic:cNvPr id="852827318" name=""/>
+                    <pic:cNvPicPr/>
+                  </pic:nvPicPr>
+                  <pic:blipFill>
+                    <a:blip r:embed="rId80"/>
+                    <a:stretch>
+                      <a:fillRect/>
+                    </a:stretch>
+                  </pic:blipFill>
+                  <pic:spPr>
+                    <a:xfrm>
+                      <a:off x="0" y="0"/>
+                      <a:ext cx="4320000" cy="2759077"/>
+                    </a:xfrm>
+                    <a:prstGeom prst="rect">
+                      <a:avLst/>
+                    </a:prstGeom>
+                  </pic:spPr>
+                </pic:pic>
+              </a:graphicData>
+            </a:graphic>
+          </wp:inline>
+        </w:drawing>
+      </w:r>
+    </w:p>
+    <w:p>
+      <w:proofErr w:type="spellStart"/>
+      <w:r>
+        <w:t>Tugas</w:t>
+      </w:r>
+      <w:proofErr w:type="spellEnd"/>
+      <w:r>
+        <w:t xml:space="preserve"> 3</w:t>
+      </w:r>
+    </w:p>
+    <w:p>
+      <w:r>
+        <w:t xml:space="preserve">• </w:t>
+      </w:r>
+      <w:proofErr w:type="spellStart"/>
+      <w:r>
+        <w:t>Terapkan</w:t>
+      </w:r>
+      <w:proofErr w:type="spellEnd"/>
+      <w:r>
+        <w:t xml:space="preserve"> Tailwind CSS</w:t>
+      </w:r>
+    </w:p>
+    <w:p>
+      <w:r>
+        <w:t xml:space="preserve">• </w:t>
+      </w:r>
+      <w:proofErr w:type="spellStart"/>
+      <w:r>
+        <w:t>Gunakan</w:t>
+      </w:r>
+      <w:proofErr w:type="spellEnd"/>
+      <w:r>
+        <w:t xml:space="preserve"> minimal 5 utility class</w:t>
+      </w:r>
+    </w:p>
+    <w:p>
+      <w:r>
+        <w:drawing>
+          <wp:inline distT="0" distB="0" distL="0" distR="0" wp14:anchorId="630136CF" wp14:editId="57E452C2">
+            <wp:extent cx="4320000" cy="996462"/>
+            <wp:effectExtent l="0" t="0" r="4445" b="0"/>
+            <wp:docPr id="642439228" name="Picture 1"/>
+            <wp:cNvGraphicFramePr>
+              <a:graphicFrameLocks xmlns:a="http://schemas.openxmlformats.org/drawingml/2006/main" noChangeAspect="1"/>
+            </wp:cNvGraphicFramePr>
+            <a:graphic xmlns:a="http://schemas.openxmlformats.org/drawingml/2006/main">
+              <a:graphicData uri="http://schemas.openxmlformats.org/drawingml/2006/picture">
+                <pic:pic xmlns:pic="http://schemas.openxmlformats.org/drawingml/2006/picture">
+                  <pic:nvPicPr>
+                    <pic:cNvPr id="642439228" name=""/>
+                    <pic:cNvPicPr/>
+                  </pic:nvPicPr>
+                  <pic:blipFill>
+                    <a:blip r:embed="rId81"/>
+                    <a:stretch>
+                      <a:fillRect/>
+                    </a:stretch>
+                  </pic:blipFill>
+                  <pic:spPr>
+                    <a:xfrm>
+                      <a:off x="0" y="0"/>
+                      <a:ext cx="4320000" cy="996462"/>
+                    </a:xfrm>
+                    <a:prstGeom prst="rect">
+                      <a:avLst/>
+                    </a:prstGeom>
+                  </pic:spPr>
+                </pic:pic>
+              </a:graphicData>
+            </a:graphic>
+          </wp:inline>
+        </w:drawing>
+      </w:r>
+    </w:p>
+    <w:p>
+      <w:r>
+        <w:drawing>
+          <wp:inline distT="0" distB="0" distL="0" distR="0" wp14:anchorId="0FA144D0" wp14:editId="65105083">
+            <wp:extent cx="4320000" cy="1749231"/>
+            <wp:effectExtent l="0" t="0" r="4445" b="3810"/>
+            <wp:docPr id="455025550" name="Picture 1"/>
+            <wp:cNvGraphicFramePr>
+              <a:graphicFrameLocks xmlns:a="http://schemas.openxmlformats.org/drawingml/2006/main" noChangeAspect="1"/>
+            </wp:cNvGraphicFramePr>
+            <a:graphic xmlns:a="http://schemas.openxmlformats.org/drawingml/2006/main">
+              <a:graphicData uri="http://schemas.openxmlformats.org/drawingml/2006/picture">
+                <pic:pic xmlns:pic="http://schemas.openxmlformats.org/drawingml/2006/picture">
+                  <pic:nvPicPr>
+                    <pic:cNvPr id="455025550" name=""/>
+                    <pic:cNvPicPr/>
+                  </pic:nvPicPr>
+                  <pic:blipFill>
+                    <a:blip r:embed="rId82"/>
+                    <a:stretch>
+                      <a:fillRect/>
+                    </a:stretch>
+                  </pic:blipFill>
+                  <pic:spPr>
+                    <a:xfrm>
+                      <a:off x="0" y="0"/>
+                      <a:ext cx="4320000" cy="1749231"/>
+                    </a:xfrm>
+                    <a:prstGeom prst="rect">
+                      <a:avLst/>
+                    </a:prstGeom>
+                  </pic:spPr>
+                </pic:pic>
+              </a:graphicData>
+            </a:graphic>
+          </wp:inline>
+        </w:drawing>
+      </w:r>
+    </w:p>
+    <w:p>
+      <w:pPr>
+        <w:rPr>
+          <w:rFonts w:hint="eastAsia"/>
+        </w:rPr>
+      </w:pPr>
+    </w:p>
+    <w:p>
+      <w:pPr>
+        <w:rPr>
+          <w:rFonts w:hint="eastAsia"/>
+        </w:rPr>
+      </w:pPr>
     </w:p>
     <w:sectPr>
       <w:pgSz w:w="12240" w:h="15840"/>

</xml_diff>